<commit_message>
feat: thuyet minh - viet day du cong thuc kiem tra kem so thay vao (ca hai ho)
- Luc mot day T = EA/L0 x (d - L0), C8 (ca o MNC), C9, Broms p = 9 cu D va phuong trinh H_u,
  M_max, M_rd vong thep, tach T_h/T_v, SV-2..SV-6 day du
- Test: phuong trinh Broms va M_max trong thuyet minh cho dung ket qua engine
- Do nhay Huoi Vanh theo luc day can bang (CLAUDE.md); catalogue co them --ea=<k>

Co-Authored-By: Claude Opus 5.5 (1M context) <noreply@anthropic.com>
</commit_message>
<xml_diff>
--- a/docs/mat-bang-neo-9-be/THUYET_MINH_TINH_TOAN.docx
+++ b/docs/mat-bang-neo-9-be/THUYET_MINH_TINH_TOAN.docx
@@ -588,7 +588,133 @@
           <w:szCs w:val="24"/>
           <w:lang w:val="vi-VN"/>
         </w:rPr>
-        <w:t xml:space="preserve">BÈ 3A (bè có lực dây lớn nhất): F = 356,8 kN; chi phối ở mực nước 385,00 m, tải đẩy về hướng 180°, dây B3A-D01 chịu 145,3 kN, 14 dây cùng căng; bè trôi 0,54 m. Mất dây B3A-D01: dây lớn nhất còn lại 147,3 kN.</w:t>
+        <w:t xml:space="preserve">Lực một dây: T = (EA / L</w:t>
+      </w:r>
+      <w:r>
+        <w:rPr>
+          <w:rFonts w:ascii="Times New Roman" w:cs="Times New Roman" w:eastAsia="Times New Roman" w:hAnsi="Times New Roman"/>
+          <w:noProof/>
+          <w:sz w:val="24"/>
+          <w:szCs w:val="24"/>
+          <w:vertAlign w:val="subscript"/>
+          <w:lang w:val="vi-VN"/>
+        </w:rPr>
+        <w:t xml:space="preserve">0</w:t>
+      </w:r>
+      <w:r>
+        <w:rPr>
+          <w:rFonts w:ascii="Times New Roman" w:cs="Times New Roman" w:eastAsia="Times New Roman" w:hAnsi="Times New Roman"/>
+          <w:noProof/>
+          <w:sz w:val="24"/>
+          <w:szCs w:val="24"/>
+          <w:lang w:val="vi-VN"/>
+        </w:rPr>
+        <w:t xml:space="preserve">) × (d − L</w:t>
+      </w:r>
+      <w:r>
+        <w:rPr>
+          <w:rFonts w:ascii="Times New Roman" w:cs="Times New Roman" w:eastAsia="Times New Roman" w:hAnsi="Times New Roman"/>
+          <w:noProof/>
+          <w:sz w:val="24"/>
+          <w:szCs w:val="24"/>
+          <w:vertAlign w:val="subscript"/>
+          <w:lang w:val="vi-VN"/>
+        </w:rPr>
+        <w:t xml:space="preserve">0</w:t>
+      </w:r>
+      <w:r>
+        <w:rPr>
+          <w:rFonts w:ascii="Times New Roman" w:cs="Times New Roman" w:eastAsia="Times New Roman" w:hAnsi="Times New Roman"/>
+          <w:noProof/>
+          <w:sz w:val="24"/>
+          <w:szCs w:val="24"/>
+          <w:lang w:val="vi-VN"/>
+        </w:rPr>
+        <w:t xml:space="preserve">) khi d &gt; L</w:t>
+      </w:r>
+      <w:r>
+        <w:rPr>
+          <w:rFonts w:ascii="Times New Roman" w:cs="Times New Roman" w:eastAsia="Times New Roman" w:hAnsi="Times New Roman"/>
+          <w:noProof/>
+          <w:sz w:val="24"/>
+          <w:szCs w:val="24"/>
+          <w:vertAlign w:val="subscript"/>
+          <w:lang w:val="vi-VN"/>
+        </w:rPr>
+        <w:t xml:space="preserve">0</w:t>
+      </w:r>
+      <w:r>
+        <w:rPr>
+          <w:rFonts w:ascii="Times New Roman" w:cs="Times New Roman" w:eastAsia="Times New Roman" w:hAnsi="Times New Roman"/>
+          <w:noProof/>
+          <w:sz w:val="24"/>
+          <w:szCs w:val="24"/>
+          <w:lang w:val="vi-VN"/>
+        </w:rPr>
+        <w:t xml:space="preserve">, T = 0 khi d ≤ L</w:t>
+      </w:r>
+      <w:r>
+        <w:rPr>
+          <w:rFonts w:ascii="Times New Roman" w:cs="Times New Roman" w:eastAsia="Times New Roman" w:hAnsi="Times New Roman"/>
+          <w:noProof/>
+          <w:sz w:val="24"/>
+          <w:szCs w:val="24"/>
+          <w:vertAlign w:val="subscript"/>
+          <w:lang w:val="vi-VN"/>
+        </w:rPr>
+        <w:t xml:space="preserve">0</w:t>
+      </w:r>
+      <w:r>
+        <w:rPr>
+          <w:rFonts w:ascii="Times New Roman" w:cs="Times New Roman" w:eastAsia="Times New Roman" w:hAnsi="Times New Roman"/>
+          <w:noProof/>
+          <w:sz w:val="24"/>
+          <w:szCs w:val="24"/>
+          <w:lang w:val="vi-VN"/>
+        </w:rPr>
+        <w:t xml:space="preserve"> (dây chùng). d là khoảng cách thẳng bích bè – chốt neo khi bè đã dịch đi, L</w:t>
+      </w:r>
+      <w:r>
+        <w:rPr>
+          <w:rFonts w:ascii="Times New Roman" w:cs="Times New Roman" w:eastAsia="Times New Roman" w:hAnsi="Times New Roman"/>
+          <w:noProof/>
+          <w:sz w:val="24"/>
+          <w:szCs w:val="24"/>
+          <w:vertAlign w:val="subscript"/>
+          <w:lang w:val="vi-VN"/>
+        </w:rPr>
+        <w:t xml:space="preserve">0</w:t>
+      </w:r>
+      <w:r>
+        <w:rPr>
+          <w:rFonts w:ascii="Times New Roman" w:cs="Times New Roman" w:eastAsia="Times New Roman" w:hAnsi="Times New Roman"/>
+          <w:noProof/>
+          <w:sz w:val="24"/>
+          <w:szCs w:val="24"/>
+          <w:lang w:val="vi-VN"/>
+        </w:rPr>
+        <w:t xml:space="preserve"> là chiều dài dây lúc vừa căng. Cáp PES-40: EA = 15 × 475 = 7.125 kN. Dây càng ngắn (L</w:t>
+      </w:r>
+      <w:r>
+        <w:rPr>
+          <w:rFonts w:ascii="Times New Roman" w:cs="Times New Roman" w:eastAsia="Times New Roman" w:hAnsi="Times New Roman"/>
+          <w:noProof/>
+          <w:sz w:val="24"/>
+          <w:szCs w:val="24"/>
+          <w:vertAlign w:val="subscript"/>
+          <w:lang w:val="vi-VN"/>
+        </w:rPr>
+        <w:t xml:space="preserve">0</w:t>
+      </w:r>
+      <w:r>
+        <w:rPr>
+          <w:rFonts w:ascii="Times New Roman" w:cs="Times New Roman" w:eastAsia="Times New Roman" w:hAnsi="Times New Roman"/>
+          <w:noProof/>
+          <w:sz w:val="24"/>
+          <w:szCs w:val="24"/>
+          <w:lang w:val="vi-VN"/>
+        </w:rPr>
+        <w:t xml:space="preserve"> nhỏ) càng cứng nên nhận càng nhiều lực.</w:t>
       </w:r>
     </w:p>
     <w:p>
@@ -608,7 +734,28 @@
           <w:szCs w:val="24"/>
           <w:lang w:val="vi-VN"/>
         </w:rPr>
-        <w:t xml:space="preserve">Lực dây thiết kế của BÈ 3A: T = 150,3 kN (đã cộng lực căng trước 5 kN; không nhỏ hơn F / (n × cos α) = 73,7 kN); khi đứt một dây: 152,3 kN. Cáp và cọc bờ của bè kiểm tra với lực này; mỗi đế vít xoắn kiểm tra với lực lớn nhất của chính (các) dây nối vào nó (bao mọi hướng, mọi mực nước).</w:t>
+        <w:t xml:space="preserve">Vị trí cân bằng: độ dịch u của bè sao cho tổng thành phần ngang của lực các dây đang căng bằng F theo hướng tải; T thiết kế = T lớn nhất trên mọi hướng, mọi mực nước + lực căng trước T</w:t>
+      </w:r>
+      <w:r>
+        <w:rPr>
+          <w:rFonts w:ascii="Times New Roman" w:cs="Times New Roman" w:eastAsia="Times New Roman" w:hAnsi="Times New Roman"/>
+          <w:noProof/>
+          <w:sz w:val="24"/>
+          <w:szCs w:val="24"/>
+          <w:vertAlign w:val="subscript"/>
+          <w:lang w:val="vi-VN"/>
+        </w:rPr>
+        <w:t xml:space="preserve">0</w:t>
+      </w:r>
+      <w:r>
+        <w:rPr>
+          <w:rFonts w:ascii="Times New Roman" w:cs="Times New Roman" w:eastAsia="Times New Roman" w:hAnsi="Times New Roman"/>
+          <w:noProof/>
+          <w:sz w:val="24"/>
+          <w:szCs w:val="24"/>
+          <w:lang w:val="vi-VN"/>
+        </w:rPr>
+        <w:t xml:space="preserve"> = 5 kN.</w:t>
       </w:r>
     </w:p>
     <w:p>
@@ -628,7 +775,7 @@
           <w:szCs w:val="24"/>
           <w:lang w:val="vi-VN"/>
         </w:rPr>
-        <w:t xml:space="preserve">Cáp PES-40, lực đứt 475 kN: hệ số an toàn 3,16 (yêu cầu ≥ 3,0); khi đứt một dây 3,12 (yêu cầu ≥ 2,0).</w:t>
+        <w:t xml:space="preserve">BÈ 3A (bè có lực dây lớn nhất): F = 356,8 kN; chi phối ở mực nước 385,00 m, tải đẩy về hướng 180°, dây B3A-D01 chịu 145,3 kN, 14 dây cùng căng; bè trôi 0,54 m. Mất dây B3A-D01: dây lớn nhất còn lại 147,3 kN.</w:t>
       </w:r>
     </w:p>
     <w:p>
@@ -648,7 +795,7 @@
           <w:szCs w:val="24"/>
           <w:lang w:val="vi-VN"/>
         </w:rPr>
-        <w:t xml:space="preserve">Độ trôi bè lớn nhất (mọi hướng, mọi mực nước): 0,3 – 0,9 m tùy bè (kiểm tra C12: ≤ nửa khoảng hở nhỏ nhất tới bè bên cạnh).</w:t>
+        <w:t xml:space="preserve">Lực dây thiết kế của BÈ 3A: T = 150,3 kN (đã cộng lực căng trước 5 kN; không nhỏ hơn F / (n × cos α) = 73,7 kN); khi đứt một dây: 152,3 kN. Cáp và cọc bờ của bè kiểm tra với lực này; mỗi đế vít xoắn kiểm tra với lực lớn nhất của chính (các) dây nối vào nó (bao mọi hướng, mọi mực nước).</w:t>
       </w:r>
     </w:p>
     <w:p>
@@ -668,26 +815,7 @@
           <w:szCs w:val="24"/>
           <w:lang w:val="vi-VN"/>
         </w:rPr>
-        <w:t xml:space="preserve">Dây ngắn hơn 4 m (B6-D04, B6-D29) không tính vào cân bằng: lắp làm dây dự phòng, cắt dài thêm 0,5 m — bè trôi chưa tới 0,5 m nên chúng không chịu lực.</w:t>
-      </w:r>
-    </w:p>
-    <w:p>
-      <w:pPr>
-        <w:pStyle w:val="Heading2"/>
-        <w:keepNext/>
-        <w:spacing w:after="100" w:before="240"/>
-      </w:pPr>
-      <w:r>
-        <w:rPr>
-          <w:rFonts w:ascii="Times New Roman" w:cs="Times New Roman" w:eastAsia="Times New Roman" w:hAnsi="Times New Roman"/>
-          <w:b/>
-          <w:bCs/>
-          <w:noProof/>
-          <w:sz w:val="26"/>
-          <w:szCs w:val="26"/>
-          <w:lang w:val="vi-VN"/>
-        </w:rPr>
-        <w:t xml:space="preserve">5. Cọc khoan nhồi ven bờ (ví dụ BÈ 3A)</w:t>
+        <w:t xml:space="preserve">Cáp PES-40, lực đứt 475 kN: hệ số an toàn MBL / T = 475 / 150,3 = 3,16 (yêu cầu ≥ 3,0); khi đứt một dây 475 / 152,3 = 3,12 (yêu cầu ≥ 2,0).</w:t>
       </w:r>
     </w:p>
     <w:p>
@@ -707,28 +835,7 @@
           <w:szCs w:val="24"/>
           <w:lang w:val="vi-VN"/>
         </w:rPr>
-        <w:t xml:space="preserve">Cọc tròn D350 đổ tại chỗ, ngàm L</w:t>
-      </w:r>
-      <w:r>
-        <w:rPr>
-          <w:rFonts w:ascii="Times New Roman" w:cs="Times New Roman" w:eastAsia="Times New Roman" w:hAnsi="Times New Roman"/>
-          <w:noProof/>
-          <w:sz w:val="24"/>
-          <w:szCs w:val="24"/>
-          <w:vertAlign w:val="subscript"/>
-          <w:lang w:val="vi-VN"/>
-        </w:rPr>
-        <w:t xml:space="preserve">tk</w:t>
-      </w:r>
-      <w:r>
-        <w:rPr>
-          <w:rFonts w:ascii="Times New Roman" w:cs="Times New Roman" w:eastAsia="Times New Roman" w:hAnsi="Times New Roman"/>
-          <w:noProof/>
-          <w:sz w:val="24"/>
-          <w:szCs w:val="24"/>
-          <w:lang w:val="vi-VN"/>
-        </w:rPr>
-        <w:t xml:space="preserve"> = 6,5 m, dài cả cọc 6,6 m; thép chủ 8Φ25 CB400-V, Đai xoắn Φ8 a150. Cáp móc cách mặt đất 0,1 m.</w:t>
+        <w:t xml:space="preserve">C9, khoảng cách trung bình giữa các dây: chu vi / số dây = 625,1 / 50 = 12,5 m ≤ 15 m (bắt buộc; các bè: 11,2–14,8 m).</w:t>
       </w:r>
     </w:p>
     <w:p>
@@ -748,7 +855,7 @@
           <w:szCs w:val="24"/>
           <w:lang w:val="vi-VN"/>
         </w:rPr>
-        <w:t xml:space="preserve">Điểm neo CỌC ĐÔI: 2 cọc cạnh nhau, vuông góc phương cáp, cách nhau ≥ 3D; mỗi cọc chịu P = T / (2 × 0,9) = 83,5 kN (hệ số nhóm là GIẢ ĐỊNH); đài BTCT nối hai đầu cọc: thiết kế sơ bộ ở bảng thống kê vật tư neo (twinPileCap.ts).</w:t>
+        <w:t xml:space="preserve">C8, khoảng hở đáy bè – đáy hồ = chiều sâu nước − mớn nước bè = 6,00 m ở MNDB ≥ 1,5 m; ở MNC còn 6,00 − (384,50 − 380,00) = 1,50 m (vừa đúng giới hạn).</w:t>
       </w:r>
     </w:p>
     <w:p>
@@ -768,49 +875,7 @@
           <w:szCs w:val="24"/>
           <w:lang w:val="vi-VN"/>
         </w:rPr>
-        <w:t xml:space="preserve">BP-1, sức chịu ngang theo Broms (cọc ngắn trong đất sét): H</w:t>
-      </w:r>
-      <w:r>
-        <w:rPr>
-          <w:rFonts w:ascii="Times New Roman" w:cs="Times New Roman" w:eastAsia="Times New Roman" w:hAnsi="Times New Roman"/>
-          <w:noProof/>
-          <w:sz w:val="24"/>
-          <w:szCs w:val="24"/>
-          <w:vertAlign w:val="subscript"/>
-          <w:lang w:val="vi-VN"/>
-        </w:rPr>
-        <w:t xml:space="preserve">u</w:t>
-      </w:r>
-      <w:r>
-        <w:rPr>
-          <w:rFonts w:ascii="Times New Roman" w:cs="Times New Roman" w:eastAsia="Times New Roman" w:hAnsi="Times New Roman"/>
-          <w:noProof/>
-          <w:sz w:val="24"/>
-          <w:szCs w:val="24"/>
-          <w:lang w:val="vi-VN"/>
-        </w:rPr>
-        <w:t xml:space="preserve"> = 290,2 kN; cho phép H</w:t>
-      </w:r>
-      <w:r>
-        <w:rPr>
-          <w:rFonts w:ascii="Times New Roman" w:cs="Times New Roman" w:eastAsia="Times New Roman" w:hAnsi="Times New Roman"/>
-          <w:noProof/>
-          <w:sz w:val="24"/>
-          <w:szCs w:val="24"/>
-          <w:vertAlign w:val="subscript"/>
-          <w:lang w:val="vi-VN"/>
-        </w:rPr>
-        <w:t xml:space="preserve">u</w:t>
-      </w:r>
-      <w:r>
-        <w:rPr>
-          <w:rFonts w:ascii="Times New Roman" w:cs="Times New Roman" w:eastAsia="Times New Roman" w:hAnsi="Times New Roman"/>
-          <w:noProof/>
-          <w:sz w:val="24"/>
-          <w:szCs w:val="24"/>
-          <w:lang w:val="vi-VN"/>
-        </w:rPr>
-        <w:t xml:space="preserve"> / 2,5 = 116,1 kN ≥ P = 83,5 kN; mức sử dụng 0,72.</w:t>
+        <w:t xml:space="preserve">Độ trôi bè lớn nhất (mọi hướng, mọi mực nước): 0,3 – 0,9 m tùy bè (kiểm tra C12: ≤ nửa khoảng hở nhỏ nhất tới bè bên cạnh).</w:t>
       </w:r>
     </w:p>
     <w:p>
@@ -830,49 +895,26 @@
           <w:szCs w:val="24"/>
           <w:lang w:val="vi-VN"/>
         </w:rPr>
-        <w:t xml:space="preserve">BP-2, uốn thân cọc (TCVN 5574:2018): 1,2 × M</w:t>
-      </w:r>
-      <w:r>
-        <w:rPr>
-          <w:rFonts w:ascii="Times New Roman" w:cs="Times New Roman" w:eastAsia="Times New Roman" w:hAnsi="Times New Roman"/>
-          <w:noProof/>
-          <w:sz w:val="24"/>
-          <w:szCs w:val="24"/>
-          <w:vertAlign w:val="subscript"/>
-          <w:lang w:val="vi-VN"/>
-        </w:rPr>
-        <w:t xml:space="preserve">max</w:t>
-      </w:r>
-      <w:r>
-        <w:rPr>
-          <w:rFonts w:ascii="Times New Roman" w:cs="Times New Roman" w:eastAsia="Times New Roman" w:hAnsi="Times New Roman"/>
-          <w:noProof/>
-          <w:sz w:val="24"/>
-          <w:szCs w:val="24"/>
-          <w:lang w:val="vi-VN"/>
-        </w:rPr>
-        <w:t xml:space="preserve"> = 1,2 × 79,9 = 95,8 kNm ≤ M</w:t>
-      </w:r>
-      <w:r>
-        <w:rPr>
-          <w:rFonts w:ascii="Times New Roman" w:cs="Times New Roman" w:eastAsia="Times New Roman" w:hAnsi="Times New Roman"/>
-          <w:noProof/>
-          <w:sz w:val="24"/>
-          <w:szCs w:val="24"/>
-          <w:vertAlign w:val="subscript"/>
-          <w:lang w:val="vi-VN"/>
-        </w:rPr>
-        <w:t xml:space="preserve">rd</w:t>
-      </w:r>
-      <w:r>
-        <w:rPr>
-          <w:rFonts w:ascii="Times New Roman" w:cs="Times New Roman" w:eastAsia="Times New Roman" w:hAnsi="Times New Roman"/>
-          <w:noProof/>
-          <w:sz w:val="24"/>
-          <w:szCs w:val="24"/>
-          <w:lang w:val="vi-VN"/>
-        </w:rPr>
-        <w:t xml:space="preserve"> = 103,7 kNm; mức sử dụng 0,92.</w:t>
+        <w:t xml:space="preserve">Dây ngắn hơn 4 m (B6-D04, B6-D29) không tính vào cân bằng: lắp làm dây dự phòng, cắt dài thêm 0,5 m — bè trôi chưa tới 0,5 m nên chúng không chịu lực.</w:t>
+      </w:r>
+    </w:p>
+    <w:p>
+      <w:pPr>
+        <w:pStyle w:val="Heading2"/>
+        <w:keepNext/>
+        <w:spacing w:after="100" w:before="240"/>
+      </w:pPr>
+      <w:r>
+        <w:rPr>
+          <w:rFonts w:ascii="Times New Roman" w:cs="Times New Roman" w:eastAsia="Times New Roman" w:hAnsi="Times New Roman"/>
+          <w:b/>
+          <w:bCs/>
+          <w:noProof/>
+          <w:sz w:val="26"/>
+          <w:szCs w:val="26"/>
+          <w:lang w:val="vi-VN"/>
+        </w:rPr>
+        <w:t xml:space="preserve">5. Cọc khoan nhồi ven bờ (ví dụ BÈ 3A)</w:t>
       </w:r>
     </w:p>
     <w:p>
@@ -892,26 +934,28 @@
           <w:szCs w:val="24"/>
           <w:lang w:val="vi-VN"/>
         </w:rPr>
-        <w:t xml:space="preserve">Cả hệ: 262 cọc, tổng dài 1.729,2 m, 166,4 m³ bê tông, 57,7 tấn thép. Lực kiểm tra cọc là toàn bộ lực dây (không giảm theo góc xiên), thiên về an toàn.</w:t>
-      </w:r>
-    </w:p>
-    <w:p>
-      <w:pPr>
-        <w:pStyle w:val="Heading2"/>
-        <w:keepNext/>
-        <w:spacing w:after="100" w:before="240"/>
-      </w:pPr>
-      <w:r>
-        <w:rPr>
-          <w:rFonts w:ascii="Times New Roman" w:cs="Times New Roman" w:eastAsia="Times New Roman" w:hAnsi="Times New Roman"/>
-          <w:b/>
-          <w:bCs/>
-          <w:noProof/>
-          <w:sz w:val="26"/>
-          <w:szCs w:val="26"/>
-          <w:lang w:val="vi-VN"/>
-        </w:rPr>
-        <w:t xml:space="preserve">6. Đế BTCT + vít xoắn (ví dụ HV-DV028, đế làm việc nặng nhất)</w:t>
+        <w:t xml:space="preserve">Cọc tròn D350 đổ tại chỗ, ngàm L</w:t>
+      </w:r>
+      <w:r>
+        <w:rPr>
+          <w:rFonts w:ascii="Times New Roman" w:cs="Times New Roman" w:eastAsia="Times New Roman" w:hAnsi="Times New Roman"/>
+          <w:noProof/>
+          <w:sz w:val="24"/>
+          <w:szCs w:val="24"/>
+          <w:vertAlign w:val="subscript"/>
+          <w:lang w:val="vi-VN"/>
+        </w:rPr>
+        <w:t xml:space="preserve">tk</w:t>
+      </w:r>
+      <w:r>
+        <w:rPr>
+          <w:rFonts w:ascii="Times New Roman" w:cs="Times New Roman" w:eastAsia="Times New Roman" w:hAnsi="Times New Roman"/>
+          <w:noProof/>
+          <w:sz w:val="24"/>
+          <w:szCs w:val="24"/>
+          <w:lang w:val="vi-VN"/>
+        </w:rPr>
+        <w:t xml:space="preserve"> = 6,5 m, dài cả cọc 6,6 m; thép chủ 8Φ25 CB400-V, Đai xoắn Φ8 a150. Cáp móc cách mặt đất 0,1 m.</w:t>
       </w:r>
     </w:p>
     <w:p>
@@ -931,133 +975,7 @@
           <w:szCs w:val="24"/>
           <w:lang w:val="vi-VN"/>
         </w:rPr>
-        <w:t xml:space="preserve">Một vít: ống Ø89×5, ren Ø105, ngàm 3,0 m. Sức chịu nhổ cực hạn Q</w:t>
-      </w:r>
-      <w:r>
-        <w:rPr>
-          <w:rFonts w:ascii="Times New Roman" w:cs="Times New Roman" w:eastAsia="Times New Roman" w:hAnsi="Times New Roman"/>
-          <w:noProof/>
-          <w:sz w:val="24"/>
-          <w:szCs w:val="24"/>
-          <w:vertAlign w:val="subscript"/>
-          <w:lang w:val="vi-VN"/>
-        </w:rPr>
-        <w:t xml:space="preserve">u</w:t>
-      </w:r>
-      <w:r>
-        <w:rPr>
-          <w:rFonts w:ascii="Times New Roman" w:cs="Times New Roman" w:eastAsia="Times New Roman" w:hAnsi="Times New Roman"/>
-          <w:noProof/>
-          <w:sz w:val="24"/>
-          <w:szCs w:val="24"/>
-          <w:lang w:val="vi-VN"/>
-        </w:rPr>
-        <w:t xml:space="preserve"> = α × c</w:t>
-      </w:r>
-      <w:r>
-        <w:rPr>
-          <w:rFonts w:ascii="Times New Roman" w:cs="Times New Roman" w:eastAsia="Times New Roman" w:hAnsi="Times New Roman"/>
-          <w:noProof/>
-          <w:sz w:val="24"/>
-          <w:szCs w:val="24"/>
-          <w:vertAlign w:val="subscript"/>
-          <w:lang w:val="vi-VN"/>
-        </w:rPr>
-        <w:t xml:space="preserve">u</w:t>
-      </w:r>
-      <w:r>
-        <w:rPr>
-          <w:rFonts w:ascii="Times New Roman" w:cs="Times New Roman" w:eastAsia="Times New Roman" w:hAnsi="Times New Roman"/>
-          <w:noProof/>
-          <w:sz w:val="24"/>
-          <w:szCs w:val="24"/>
-          <w:lang w:val="vi-VN"/>
-        </w:rPr>
-        <w:t xml:space="preserve"> × π × D</w:t>
-      </w:r>
-      <w:r>
-        <w:rPr>
-          <w:rFonts w:ascii="Times New Roman" w:cs="Times New Roman" w:eastAsia="Times New Roman" w:hAnsi="Times New Roman"/>
-          <w:noProof/>
-          <w:sz w:val="24"/>
-          <w:szCs w:val="24"/>
-          <w:vertAlign w:val="subscript"/>
-          <w:lang w:val="vi-VN"/>
-        </w:rPr>
-        <w:t xml:space="preserve">ren</w:t>
-      </w:r>
-      <w:r>
-        <w:rPr>
-          <w:rFonts w:ascii="Times New Roman" w:cs="Times New Roman" w:eastAsia="Times New Roman" w:hAnsi="Times New Roman"/>
-          <w:noProof/>
-          <w:sz w:val="24"/>
-          <w:szCs w:val="24"/>
-          <w:lang w:val="vi-VN"/>
-        </w:rPr>
-        <w:t xml:space="preserve"> × L = 0,8 × 20 × π × 0,105 × 3,0 = 15,8 kN; cho phép Q</w:t>
-      </w:r>
-      <w:r>
-        <w:rPr>
-          <w:rFonts w:ascii="Times New Roman" w:cs="Times New Roman" w:eastAsia="Times New Roman" w:hAnsi="Times New Roman"/>
-          <w:noProof/>
-          <w:sz w:val="24"/>
-          <w:szCs w:val="24"/>
-          <w:vertAlign w:val="subscript"/>
-          <w:lang w:val="vi-VN"/>
-        </w:rPr>
-        <w:t xml:space="preserve">a</w:t>
-      </w:r>
-      <w:r>
-        <w:rPr>
-          <w:rFonts w:ascii="Times New Roman" w:cs="Times New Roman" w:eastAsia="Times New Roman" w:hAnsi="Times New Roman"/>
-          <w:noProof/>
-          <w:sz w:val="24"/>
-          <w:szCs w:val="24"/>
-          <w:lang w:val="vi-VN"/>
-        </w:rPr>
-        <w:t xml:space="preserve"> = Q</w:t>
-      </w:r>
-      <w:r>
-        <w:rPr>
-          <w:rFonts w:ascii="Times New Roman" w:cs="Times New Roman" w:eastAsia="Times New Roman" w:hAnsi="Times New Roman"/>
-          <w:noProof/>
-          <w:sz w:val="24"/>
-          <w:szCs w:val="24"/>
-          <w:vertAlign w:val="subscript"/>
-          <w:lang w:val="vi-VN"/>
-        </w:rPr>
-        <w:t xml:space="preserve">u</w:t>
-      </w:r>
-      <w:r>
-        <w:rPr>
-          <w:rFonts w:ascii="Times New Roman" w:cs="Times New Roman" w:eastAsia="Times New Roman" w:hAnsi="Times New Roman"/>
-          <w:noProof/>
-          <w:sz w:val="24"/>
-          <w:szCs w:val="24"/>
-          <w:lang w:val="vi-VN"/>
-        </w:rPr>
-        <w:t xml:space="preserve"> / 2 = 7,9 kN. Sức chịu ngang cực hạn H</w:t>
-      </w:r>
-      <w:r>
-        <w:rPr>
-          <w:rFonts w:ascii="Times New Roman" w:cs="Times New Roman" w:eastAsia="Times New Roman" w:hAnsi="Times New Roman"/>
-          <w:noProof/>
-          <w:sz w:val="24"/>
-          <w:szCs w:val="24"/>
-          <w:vertAlign w:val="subscript"/>
-          <w:lang w:val="vi-VN"/>
-        </w:rPr>
-        <w:t xml:space="preserve">u</w:t>
-      </w:r>
-      <w:r>
-        <w:rPr>
-          <w:rFonts w:ascii="Times New Roman" w:cs="Times New Roman" w:eastAsia="Times New Roman" w:hAnsi="Times New Roman"/>
-          <w:noProof/>
-          <w:sz w:val="24"/>
-          <w:szCs w:val="24"/>
-          <w:lang w:val="vi-VN"/>
-        </w:rPr>
-        <w:t xml:space="preserve"> = 15,0 kN.</w:t>
+        <w:t xml:space="preserve">Điểm neo CỌC ĐÔI: 2 cọc cạnh nhau, vuông góc phương cáp, cách nhau ≥ 3D; mỗi cọc chịu P = T / (2 × 0,9) = 83,5 kN (hệ số nhóm là GIẢ ĐỊNH); đài BTCT nối hai đầu cọc: thiết kế sơ bộ ở bảng thống kê vật tư neo (twinPileCap.ts).</w:t>
       </w:r>
     </w:p>
     <w:p>
@@ -1077,7 +995,49 @@
           <w:szCs w:val="24"/>
           <w:lang w:val="vi-VN"/>
         </w:rPr>
-        <w:t xml:space="preserve">Đế HV-DV028 giữ hai dây B7-D20 (BÈ 7, T = 67,0 kN, dài 11,52 m) và B8-D31 (BÈ 8, T = 52,7 kN, dài 11,52 m). Bích bè cao hơn mặt nước 0,35 m.</w:t>
+        <w:t xml:space="preserve">BP-1, sức chịu ngang theo Broms (cọc ngắn trong đất sét). Sức kháng của đất trên 1 m cọc: p = 9 × c</w:t>
+      </w:r>
+      <w:r>
+        <w:rPr>
+          <w:rFonts w:ascii="Times New Roman" w:cs="Times New Roman" w:eastAsia="Times New Roman" w:hAnsi="Times New Roman"/>
+          <w:noProof/>
+          <w:sz w:val="24"/>
+          <w:szCs w:val="24"/>
+          <w:vertAlign w:val="subscript"/>
+          <w:lang w:val="vi-VN"/>
+        </w:rPr>
+        <w:t xml:space="preserve">u</w:t>
+      </w:r>
+      <w:r>
+        <w:rPr>
+          <w:rFonts w:ascii="Times New Roman" w:cs="Times New Roman" w:eastAsia="Times New Roman" w:hAnsi="Times New Roman"/>
+          <w:noProof/>
+          <w:sz w:val="24"/>
+          <w:szCs w:val="24"/>
+          <w:lang w:val="vi-VN"/>
+        </w:rPr>
+        <w:t xml:space="preserve"> × D = 9 × 40 × 0,35 = 126,0 kN/m; đoạn 1,5D = 0,525 m dưới mặt đất không tính, phần ngàm làm việc g = L</w:t>
+      </w:r>
+      <w:r>
+        <w:rPr>
+          <w:rFonts w:ascii="Times New Roman" w:cs="Times New Roman" w:eastAsia="Times New Roman" w:hAnsi="Times New Roman"/>
+          <w:noProof/>
+          <w:sz w:val="24"/>
+          <w:szCs w:val="24"/>
+          <w:vertAlign w:val="subscript"/>
+          <w:lang w:val="vi-VN"/>
+        </w:rPr>
+        <w:t xml:space="preserve">tk</w:t>
+      </w:r>
+      <w:r>
+        <w:rPr>
+          <w:rFonts w:ascii="Times New Roman" w:cs="Times New Roman" w:eastAsia="Times New Roman" w:hAnsi="Times New Roman"/>
+          <w:noProof/>
+          <w:sz w:val="24"/>
+          <w:szCs w:val="24"/>
+          <w:lang w:val="vi-VN"/>
+        </w:rPr>
+        <w:t xml:space="preserve"> − 1,5D = 6,5 − 0,525 = 5,975 m; tim chốt cáp cao e = 0,10 m trên mặt đất.</w:t>
       </w:r>
     </w:p>
     <w:p>
@@ -1097,7 +1057,7 @@
           <w:szCs w:val="24"/>
           <w:lang w:val="vi-VN"/>
         </w:rPr>
-        <w:t xml:space="preserve">Tổ hợp chi phối: cả hai dây căng (MN cao). Lực nhổ T</w:t>
+        <w:t xml:space="preserve">H</w:t>
       </w:r>
       <w:r>
         <w:rPr>
@@ -1108,17 +1068,17 @@
           <w:vertAlign w:val="subscript"/>
           <w:lang w:val="vi-VN"/>
         </w:rPr>
-        <w:t xml:space="preserve">v</w:t>
-      </w:r>
-      <w:r>
-        <w:rPr>
-          <w:rFonts w:ascii="Times New Roman" w:cs="Times New Roman" w:eastAsia="Times New Roman" w:hAnsi="Times New Roman"/>
-          <w:noProof/>
-          <w:sz w:val="24"/>
-          <w:szCs w:val="24"/>
-          <w:lang w:val="vi-VN"/>
-        </w:rPr>
-        <w:t xml:space="preserve"> = 65,3 kN (hai dây cộng lại), lực ngang T</w:t>
+        <w:t xml:space="preserve">u</w:t>
+      </w:r>
+      <w:r>
+        <w:rPr>
+          <w:rFonts w:ascii="Times New Roman" w:cs="Times New Roman" w:eastAsia="Times New Roman" w:hAnsi="Times New Roman"/>
+          <w:noProof/>
+          <w:sz w:val="24"/>
+          <w:szCs w:val="24"/>
+          <w:lang w:val="vi-VN"/>
+        </w:rPr>
+        <w:t xml:space="preserve"> là nghiệm dương của (0,5 / p) × H</w:t>
       </w:r>
       <w:r>
         <w:rPr>
@@ -1129,17 +1089,122 @@
           <w:vertAlign w:val="subscript"/>
           <w:lang w:val="vi-VN"/>
         </w:rPr>
-        <w:t xml:space="preserve">h</w:t>
-      </w:r>
-      <w:r>
-        <w:rPr>
-          <w:rFonts w:ascii="Times New Roman" w:cs="Times New Roman" w:eastAsia="Times New Roman" w:hAnsi="Times New Roman"/>
-          <w:noProof/>
-          <w:sz w:val="24"/>
-          <w:szCs w:val="24"/>
-          <w:lang w:val="vi-VN"/>
-        </w:rPr>
-        <w:t xml:space="preserve"> = 12,0 kN (cộng véc-tơ).</w:t>
+        <w:t xml:space="preserve">u</w:t>
+      </w:r>
+      <w:r>
+        <w:rPr>
+          <w:rFonts w:ascii="Times New Roman" w:cs="Times New Roman" w:eastAsia="Times New Roman" w:hAnsi="Times New Roman"/>
+          <w:noProof/>
+          <w:sz w:val="24"/>
+          <w:szCs w:val="24"/>
+          <w:lang w:val="vi-VN"/>
+        </w:rPr>
+        <w:t xml:space="preserve">² + (e + 1,5D + g) × H</w:t>
+      </w:r>
+      <w:r>
+        <w:rPr>
+          <w:rFonts w:ascii="Times New Roman" w:cs="Times New Roman" w:eastAsia="Times New Roman" w:hAnsi="Times New Roman"/>
+          <w:noProof/>
+          <w:sz w:val="24"/>
+          <w:szCs w:val="24"/>
+          <w:vertAlign w:val="subscript"/>
+          <w:lang w:val="vi-VN"/>
+        </w:rPr>
+        <w:t xml:space="preserve">u</w:t>
+      </w:r>
+      <w:r>
+        <w:rPr>
+          <w:rFonts w:ascii="Times New Roman" w:cs="Times New Roman" w:eastAsia="Times New Roman" w:hAnsi="Times New Roman"/>
+          <w:noProof/>
+          <w:sz w:val="24"/>
+          <w:szCs w:val="24"/>
+          <w:lang w:val="vi-VN"/>
+        </w:rPr>
+        <w:t xml:space="preserve"> − 0,5 × p × g² = 0, tức (0,5 / 126,0) × H</w:t>
+      </w:r>
+      <w:r>
+        <w:rPr>
+          <w:rFonts w:ascii="Times New Roman" w:cs="Times New Roman" w:eastAsia="Times New Roman" w:hAnsi="Times New Roman"/>
+          <w:noProof/>
+          <w:sz w:val="24"/>
+          <w:szCs w:val="24"/>
+          <w:vertAlign w:val="subscript"/>
+          <w:lang w:val="vi-VN"/>
+        </w:rPr>
+        <w:t xml:space="preserve">u</w:t>
+      </w:r>
+      <w:r>
+        <w:rPr>
+          <w:rFonts w:ascii="Times New Roman" w:cs="Times New Roman" w:eastAsia="Times New Roman" w:hAnsi="Times New Roman"/>
+          <w:noProof/>
+          <w:sz w:val="24"/>
+          <w:szCs w:val="24"/>
+          <w:lang w:val="vi-VN"/>
+        </w:rPr>
+        <w:t xml:space="preserve">² + 6,600 × H</w:t>
+      </w:r>
+      <w:r>
+        <w:rPr>
+          <w:rFonts w:ascii="Times New Roman" w:cs="Times New Roman" w:eastAsia="Times New Roman" w:hAnsi="Times New Roman"/>
+          <w:noProof/>
+          <w:sz w:val="24"/>
+          <w:szCs w:val="24"/>
+          <w:vertAlign w:val="subscript"/>
+          <w:lang w:val="vi-VN"/>
+        </w:rPr>
+        <w:t xml:space="preserve">u</w:t>
+      </w:r>
+      <w:r>
+        <w:rPr>
+          <w:rFonts w:ascii="Times New Roman" w:cs="Times New Roman" w:eastAsia="Times New Roman" w:hAnsi="Times New Roman"/>
+          <w:noProof/>
+          <w:sz w:val="24"/>
+          <w:szCs w:val="24"/>
+          <w:lang w:val="vi-VN"/>
+        </w:rPr>
+        <w:t xml:space="preserve"> − 2.249,1 = 0 → H</w:t>
+      </w:r>
+      <w:r>
+        <w:rPr>
+          <w:rFonts w:ascii="Times New Roman" w:cs="Times New Roman" w:eastAsia="Times New Roman" w:hAnsi="Times New Roman"/>
+          <w:noProof/>
+          <w:sz w:val="24"/>
+          <w:szCs w:val="24"/>
+          <w:vertAlign w:val="subscript"/>
+          <w:lang w:val="vi-VN"/>
+        </w:rPr>
+        <w:t xml:space="preserve">u</w:t>
+      </w:r>
+      <w:r>
+        <w:rPr>
+          <w:rFonts w:ascii="Times New Roman" w:cs="Times New Roman" w:eastAsia="Times New Roman" w:hAnsi="Times New Roman"/>
+          <w:noProof/>
+          <w:sz w:val="24"/>
+          <w:szCs w:val="24"/>
+          <w:lang w:val="vi-VN"/>
+        </w:rPr>
+        <w:t xml:space="preserve"> = 290,2 kN. Cho phép H</w:t>
+      </w:r>
+      <w:r>
+        <w:rPr>
+          <w:rFonts w:ascii="Times New Roman" w:cs="Times New Roman" w:eastAsia="Times New Roman" w:hAnsi="Times New Roman"/>
+          <w:noProof/>
+          <w:sz w:val="24"/>
+          <w:szCs w:val="24"/>
+          <w:vertAlign w:val="subscript"/>
+          <w:lang w:val="vi-VN"/>
+        </w:rPr>
+        <w:t xml:space="preserve">u</w:t>
+      </w:r>
+      <w:r>
+        <w:rPr>
+          <w:rFonts w:ascii="Times New Roman" w:cs="Times New Roman" w:eastAsia="Times New Roman" w:hAnsi="Times New Roman"/>
+          <w:noProof/>
+          <w:sz w:val="24"/>
+          <w:szCs w:val="24"/>
+          <w:lang w:val="vi-VN"/>
+        </w:rPr>
+        <w:t xml:space="preserve"> / 2,5 = 116,1 kN ≥ P = 83,5 kN; mức sử dụng = 83,5 / 116,1 = 0,72.</w:t>
       </w:r>
     </w:p>
     <w:p>
@@ -1159,7 +1224,28 @@
           <w:szCs w:val="24"/>
           <w:lang w:val="vi-VN"/>
         </w:rPr>
-        <w:t xml:space="preserve">Đế 2,75 × 2,75 × 0,4 m: thể tích 3,03 m³, nặng 75,6 kN trên cạn, W' = 3,03 × (25 − 10) = 45,4 kN trong nước (đã trừ lực đẩy nổi).</w:t>
+        <w:t xml:space="preserve">BP-2, uốn thân cọc (TCVN 5574:2018). Mô-men lớn nhất trong cọc: M</w:t>
+      </w:r>
+      <w:r>
+        <w:rPr>
+          <w:rFonts w:ascii="Times New Roman" w:cs="Times New Roman" w:eastAsia="Times New Roman" w:hAnsi="Times New Roman"/>
+          <w:noProof/>
+          <w:sz w:val="24"/>
+          <w:szCs w:val="24"/>
+          <w:vertAlign w:val="subscript"/>
+          <w:lang w:val="vi-VN"/>
+        </w:rPr>
+        <w:t xml:space="preserve">max</w:t>
+      </w:r>
+      <w:r>
+        <w:rPr>
+          <w:rFonts w:ascii="Times New Roman" w:cs="Times New Roman" w:eastAsia="Times New Roman" w:hAnsi="Times New Roman"/>
+          <w:noProof/>
+          <w:sz w:val="24"/>
+          <w:szCs w:val="24"/>
+          <w:lang w:val="vi-VN"/>
+        </w:rPr>
+        <w:t xml:space="preserve"> = P × (e + 1,5D + 0,5 × P / p) = 83,5 × (0,10 + 0,525 + 0,5 × 83,5 / 126,0) = 79,9 kNm.</w:t>
       </w:r>
     </w:p>
     <w:p>
@@ -1179,7 +1265,7 @@
           <w:szCs w:val="24"/>
           <w:lang w:val="vi-VN"/>
         </w:rPr>
-        <w:t xml:space="preserve">SV-1 nhổ: T</w:t>
+        <w:t xml:space="preserve">Khả năng chịu uốn của lồng 8 thanh Φ25 đặt trên vòng tròn: M</w:t>
       </w:r>
       <w:r>
         <w:rPr>
@@ -1190,17 +1276,17 @@
           <w:vertAlign w:val="subscript"/>
           <w:lang w:val="vi-VN"/>
         </w:rPr>
-        <w:t xml:space="preserve">v</w:t>
-      </w:r>
-      <w:r>
-        <w:rPr>
-          <w:rFonts w:ascii="Times New Roman" w:cs="Times New Roman" w:eastAsia="Times New Roman" w:hAnsi="Times New Roman"/>
-          <w:noProof/>
-          <w:sz w:val="24"/>
-          <w:szCs w:val="24"/>
-          <w:lang w:val="vi-VN"/>
-        </w:rPr>
-        <w:t xml:space="preserve"> ≤ 0,9 × W' + 4 × Q</w:t>
+        <w:t xml:space="preserve">rd</w:t>
+      </w:r>
+      <w:r>
+        <w:rPr>
+          <w:rFonts w:ascii="Times New Roman" w:cs="Times New Roman" w:eastAsia="Times New Roman" w:hAnsi="Times New Roman"/>
+          <w:noProof/>
+          <w:sz w:val="24"/>
+          <w:szCs w:val="24"/>
+          <w:lang w:val="vi-VN"/>
+        </w:rPr>
+        <w:t xml:space="preserve"> = A</w:t>
       </w:r>
       <w:r>
         <w:rPr>
@@ -1211,17 +1297,38 @@
           <w:vertAlign w:val="subscript"/>
           <w:lang w:val="vi-VN"/>
         </w:rPr>
-        <w:t xml:space="preserve">a</w:t>
-      </w:r>
-      <w:r>
-        <w:rPr>
-          <w:rFonts w:ascii="Times New Roman" w:cs="Times New Roman" w:eastAsia="Times New Roman" w:hAnsi="Times New Roman"/>
-          <w:noProof/>
-          <w:sz w:val="24"/>
-          <w:szCs w:val="24"/>
-          <w:lang w:val="vi-VN"/>
-        </w:rPr>
-        <w:t xml:space="preserve"> = 72,5 kN; mức sử dụng 0,90.</w:t>
+        <w:t xml:space="preserve">1</w:t>
+      </w:r>
+      <w:r>
+        <w:rPr>
+          <w:rFonts w:ascii="Times New Roman" w:cs="Times New Roman" w:eastAsia="Times New Roman" w:hAnsi="Times New Roman"/>
+          <w:noProof/>
+          <w:sz w:val="24"/>
+          <w:szCs w:val="24"/>
+          <w:lang w:val="vi-VN"/>
+        </w:rPr>
+        <w:t xml:space="preserve"> thanh × R</w:t>
+      </w:r>
+      <w:r>
+        <w:rPr>
+          <w:rFonts w:ascii="Times New Roman" w:cs="Times New Roman" w:eastAsia="Times New Roman" w:hAnsi="Times New Roman"/>
+          <w:noProof/>
+          <w:sz w:val="24"/>
+          <w:szCs w:val="24"/>
+          <w:vertAlign w:val="subscript"/>
+          <w:lang w:val="vi-VN"/>
+        </w:rPr>
+        <w:t xml:space="preserve">s</w:t>
+      </w:r>
+      <w:r>
+        <w:rPr>
+          <w:rFonts w:ascii="Times New Roman" w:cs="Times New Roman" w:eastAsia="Times New Roman" w:hAnsi="Times New Roman"/>
+          <w:noProof/>
+          <w:sz w:val="24"/>
+          <w:szCs w:val="24"/>
+          <w:lang w:val="vi-VN"/>
+        </w:rPr>
+        <w:t xml:space="preserve"> × r × k(n) = 490,9 mm² × 350 MPa × 0,125 m × 4,83 = 103,7 kNm (r = D/2 − 50 mm tới tim thép; k(n) = 2 / tan(π/n) là cánh tay đòn của n thanh ở hướng BẤT LỢI nhất, vì lồng thả vào lỗ khoan không định hướng được; bỏ qua bê tông chịu kéo).</w:t>
       </w:r>
     </w:p>
     <w:p>
@@ -1241,7 +1348,7 @@
           <w:szCs w:val="24"/>
           <w:lang w:val="vi-VN"/>
         </w:rPr>
-        <w:t xml:space="preserve">SV-2 trượt: 1,5 × T</w:t>
+        <w:t xml:space="preserve">Kiểm tra: 1,2 × M</w:t>
       </w:r>
       <w:r>
         <w:rPr>
@@ -1252,17 +1359,17 @@
           <w:vertAlign w:val="subscript"/>
           <w:lang w:val="vi-VN"/>
         </w:rPr>
-        <w:t xml:space="preserve">h</w:t>
-      </w:r>
-      <w:r>
-        <w:rPr>
-          <w:rFonts w:ascii="Times New Roman" w:cs="Times New Roman" w:eastAsia="Times New Roman" w:hAnsi="Times New Roman"/>
-          <w:noProof/>
-          <w:sz w:val="24"/>
-          <w:szCs w:val="24"/>
-          <w:lang w:val="vi-VN"/>
-        </w:rPr>
-        <w:t xml:space="preserve"> ≤ bám dính đáy + gờ + 4 × H</w:t>
+        <w:t xml:space="preserve">max</w:t>
+      </w:r>
+      <w:r>
+        <w:rPr>
+          <w:rFonts w:ascii="Times New Roman" w:cs="Times New Roman" w:eastAsia="Times New Roman" w:hAnsi="Times New Roman"/>
+          <w:noProof/>
+          <w:sz w:val="24"/>
+          <w:szCs w:val="24"/>
+          <w:lang w:val="vi-VN"/>
+        </w:rPr>
+        <w:t xml:space="preserve"> = 1,2 × 79,9 = 95,8 kNm ≤ M</w:t>
       </w:r>
       <w:r>
         <w:rPr>
@@ -1273,38 +1380,17 @@
           <w:vertAlign w:val="subscript"/>
           <w:lang w:val="vi-VN"/>
         </w:rPr>
-        <w:t xml:space="preserve">u</w:t>
-      </w:r>
-      <w:r>
-        <w:rPr>
-          <w:rFonts w:ascii="Times New Roman" w:cs="Times New Roman" w:eastAsia="Times New Roman" w:hAnsi="Times New Roman"/>
-          <w:noProof/>
-          <w:sz w:val="24"/>
-          <w:szCs w:val="24"/>
-          <w:lang w:val="vi-VN"/>
-        </w:rPr>
-        <w:t xml:space="preserve">; mức sử dụng 0,61 (bám dính đáy lấy bằng 0 khi T</w:t>
-      </w:r>
-      <w:r>
-        <w:rPr>
-          <w:rFonts w:ascii="Times New Roman" w:cs="Times New Roman" w:eastAsia="Times New Roman" w:hAnsi="Times New Roman"/>
-          <w:noProof/>
-          <w:sz w:val="24"/>
-          <w:szCs w:val="24"/>
-          <w:vertAlign w:val="subscript"/>
-          <w:lang w:val="vi-VN"/>
-        </w:rPr>
-        <w:t xml:space="preserve">v</w:t>
-      </w:r>
-      <w:r>
-        <w:rPr>
-          <w:rFonts w:ascii="Times New Roman" w:cs="Times New Roman" w:eastAsia="Times New Roman" w:hAnsi="Times New Roman"/>
-          <w:noProof/>
-          <w:sz w:val="24"/>
-          <w:szCs w:val="24"/>
-          <w:lang w:val="vi-VN"/>
-        </w:rPr>
-        <w:t xml:space="preserve"> &gt; W').</w:t>
+        <w:t xml:space="preserve">rd</w:t>
+      </w:r>
+      <w:r>
+        <w:rPr>
+          <w:rFonts w:ascii="Times New Roman" w:cs="Times New Roman" w:eastAsia="Times New Roman" w:hAnsi="Times New Roman"/>
+          <w:noProof/>
+          <w:sz w:val="24"/>
+          <w:szCs w:val="24"/>
+          <w:lang w:val="vi-VN"/>
+        </w:rPr>
+        <w:t xml:space="preserve"> = 103,7 kNm; mức sử dụng 0,92 (1,2 là hệ số tải trọng khi kiểm tra uốn).</w:t>
       </w:r>
     </w:p>
     <w:p>
@@ -1324,49 +1410,26 @@
           <w:szCs w:val="24"/>
           <w:lang w:val="vi-VN"/>
         </w:rPr>
-        <w:t xml:space="preserve">SV-3 lật quanh mép đế: 1,5 × M</w:t>
-      </w:r>
-      <w:r>
-        <w:rPr>
-          <w:rFonts w:ascii="Times New Roman" w:cs="Times New Roman" w:eastAsia="Times New Roman" w:hAnsi="Times New Roman"/>
-          <w:noProof/>
-          <w:sz w:val="24"/>
-          <w:szCs w:val="24"/>
-          <w:vertAlign w:val="subscript"/>
-          <w:lang w:val="vi-VN"/>
-        </w:rPr>
-        <w:t xml:space="preserve">lật</w:t>
-      </w:r>
-      <w:r>
-        <w:rPr>
-          <w:rFonts w:ascii="Times New Roman" w:cs="Times New Roman" w:eastAsia="Times New Roman" w:hAnsi="Times New Roman"/>
-          <w:noProof/>
-          <w:sz w:val="24"/>
-          <w:szCs w:val="24"/>
-          <w:lang w:val="vi-VN"/>
-        </w:rPr>
-        <w:t xml:space="preserve"> = 1,5 × 96,4 ≤ M</w:t>
-      </w:r>
-      <w:r>
-        <w:rPr>
-          <w:rFonts w:ascii="Times New Roman" w:cs="Times New Roman" w:eastAsia="Times New Roman" w:hAnsi="Times New Roman"/>
-          <w:noProof/>
-          <w:sz w:val="24"/>
-          <w:szCs w:val="24"/>
-          <w:vertAlign w:val="subscript"/>
-          <w:lang w:val="vi-VN"/>
-        </w:rPr>
-        <w:t xml:space="preserve">giữ</w:t>
-      </w:r>
-      <w:r>
-        <w:rPr>
-          <w:rFonts w:ascii="Times New Roman" w:cs="Times New Roman" w:eastAsia="Times New Roman" w:hAnsi="Times New Roman"/>
-          <w:noProof/>
-          <w:sz w:val="24"/>
-          <w:szCs w:val="24"/>
-          <w:lang w:val="vi-VN"/>
-        </w:rPr>
-        <w:t xml:space="preserve"> = 149,5 kNm; mức sử dụng 0,97.</w:t>
+        <w:t xml:space="preserve">Cả hệ: 262 cọc, tổng dài 1.729,2 m, 166,4 m³ bê tông, 57,7 tấn thép. Lực kiểm tra cọc là toàn bộ lực dây (không giảm theo góc xiên), thiên về an toàn.</w:t>
+      </w:r>
+    </w:p>
+    <w:p>
+      <w:pPr>
+        <w:pStyle w:val="Heading2"/>
+        <w:keepNext/>
+        <w:spacing w:after="100" w:before="240"/>
+      </w:pPr>
+      <w:r>
+        <w:rPr>
+          <w:rFonts w:ascii="Times New Roman" w:cs="Times New Roman" w:eastAsia="Times New Roman" w:hAnsi="Times New Roman"/>
+          <w:b/>
+          <w:bCs/>
+          <w:noProof/>
+          <w:sz w:val="26"/>
+          <w:szCs w:val="26"/>
+          <w:lang w:val="vi-VN"/>
+        </w:rPr>
+        <w:t xml:space="preserve">6. Đế BTCT + vít xoắn (ví dụ HV-DV028, đế làm việc nặng nhất)</w:t>
       </w:r>
     </w:p>
     <w:p>
@@ -1386,7 +1449,7 @@
           <w:szCs w:val="24"/>
           <w:lang w:val="vi-VN"/>
         </w:rPr>
-        <w:t xml:space="preserve">SV-4 một vít: N</w:t>
+        <w:t xml:space="preserve">Một vít: ống Ø89×5, ren Ø105, ngàm 3,0 m. Sức chịu nhổ cực hạn Q</w:t>
       </w:r>
       <w:r>
         <w:rPr>
@@ -1397,6 +1460,691 @@
           <w:vertAlign w:val="subscript"/>
           <w:lang w:val="vi-VN"/>
         </w:rPr>
+        <w:t xml:space="preserve">u</w:t>
+      </w:r>
+      <w:r>
+        <w:rPr>
+          <w:rFonts w:ascii="Times New Roman" w:cs="Times New Roman" w:eastAsia="Times New Roman" w:hAnsi="Times New Roman"/>
+          <w:noProof/>
+          <w:sz w:val="24"/>
+          <w:szCs w:val="24"/>
+          <w:lang w:val="vi-VN"/>
+        </w:rPr>
+        <w:t xml:space="preserve"> = α × c</w:t>
+      </w:r>
+      <w:r>
+        <w:rPr>
+          <w:rFonts w:ascii="Times New Roman" w:cs="Times New Roman" w:eastAsia="Times New Roman" w:hAnsi="Times New Roman"/>
+          <w:noProof/>
+          <w:sz w:val="24"/>
+          <w:szCs w:val="24"/>
+          <w:vertAlign w:val="subscript"/>
+          <w:lang w:val="vi-VN"/>
+        </w:rPr>
+        <w:t xml:space="preserve">u</w:t>
+      </w:r>
+      <w:r>
+        <w:rPr>
+          <w:rFonts w:ascii="Times New Roman" w:cs="Times New Roman" w:eastAsia="Times New Roman" w:hAnsi="Times New Roman"/>
+          <w:noProof/>
+          <w:sz w:val="24"/>
+          <w:szCs w:val="24"/>
+          <w:lang w:val="vi-VN"/>
+        </w:rPr>
+        <w:t xml:space="preserve"> × π × D</w:t>
+      </w:r>
+      <w:r>
+        <w:rPr>
+          <w:rFonts w:ascii="Times New Roman" w:cs="Times New Roman" w:eastAsia="Times New Roman" w:hAnsi="Times New Roman"/>
+          <w:noProof/>
+          <w:sz w:val="24"/>
+          <w:szCs w:val="24"/>
+          <w:vertAlign w:val="subscript"/>
+          <w:lang w:val="vi-VN"/>
+        </w:rPr>
+        <w:t xml:space="preserve">ren</w:t>
+      </w:r>
+      <w:r>
+        <w:rPr>
+          <w:rFonts w:ascii="Times New Roman" w:cs="Times New Roman" w:eastAsia="Times New Roman" w:hAnsi="Times New Roman"/>
+          <w:noProof/>
+          <w:sz w:val="24"/>
+          <w:szCs w:val="24"/>
+          <w:lang w:val="vi-VN"/>
+        </w:rPr>
+        <w:t xml:space="preserve"> × L = 0,8 × 20 × π × 0,105 × 3,0 = 15,8 kN; cho phép Q</w:t>
+      </w:r>
+      <w:r>
+        <w:rPr>
+          <w:rFonts w:ascii="Times New Roman" w:cs="Times New Roman" w:eastAsia="Times New Roman" w:hAnsi="Times New Roman"/>
+          <w:noProof/>
+          <w:sz w:val="24"/>
+          <w:szCs w:val="24"/>
+          <w:vertAlign w:val="subscript"/>
+          <w:lang w:val="vi-VN"/>
+        </w:rPr>
+        <w:t xml:space="preserve">a</w:t>
+      </w:r>
+      <w:r>
+        <w:rPr>
+          <w:rFonts w:ascii="Times New Roman" w:cs="Times New Roman" w:eastAsia="Times New Roman" w:hAnsi="Times New Roman"/>
+          <w:noProof/>
+          <w:sz w:val="24"/>
+          <w:szCs w:val="24"/>
+          <w:lang w:val="vi-VN"/>
+        </w:rPr>
+        <w:t xml:space="preserve"> = Q</w:t>
+      </w:r>
+      <w:r>
+        <w:rPr>
+          <w:rFonts w:ascii="Times New Roman" w:cs="Times New Roman" w:eastAsia="Times New Roman" w:hAnsi="Times New Roman"/>
+          <w:noProof/>
+          <w:sz w:val="24"/>
+          <w:szCs w:val="24"/>
+          <w:vertAlign w:val="subscript"/>
+          <w:lang w:val="vi-VN"/>
+        </w:rPr>
+        <w:t xml:space="preserve">u</w:t>
+      </w:r>
+      <w:r>
+        <w:rPr>
+          <w:rFonts w:ascii="Times New Roman" w:cs="Times New Roman" w:eastAsia="Times New Roman" w:hAnsi="Times New Roman"/>
+          <w:noProof/>
+          <w:sz w:val="24"/>
+          <w:szCs w:val="24"/>
+          <w:lang w:val="vi-VN"/>
+        </w:rPr>
+        <w:t xml:space="preserve"> / 2 = 7,9 kN. Sức chịu ngang cực hạn H</w:t>
+      </w:r>
+      <w:r>
+        <w:rPr>
+          <w:rFonts w:ascii="Times New Roman" w:cs="Times New Roman" w:eastAsia="Times New Roman" w:hAnsi="Times New Roman"/>
+          <w:noProof/>
+          <w:sz w:val="24"/>
+          <w:szCs w:val="24"/>
+          <w:vertAlign w:val="subscript"/>
+          <w:lang w:val="vi-VN"/>
+        </w:rPr>
+        <w:t xml:space="preserve">u</w:t>
+      </w:r>
+      <w:r>
+        <w:rPr>
+          <w:rFonts w:ascii="Times New Roman" w:cs="Times New Roman" w:eastAsia="Times New Roman" w:hAnsi="Times New Roman"/>
+          <w:noProof/>
+          <w:sz w:val="24"/>
+          <w:szCs w:val="24"/>
+          <w:lang w:val="vi-VN"/>
+        </w:rPr>
+        <w:t xml:space="preserve"> = 15,0 kN.</w:t>
+      </w:r>
+    </w:p>
+    <w:p>
+      <w:pPr>
+        <w:pStyle w:val="ListParagraph"/>
+        <w:numPr>
+          <w:ilvl w:val="0"/>
+          <w:numId w:val="1"/>
+        </w:numPr>
+        <w:spacing w:after="60"/>
+      </w:pPr>
+      <w:r>
+        <w:rPr>
+          <w:rFonts w:ascii="Times New Roman" w:cs="Times New Roman" w:eastAsia="Times New Roman" w:hAnsi="Times New Roman"/>
+          <w:noProof/>
+          <w:sz w:val="24"/>
+          <w:szCs w:val="24"/>
+          <w:lang w:val="vi-VN"/>
+        </w:rPr>
+        <w:t xml:space="preserve">Đế HV-DV028 giữ hai dây B7-D20 (BÈ 7, T = 67,0 kN, dài 11,52 m) và B8-D31 (BÈ 8, T = 52,7 kN, dài 11,52 m). Bích bè cao hơn mặt nước 0,35 m.</w:t>
+      </w:r>
+    </w:p>
+    <w:p>
+      <w:pPr>
+        <w:pStyle w:val="ListParagraph"/>
+        <w:numPr>
+          <w:ilvl w:val="0"/>
+          <w:numId w:val="1"/>
+        </w:numPr>
+        <w:spacing w:after="60"/>
+      </w:pPr>
+      <w:r>
+        <w:rPr>
+          <w:rFonts w:ascii="Times New Roman" w:cs="Times New Roman" w:eastAsia="Times New Roman" w:hAnsi="Times New Roman"/>
+          <w:noProof/>
+          <w:sz w:val="24"/>
+          <w:szCs w:val="24"/>
+          <w:lang w:val="vi-VN"/>
+        </w:rPr>
+        <w:t xml:space="preserve">Mỗi dây tách thành lực ngang T</w:t>
+      </w:r>
+      <w:r>
+        <w:rPr>
+          <w:rFonts w:ascii="Times New Roman" w:cs="Times New Roman" w:eastAsia="Times New Roman" w:hAnsi="Times New Roman"/>
+          <w:noProof/>
+          <w:sz w:val="24"/>
+          <w:szCs w:val="24"/>
+          <w:vertAlign w:val="subscript"/>
+          <w:lang w:val="vi-VN"/>
+        </w:rPr>
+        <w:t xml:space="preserve">h</w:t>
+      </w:r>
+      <w:r>
+        <w:rPr>
+          <w:rFonts w:ascii="Times New Roman" w:cs="Times New Roman" w:eastAsia="Times New Roman" w:hAnsi="Times New Roman"/>
+          <w:noProof/>
+          <w:sz w:val="24"/>
+          <w:szCs w:val="24"/>
+          <w:lang w:val="vi-VN"/>
+        </w:rPr>
+        <w:t xml:space="preserve"> = T × cos θ và lực nhổ T</w:t>
+      </w:r>
+      <w:r>
+        <w:rPr>
+          <w:rFonts w:ascii="Times New Roman" w:cs="Times New Roman" w:eastAsia="Times New Roman" w:hAnsi="Times New Roman"/>
+          <w:noProof/>
+          <w:sz w:val="24"/>
+          <w:szCs w:val="24"/>
+          <w:vertAlign w:val="subscript"/>
+          <w:lang w:val="vi-VN"/>
+        </w:rPr>
+        <w:t xml:space="preserve">v</w:t>
+      </w:r>
+      <w:r>
+        <w:rPr>
+          <w:rFonts w:ascii="Times New Roman" w:cs="Times New Roman" w:eastAsia="Times New Roman" w:hAnsi="Times New Roman"/>
+          <w:noProof/>
+          <w:sz w:val="24"/>
+          <w:szCs w:val="24"/>
+          <w:lang w:val="vi-VN"/>
+        </w:rPr>
+        <w:t xml:space="preserve"> = T × sin θ, θ là góc dốc của dây (tan θ = chênh cao bích bè – chốt đế / khoảng cách ngang): dây thoải khi nước thấp (trượt chi phối), dốc khi nước cao (nhổ, lật chi phối).</w:t>
+      </w:r>
+    </w:p>
+    <w:p>
+      <w:pPr>
+        <w:pStyle w:val="ListParagraph"/>
+        <w:numPr>
+          <w:ilvl w:val="0"/>
+          <w:numId w:val="1"/>
+        </w:numPr>
+        <w:spacing w:after="60"/>
+      </w:pPr>
+      <w:r>
+        <w:rPr>
+          <w:rFonts w:ascii="Times New Roman" w:cs="Times New Roman" w:eastAsia="Times New Roman" w:hAnsi="Times New Roman"/>
+          <w:noProof/>
+          <w:sz w:val="24"/>
+          <w:szCs w:val="24"/>
+          <w:lang w:val="vi-VN"/>
+        </w:rPr>
+        <w:t xml:space="preserve">Tổ hợp chi phối: cả hai dây căng (MN cao). Lực nhổ T</w:t>
+      </w:r>
+      <w:r>
+        <w:rPr>
+          <w:rFonts w:ascii="Times New Roman" w:cs="Times New Roman" w:eastAsia="Times New Roman" w:hAnsi="Times New Roman"/>
+          <w:noProof/>
+          <w:sz w:val="24"/>
+          <w:szCs w:val="24"/>
+          <w:vertAlign w:val="subscript"/>
+          <w:lang w:val="vi-VN"/>
+        </w:rPr>
+        <w:t xml:space="preserve">v</w:t>
+      </w:r>
+      <w:r>
+        <w:rPr>
+          <w:rFonts w:ascii="Times New Roman" w:cs="Times New Roman" w:eastAsia="Times New Roman" w:hAnsi="Times New Roman"/>
+          <w:noProof/>
+          <w:sz w:val="24"/>
+          <w:szCs w:val="24"/>
+          <w:lang w:val="vi-VN"/>
+        </w:rPr>
+        <w:t xml:space="preserve"> = 65,3 kN (hai dây cộng lại), lực ngang T</w:t>
+      </w:r>
+      <w:r>
+        <w:rPr>
+          <w:rFonts w:ascii="Times New Roman" w:cs="Times New Roman" w:eastAsia="Times New Roman" w:hAnsi="Times New Roman"/>
+          <w:noProof/>
+          <w:sz w:val="24"/>
+          <w:szCs w:val="24"/>
+          <w:vertAlign w:val="subscript"/>
+          <w:lang w:val="vi-VN"/>
+        </w:rPr>
+        <w:t xml:space="preserve">h</w:t>
+      </w:r>
+      <w:r>
+        <w:rPr>
+          <w:rFonts w:ascii="Times New Roman" w:cs="Times New Roman" w:eastAsia="Times New Roman" w:hAnsi="Times New Roman"/>
+          <w:noProof/>
+          <w:sz w:val="24"/>
+          <w:szCs w:val="24"/>
+          <w:lang w:val="vi-VN"/>
+        </w:rPr>
+        <w:t xml:space="preserve"> = 12,0 kN (cộng véc-tơ).</w:t>
+      </w:r>
+    </w:p>
+    <w:p>
+      <w:pPr>
+        <w:pStyle w:val="ListParagraph"/>
+        <w:numPr>
+          <w:ilvl w:val="0"/>
+          <w:numId w:val="1"/>
+        </w:numPr>
+        <w:spacing w:after="60"/>
+      </w:pPr>
+      <w:r>
+        <w:rPr>
+          <w:rFonts w:ascii="Times New Roman" w:cs="Times New Roman" w:eastAsia="Times New Roman" w:hAnsi="Times New Roman"/>
+          <w:noProof/>
+          <w:sz w:val="24"/>
+          <w:szCs w:val="24"/>
+          <w:lang w:val="vi-VN"/>
+        </w:rPr>
+        <w:t xml:space="preserve">Đế 2,75 × 2,75 × 0,4 m: thể tích 3,03 m³, nặng 75,6 kN trên cạn, W' = 3,03 × (25 − 10) = 45,4 kN trong nước (đã trừ lực đẩy nổi).</w:t>
+      </w:r>
+    </w:p>
+    <w:p>
+      <w:pPr>
+        <w:pStyle w:val="ListParagraph"/>
+        <w:numPr>
+          <w:ilvl w:val="0"/>
+          <w:numId w:val="1"/>
+        </w:numPr>
+        <w:spacing w:after="60"/>
+      </w:pPr>
+      <w:r>
+        <w:rPr>
+          <w:rFonts w:ascii="Times New Roman" w:cs="Times New Roman" w:eastAsia="Times New Roman" w:hAnsi="Times New Roman"/>
+          <w:noProof/>
+          <w:sz w:val="24"/>
+          <w:szCs w:val="24"/>
+          <w:lang w:val="vi-VN"/>
+        </w:rPr>
+        <w:t xml:space="preserve">SV-1 nhổ: T</w:t>
+      </w:r>
+      <w:r>
+        <w:rPr>
+          <w:rFonts w:ascii="Times New Roman" w:cs="Times New Roman" w:eastAsia="Times New Roman" w:hAnsi="Times New Roman"/>
+          <w:noProof/>
+          <w:sz w:val="24"/>
+          <w:szCs w:val="24"/>
+          <w:vertAlign w:val="subscript"/>
+          <w:lang w:val="vi-VN"/>
+        </w:rPr>
+        <w:t xml:space="preserve">v</w:t>
+      </w:r>
+      <w:r>
+        <w:rPr>
+          <w:rFonts w:ascii="Times New Roman" w:cs="Times New Roman" w:eastAsia="Times New Roman" w:hAnsi="Times New Roman"/>
+          <w:noProof/>
+          <w:sz w:val="24"/>
+          <w:szCs w:val="24"/>
+          <w:lang w:val="vi-VN"/>
+        </w:rPr>
+        <w:t xml:space="preserve"> ≤ 0,9 × W' + 4 × Q</w:t>
+      </w:r>
+      <w:r>
+        <w:rPr>
+          <w:rFonts w:ascii="Times New Roman" w:cs="Times New Roman" w:eastAsia="Times New Roman" w:hAnsi="Times New Roman"/>
+          <w:noProof/>
+          <w:sz w:val="24"/>
+          <w:szCs w:val="24"/>
+          <w:vertAlign w:val="subscript"/>
+          <w:lang w:val="vi-VN"/>
+        </w:rPr>
+        <w:t xml:space="preserve">a</w:t>
+      </w:r>
+      <w:r>
+        <w:rPr>
+          <w:rFonts w:ascii="Times New Roman" w:cs="Times New Roman" w:eastAsia="Times New Roman" w:hAnsi="Times New Roman"/>
+          <w:noProof/>
+          <w:sz w:val="24"/>
+          <w:szCs w:val="24"/>
+          <w:lang w:val="vi-VN"/>
+        </w:rPr>
+        <w:t xml:space="preserve"> = 72,5 kN; mức sử dụng 0,90.</w:t>
+      </w:r>
+    </w:p>
+    <w:p>
+      <w:pPr>
+        <w:pStyle w:val="ListParagraph"/>
+        <w:numPr>
+          <w:ilvl w:val="0"/>
+          <w:numId w:val="1"/>
+        </w:numPr>
+        <w:spacing w:after="60"/>
+      </w:pPr>
+      <w:r>
+        <w:rPr>
+          <w:rFonts w:ascii="Times New Roman" w:cs="Times New Roman" w:eastAsia="Times New Roman" w:hAnsi="Times New Roman"/>
+          <w:noProof/>
+          <w:sz w:val="24"/>
+          <w:szCs w:val="24"/>
+          <w:lang w:val="vi-VN"/>
+        </w:rPr>
+        <w:t xml:space="preserve">SV-2 trượt: 1,5 × T</w:t>
+      </w:r>
+      <w:r>
+        <w:rPr>
+          <w:rFonts w:ascii="Times New Roman" w:cs="Times New Roman" w:eastAsia="Times New Roman" w:hAnsi="Times New Roman"/>
+          <w:noProof/>
+          <w:sz w:val="24"/>
+          <w:szCs w:val="24"/>
+          <w:vertAlign w:val="subscript"/>
+          <w:lang w:val="vi-VN"/>
+        </w:rPr>
+        <w:t xml:space="preserve">h</w:t>
+      </w:r>
+      <w:r>
+        <w:rPr>
+          <w:rFonts w:ascii="Times New Roman" w:cs="Times New Roman" w:eastAsia="Times New Roman" w:hAnsi="Times New Roman"/>
+          <w:noProof/>
+          <w:sz w:val="24"/>
+          <w:szCs w:val="24"/>
+          <w:lang w:val="vi-VN"/>
+        </w:rPr>
+        <w:t xml:space="preserve"> ≤ bám dính đáy + gờ + 4 × H</w:t>
+      </w:r>
+      <w:r>
+        <w:rPr>
+          <w:rFonts w:ascii="Times New Roman" w:cs="Times New Roman" w:eastAsia="Times New Roman" w:hAnsi="Times New Roman"/>
+          <w:noProof/>
+          <w:sz w:val="24"/>
+          <w:szCs w:val="24"/>
+          <w:vertAlign w:val="subscript"/>
+          <w:lang w:val="vi-VN"/>
+        </w:rPr>
+        <w:t xml:space="preserve">u</w:t>
+      </w:r>
+      <w:r>
+        <w:rPr>
+          <w:rFonts w:ascii="Times New Roman" w:cs="Times New Roman" w:eastAsia="Times New Roman" w:hAnsi="Times New Roman"/>
+          <w:noProof/>
+          <w:sz w:val="24"/>
+          <w:szCs w:val="24"/>
+          <w:lang w:val="vi-VN"/>
+        </w:rPr>
+        <w:t xml:space="preserve">. Bám dính đáy = 0,5 × c</w:t>
+      </w:r>
+      <w:r>
+        <w:rPr>
+          <w:rFonts w:ascii="Times New Roman" w:cs="Times New Roman" w:eastAsia="Times New Roman" w:hAnsi="Times New Roman"/>
+          <w:noProof/>
+          <w:sz w:val="24"/>
+          <w:szCs w:val="24"/>
+          <w:vertAlign w:val="subscript"/>
+          <w:lang w:val="vi-VN"/>
+        </w:rPr>
+        <w:t xml:space="preserve">u</w:t>
+      </w:r>
+      <w:r>
+        <w:rPr>
+          <w:rFonts w:ascii="Times New Roman" w:cs="Times New Roman" w:eastAsia="Times New Roman" w:hAnsi="Times New Roman"/>
+          <w:noProof/>
+          <w:sz w:val="24"/>
+          <w:szCs w:val="24"/>
+          <w:lang w:val="vi-VN"/>
+        </w:rPr>
+        <w:t xml:space="preserve"> × B² = 0,0 kN (lấy bằng 0 khi T</w:t>
+      </w:r>
+      <w:r>
+        <w:rPr>
+          <w:rFonts w:ascii="Times New Roman" w:cs="Times New Roman" w:eastAsia="Times New Roman" w:hAnsi="Times New Roman"/>
+          <w:noProof/>
+          <w:sz w:val="24"/>
+          <w:szCs w:val="24"/>
+          <w:vertAlign w:val="subscript"/>
+          <w:lang w:val="vi-VN"/>
+        </w:rPr>
+        <w:t xml:space="preserve">v</w:t>
+      </w:r>
+      <w:r>
+        <w:rPr>
+          <w:rFonts w:ascii="Times New Roman" w:cs="Times New Roman" w:eastAsia="Times New Roman" w:hAnsi="Times New Roman"/>
+          <w:noProof/>
+          <w:sz w:val="24"/>
+          <w:szCs w:val="24"/>
+          <w:lang w:val="vi-VN"/>
+        </w:rPr>
+        <w:t xml:space="preserve"> &gt; W': đế bị nhấc khỏi bùn); gờ sâu z = 0,15 m: B × (0,5 × γ' × z² + 2 × c</w:t>
+      </w:r>
+      <w:r>
+        <w:rPr>
+          <w:rFonts w:ascii="Times New Roman" w:cs="Times New Roman" w:eastAsia="Times New Roman" w:hAnsi="Times New Roman"/>
+          <w:noProof/>
+          <w:sz w:val="24"/>
+          <w:szCs w:val="24"/>
+          <w:vertAlign w:val="subscript"/>
+          <w:lang w:val="vi-VN"/>
+        </w:rPr>
+        <w:t xml:space="preserve">u</w:t>
+      </w:r>
+      <w:r>
+        <w:rPr>
+          <w:rFonts w:ascii="Times New Roman" w:cs="Times New Roman" w:eastAsia="Times New Roman" w:hAnsi="Times New Roman"/>
+          <w:noProof/>
+          <w:sz w:val="24"/>
+          <w:szCs w:val="24"/>
+          <w:lang w:val="vi-VN"/>
+        </w:rPr>
+        <w:t xml:space="preserve"> × z) = 16,7 kN; H</w:t>
+      </w:r>
+      <w:r>
+        <w:rPr>
+          <w:rFonts w:ascii="Times New Roman" w:cs="Times New Roman" w:eastAsia="Times New Roman" w:hAnsi="Times New Roman"/>
+          <w:noProof/>
+          <w:sz w:val="24"/>
+          <w:szCs w:val="24"/>
+          <w:vertAlign w:val="subscript"/>
+          <w:lang w:val="vi-VN"/>
+        </w:rPr>
+        <w:t xml:space="preserve">u</w:t>
+      </w:r>
+      <w:r>
+        <w:rPr>
+          <w:rFonts w:ascii="Times New Roman" w:cs="Times New Roman" w:eastAsia="Times New Roman" w:hAnsi="Times New Roman"/>
+          <w:noProof/>
+          <w:sz w:val="24"/>
+          <w:szCs w:val="24"/>
+          <w:lang w:val="vi-VN"/>
+        </w:rPr>
+        <w:t xml:space="preserve"> một vít = 15,0 kN (Broms, đầu tự do ở mặt bùn). 1,5 × 12,0 = 18,1 ≤ 76,6 kN; mức sử dụng 0,61.</w:t>
+      </w:r>
+    </w:p>
+    <w:p>
+      <w:pPr>
+        <w:pStyle w:val="ListParagraph"/>
+        <w:numPr>
+          <w:ilvl w:val="0"/>
+          <w:numId w:val="1"/>
+        </w:numPr>
+        <w:spacing w:after="60"/>
+      </w:pPr>
+      <w:r>
+        <w:rPr>
+          <w:rFonts w:ascii="Times New Roman" w:cs="Times New Roman" w:eastAsia="Times New Roman" w:hAnsi="Times New Roman"/>
+          <w:noProof/>
+          <w:sz w:val="24"/>
+          <w:szCs w:val="24"/>
+          <w:lang w:val="vi-VN"/>
+        </w:rPr>
+        <w:t xml:space="preserve">SV-3 lật quanh mép đáy phía xa dây: M</w:t>
+      </w:r>
+      <w:r>
+        <w:rPr>
+          <w:rFonts w:ascii="Times New Roman" w:cs="Times New Roman" w:eastAsia="Times New Roman" w:hAnsi="Times New Roman"/>
+          <w:noProof/>
+          <w:sz w:val="24"/>
+          <w:szCs w:val="24"/>
+          <w:vertAlign w:val="subscript"/>
+          <w:lang w:val="vi-VN"/>
+        </w:rPr>
+        <w:t xml:space="preserve">lật</w:t>
+      </w:r>
+      <w:r>
+        <w:rPr>
+          <w:rFonts w:ascii="Times New Roman" w:cs="Times New Roman" w:eastAsia="Times New Roman" w:hAnsi="Times New Roman"/>
+          <w:noProof/>
+          <w:sz w:val="24"/>
+          <w:szCs w:val="24"/>
+          <w:lang w:val="vi-VN"/>
+        </w:rPr>
+        <w:t xml:space="preserve"> = T</w:t>
+      </w:r>
+      <w:r>
+        <w:rPr>
+          <w:rFonts w:ascii="Times New Roman" w:cs="Times New Roman" w:eastAsia="Times New Roman" w:hAnsi="Times New Roman"/>
+          <w:noProof/>
+          <w:sz w:val="24"/>
+          <w:szCs w:val="24"/>
+          <w:vertAlign w:val="subscript"/>
+          <w:lang w:val="vi-VN"/>
+        </w:rPr>
+        <w:t xml:space="preserve">h</w:t>
+      </w:r>
+      <w:r>
+        <w:rPr>
+          <w:rFonts w:ascii="Times New Roman" w:cs="Times New Roman" w:eastAsia="Times New Roman" w:hAnsi="Times New Roman"/>
+          <w:noProof/>
+          <w:sz w:val="24"/>
+          <w:szCs w:val="24"/>
+          <w:lang w:val="vi-VN"/>
+        </w:rPr>
+        <w:t xml:space="preserve"> × (t + h</w:t>
+      </w:r>
+      <w:r>
+        <w:rPr>
+          <w:rFonts w:ascii="Times New Roman" w:cs="Times New Roman" w:eastAsia="Times New Roman" w:hAnsi="Times New Roman"/>
+          <w:noProof/>
+          <w:sz w:val="24"/>
+          <w:szCs w:val="24"/>
+          <w:vertAlign w:val="subscript"/>
+          <w:lang w:val="vi-VN"/>
+        </w:rPr>
+        <w:t xml:space="preserve">tai</w:t>
+      </w:r>
+      <w:r>
+        <w:rPr>
+          <w:rFonts w:ascii="Times New Roman" w:cs="Times New Roman" w:eastAsia="Times New Roman" w:hAnsi="Times New Roman"/>
+          <w:noProof/>
+          <w:sz w:val="24"/>
+          <w:szCs w:val="24"/>
+          <w:lang w:val="vi-VN"/>
+        </w:rPr>
+        <w:t xml:space="preserve">) + T</w:t>
+      </w:r>
+      <w:r>
+        <w:rPr>
+          <w:rFonts w:ascii="Times New Roman" w:cs="Times New Roman" w:eastAsia="Times New Roman" w:hAnsi="Times New Roman"/>
+          <w:noProof/>
+          <w:sz w:val="24"/>
+          <w:szCs w:val="24"/>
+          <w:vertAlign w:val="subscript"/>
+          <w:lang w:val="vi-VN"/>
+        </w:rPr>
+        <w:t xml:space="preserve">v</w:t>
+      </w:r>
+      <w:r>
+        <w:rPr>
+          <w:rFonts w:ascii="Times New Roman" w:cs="Times New Roman" w:eastAsia="Times New Roman" w:hAnsi="Times New Roman"/>
+          <w:noProof/>
+          <w:sz w:val="24"/>
+          <w:szCs w:val="24"/>
+          <w:lang w:val="vi-VN"/>
+        </w:rPr>
+        <w:t xml:space="preserve"> × B / 2 = 12,0 × (0,4 + 0,15) + 65,3 × 2,75 / 2 = 96,4 kNm; M</w:t>
+      </w:r>
+      <w:r>
+        <w:rPr>
+          <w:rFonts w:ascii="Times New Roman" w:cs="Times New Roman" w:eastAsia="Times New Roman" w:hAnsi="Times New Roman"/>
+          <w:noProof/>
+          <w:sz w:val="24"/>
+          <w:szCs w:val="24"/>
+          <w:vertAlign w:val="subscript"/>
+          <w:lang w:val="vi-VN"/>
+        </w:rPr>
+        <w:t xml:space="preserve">giữ</w:t>
+      </w:r>
+      <w:r>
+        <w:rPr>
+          <w:rFonts w:ascii="Times New Roman" w:cs="Times New Roman" w:eastAsia="Times New Roman" w:hAnsi="Times New Roman"/>
+          <w:noProof/>
+          <w:sz w:val="24"/>
+          <w:szCs w:val="24"/>
+          <w:lang w:val="vi-VN"/>
+        </w:rPr>
+        <w:t xml:space="preserve"> = W' × B / 2 + (n/2) × Q</w:t>
+      </w:r>
+      <w:r>
+        <w:rPr>
+          <w:rFonts w:ascii="Times New Roman" w:cs="Times New Roman" w:eastAsia="Times New Roman" w:hAnsi="Times New Roman"/>
+          <w:noProof/>
+          <w:sz w:val="24"/>
+          <w:szCs w:val="24"/>
+          <w:vertAlign w:val="subscript"/>
+          <w:lang w:val="vi-VN"/>
+        </w:rPr>
+        <w:t xml:space="preserve">u</w:t>
+      </w:r>
+      <w:r>
+        <w:rPr>
+          <w:rFonts w:ascii="Times New Roman" w:cs="Times New Roman" w:eastAsia="Times New Roman" w:hAnsi="Times New Roman"/>
+          <w:noProof/>
+          <w:sz w:val="24"/>
+          <w:szCs w:val="24"/>
+          <w:lang w:val="vi-VN"/>
+        </w:rPr>
+        <w:t xml:space="preserve"> × (B − c) + (n/2) × Q</w:t>
+      </w:r>
+      <w:r>
+        <w:rPr>
+          <w:rFonts w:ascii="Times New Roman" w:cs="Times New Roman" w:eastAsia="Times New Roman" w:hAnsi="Times New Roman"/>
+          <w:noProof/>
+          <w:sz w:val="24"/>
+          <w:szCs w:val="24"/>
+          <w:vertAlign w:val="subscript"/>
+          <w:lang w:val="vi-VN"/>
+        </w:rPr>
+        <w:t xml:space="preserve">u</w:t>
+      </w:r>
+      <w:r>
+        <w:rPr>
+          <w:rFonts w:ascii="Times New Roman" w:cs="Times New Roman" w:eastAsia="Times New Roman" w:hAnsi="Times New Roman"/>
+          <w:noProof/>
+          <w:sz w:val="24"/>
+          <w:szCs w:val="24"/>
+          <w:lang w:val="vi-VN"/>
+        </w:rPr>
+        <w:t xml:space="preserve"> × c = 149,5 kNm (c = 0,15 m từ mép đế tới tim lỗ vít). 1,5 × 96,4 = 144,6 ≤ 149,5 kNm; mức sử dụng 0,97.</w:t>
+      </w:r>
+    </w:p>
+    <w:p>
+      <w:pPr>
+        <w:pStyle w:val="ListParagraph"/>
+        <w:numPr>
+          <w:ilvl w:val="0"/>
+          <w:numId w:val="1"/>
+        </w:numPr>
+        <w:spacing w:after="60"/>
+      </w:pPr>
+      <w:r>
+        <w:rPr>
+          <w:rFonts w:ascii="Times New Roman" w:cs="Times New Roman" w:eastAsia="Times New Roman" w:hAnsi="Times New Roman"/>
+          <w:noProof/>
+          <w:sz w:val="24"/>
+          <w:szCs w:val="24"/>
+          <w:lang w:val="vi-VN"/>
+        </w:rPr>
+        <w:t xml:space="preserve">SV-4 một vít: lực nhổ lên vít chịu nặng nhất N</w:t>
+      </w:r>
+      <w:r>
+        <w:rPr>
+          <w:rFonts w:ascii="Times New Roman" w:cs="Times New Roman" w:eastAsia="Times New Roman" w:hAnsi="Times New Roman"/>
+          <w:noProof/>
+          <w:sz w:val="24"/>
+          <w:szCs w:val="24"/>
+          <w:vertAlign w:val="subscript"/>
+          <w:lang w:val="vi-VN"/>
+        </w:rPr>
         <w:t xml:space="preserve">1</w:t>
       </w:r>
       <w:r>
@@ -1407,7 +2155,7 @@
           <w:szCs w:val="24"/>
           <w:lang w:val="vi-VN"/>
         </w:rPr>
-        <w:t xml:space="preserve"> = 7,7 kN ≤ Q</w:t>
+        <w:t xml:space="preserve"> = max[(T</w:t>
       </w:r>
       <w:r>
         <w:rPr>
@@ -1418,6 +2166,48 @@
           <w:vertAlign w:val="subscript"/>
           <w:lang w:val="vi-VN"/>
         </w:rPr>
+        <w:t xml:space="preserve">v</w:t>
+      </w:r>
+      <w:r>
+        <w:rPr>
+          <w:rFonts w:ascii="Times New Roman" w:cs="Times New Roman" w:eastAsia="Times New Roman" w:hAnsi="Times New Roman"/>
+          <w:noProof/>
+          <w:sz w:val="24"/>
+          <w:szCs w:val="24"/>
+          <w:lang w:val="vi-VN"/>
+        </w:rPr>
+        <w:t xml:space="preserve"> − 0,9 × W') / n ; (M</w:t>
+      </w:r>
+      <w:r>
+        <w:rPr>
+          <w:rFonts w:ascii="Times New Roman" w:cs="Times New Roman" w:eastAsia="Times New Roman" w:hAnsi="Times New Roman"/>
+          <w:noProof/>
+          <w:sz w:val="24"/>
+          <w:szCs w:val="24"/>
+          <w:vertAlign w:val="subscript"/>
+          <w:lang w:val="vi-VN"/>
+        </w:rPr>
+        <w:t xml:space="preserve">lật</w:t>
+      </w:r>
+      <w:r>
+        <w:rPr>
+          <w:rFonts w:ascii="Times New Roman" w:cs="Times New Roman" w:eastAsia="Times New Roman" w:hAnsi="Times New Roman"/>
+          <w:noProof/>
+          <w:sz w:val="24"/>
+          <w:szCs w:val="24"/>
+          <w:lang w:val="vi-VN"/>
+        </w:rPr>
+        <w:t xml:space="preserve"> − 0,9 × W' × B / 2) / (B − c) / (n/2)] = 7,7 kN ≤ Q</w:t>
+      </w:r>
+      <w:r>
+        <w:rPr>
+          <w:rFonts w:ascii="Times New Roman" w:cs="Times New Roman" w:eastAsia="Times New Roman" w:hAnsi="Times New Roman"/>
+          <w:noProof/>
+          <w:sz w:val="24"/>
+          <w:szCs w:val="24"/>
+          <w:vertAlign w:val="subscript"/>
+          <w:lang w:val="vi-VN"/>
+        </w:rPr>
         <w:t xml:space="preserve">a</w:t>
       </w:r>
       <w:r>
@@ -1428,7 +2218,152 @@
           <w:szCs w:val="24"/>
           <w:lang w:val="vi-VN"/>
         </w:rPr>
-        <w:t xml:space="preserve">; mức sử dụng 0,98. SV-5 nền: 0,15. SV-6 thép bản (lưới Ø12 a200, hai lớp): 0,62.</w:t>
+        <w:t xml:space="preserve"> = 7,9 kN; mức sử dụng 0,98.</w:t>
+      </w:r>
+    </w:p>
+    <w:p>
+      <w:pPr>
+        <w:pStyle w:val="ListParagraph"/>
+        <w:numPr>
+          <w:ilvl w:val="0"/>
+          <w:numId w:val="1"/>
+        </w:numPr>
+        <w:spacing w:after="60"/>
+      </w:pPr>
+      <w:r>
+        <w:rPr>
+          <w:rFonts w:ascii="Times New Roman" w:cs="Times New Roman" w:eastAsia="Times New Roman" w:hAnsi="Times New Roman"/>
+          <w:noProof/>
+          <w:sz w:val="24"/>
+          <w:szCs w:val="24"/>
+          <w:lang w:val="vi-VN"/>
+        </w:rPr>
+        <w:t xml:space="preserve">SV-5 áp lực lên nền bùn: W' / B² = 6,0 kPa ≤ 5,14 × c</w:t>
+      </w:r>
+      <w:r>
+        <w:rPr>
+          <w:rFonts w:ascii="Times New Roman" w:cs="Times New Roman" w:eastAsia="Times New Roman" w:hAnsi="Times New Roman"/>
+          <w:noProof/>
+          <w:sz w:val="24"/>
+          <w:szCs w:val="24"/>
+          <w:vertAlign w:val="subscript"/>
+          <w:lang w:val="vi-VN"/>
+        </w:rPr>
+        <w:t xml:space="preserve">u</w:t>
+      </w:r>
+      <w:r>
+        <w:rPr>
+          <w:rFonts w:ascii="Times New Roman" w:cs="Times New Roman" w:eastAsia="Times New Roman" w:hAnsi="Times New Roman"/>
+          <w:noProof/>
+          <w:sz w:val="24"/>
+          <w:szCs w:val="24"/>
+          <w:lang w:val="vi-VN"/>
+        </w:rPr>
+        <w:t xml:space="preserve"> / 2,5 = 41,1 kPa (sức chịu tải giới hạn của nền sét mềm); mức sử dụng 0,15.</w:t>
+      </w:r>
+    </w:p>
+    <w:p>
+      <w:pPr>
+        <w:pStyle w:val="ListParagraph"/>
+        <w:numPr>
+          <w:ilvl w:val="0"/>
+          <w:numId w:val="1"/>
+        </w:numPr>
+        <w:spacing w:after="60"/>
+      </w:pPr>
+      <w:r>
+        <w:rPr>
+          <w:rFonts w:ascii="Times New Roman" w:cs="Times New Roman" w:eastAsia="Times New Roman" w:hAnsi="Times New Roman"/>
+          <w:noProof/>
+          <w:sz w:val="24"/>
+          <w:szCs w:val="24"/>
+          <w:lang w:val="vi-VN"/>
+        </w:rPr>
+        <w:t xml:space="preserve">SV-6 thép bản đế: tai neo kéo lên ở giữa, 4 vít giữ ở các góc; mô-men trên 1 m bản M = (n/2) × Q</w:t>
+      </w:r>
+      <w:r>
+        <w:rPr>
+          <w:rFonts w:ascii="Times New Roman" w:cs="Times New Roman" w:eastAsia="Times New Roman" w:hAnsi="Times New Roman"/>
+          <w:noProof/>
+          <w:sz w:val="24"/>
+          <w:szCs w:val="24"/>
+          <w:vertAlign w:val="subscript"/>
+          <w:lang w:val="vi-VN"/>
+        </w:rPr>
+        <w:t xml:space="preserve">u</w:t>
+      </w:r>
+      <w:r>
+        <w:rPr>
+          <w:rFonts w:ascii="Times New Roman" w:cs="Times New Roman" w:eastAsia="Times New Roman" w:hAnsi="Times New Roman"/>
+          <w:noProof/>
+          <w:sz w:val="24"/>
+          <w:szCs w:val="24"/>
+          <w:lang w:val="vi-VN"/>
+        </w:rPr>
+        <w:t xml:space="preserve"> × (s/2) / B = 14,11 kNm/m (s = B − 2c); thép cần A</w:t>
+      </w:r>
+      <w:r>
+        <w:rPr>
+          <w:rFonts w:ascii="Times New Roman" w:cs="Times New Roman" w:eastAsia="Times New Roman" w:hAnsi="Times New Roman"/>
+          <w:noProof/>
+          <w:sz w:val="24"/>
+          <w:szCs w:val="24"/>
+          <w:vertAlign w:val="subscript"/>
+          <w:lang w:val="vi-VN"/>
+        </w:rPr>
+        <w:t xml:space="preserve">s</w:t>
+      </w:r>
+      <w:r>
+        <w:rPr>
+          <w:rFonts w:ascii="Times New Roman" w:cs="Times New Roman" w:eastAsia="Times New Roman" w:hAnsi="Times New Roman"/>
+          <w:noProof/>
+          <w:sz w:val="24"/>
+          <w:szCs w:val="24"/>
+          <w:lang w:val="vi-VN"/>
+        </w:rPr>
+        <w:t xml:space="preserve"> = M / (0,9 × h</w:t>
+      </w:r>
+      <w:r>
+        <w:rPr>
+          <w:rFonts w:ascii="Times New Roman" w:cs="Times New Roman" w:eastAsia="Times New Roman" w:hAnsi="Times New Roman"/>
+          <w:noProof/>
+          <w:sz w:val="24"/>
+          <w:szCs w:val="24"/>
+          <w:vertAlign w:val="subscript"/>
+          <w:lang w:val="vi-VN"/>
+        </w:rPr>
+        <w:t xml:space="preserve">0</w:t>
+      </w:r>
+      <w:r>
+        <w:rPr>
+          <w:rFonts w:ascii="Times New Roman" w:cs="Times New Roman" w:eastAsia="Times New Roman" w:hAnsi="Times New Roman"/>
+          <w:noProof/>
+          <w:sz w:val="24"/>
+          <w:szCs w:val="24"/>
+          <w:lang w:val="vi-VN"/>
+        </w:rPr>
+        <w:t xml:space="preserve"> × R</w:t>
+      </w:r>
+      <w:r>
+        <w:rPr>
+          <w:rFonts w:ascii="Times New Roman" w:cs="Times New Roman" w:eastAsia="Times New Roman" w:hAnsi="Times New Roman"/>
+          <w:noProof/>
+          <w:sz w:val="24"/>
+          <w:szCs w:val="24"/>
+          <w:vertAlign w:val="subscript"/>
+          <w:lang w:val="vi-VN"/>
+        </w:rPr>
+        <w:t xml:space="preserve">s</w:t>
+      </w:r>
+      <w:r>
+        <w:rPr>
+          <w:rFonts w:ascii="Times New Roman" w:cs="Times New Roman" w:eastAsia="Times New Roman" w:hAnsi="Times New Roman"/>
+          <w:noProof/>
+          <w:sz w:val="24"/>
+          <w:szCs w:val="24"/>
+          <w:lang w:val="vi-VN"/>
+        </w:rPr>
+        <w:t xml:space="preserve">) = 172 mm²/m, tối thiểu 0,1% = 350 mm²/m; bố trí lưới Ø12 a200 hai lớp = 565 mm²/m; mức sử dụng 0,62.</w:t>
       </w:r>
     </w:p>
     <w:p>

</xml_diff>

<commit_message>
feat: thuyet minh muc 9 - giai thich tung dong bang hang muc kiem tra (ca hai ho)
- Moi dong C1..C12, BP-1..5, SV-1..6: cong thuc, y nghia ky hieu, ket qua be vi du;
  dong "khong ap dung" ghi ro ly do cho phuong an coc khoan nhoi + de vit xoan
- So thap phan kieu Viet Nam trong muc 9

Co-Authored-By: Claude Opus 5.5 (1M context) <noreply@anthropic.com>
</commit_message>
<xml_diff>
--- a/docs/mat-bang-neo-9-be/THUYET_MINH_TINH_TOAN.docx
+++ b/docs/mat-bang-neo-9-be/THUYET_MINH_TINH_TOAN.docx
@@ -2725,6 +2725,2185 @@
           <w:lang w:val="vi-VN"/>
         </w:rPr>
         <w:t xml:space="preserve">Lớp bê tông bảo vệ cọc bờ tới đai chỉ 26–30 mm (tính với 50 mm tới tim thép chủ).</w:t>
+      </w:r>
+    </w:p>
+    <w:p>
+      <w:pPr>
+        <w:pStyle w:val="Heading2"/>
+        <w:keepNext/>
+        <w:spacing w:after="100" w:before="240"/>
+      </w:pPr>
+      <w:r>
+        <w:rPr>
+          <w:rFonts w:ascii="Times New Roman" w:cs="Times New Roman" w:eastAsia="Times New Roman" w:hAnsi="Times New Roman"/>
+          <w:b/>
+          <w:bCs/>
+          <w:noProof/>
+          <w:sz w:val="26"/>
+          <w:szCs w:val="26"/>
+          <w:lang w:val="vi-VN"/>
+        </w:rPr>
+        <w:t xml:space="preserve">9. Giải thích bảng hạng mục kiểm tra (ví dụ BÈ 3A)</w:t>
+      </w:r>
+    </w:p>
+    <w:p>
+      <w:pPr>
+        <w:pStyle w:val="ListParagraph"/>
+        <w:numPr>
+          <w:ilvl w:val="0"/>
+          <w:numId w:val="1"/>
+        </w:numPr>
+        <w:spacing w:after="60"/>
+      </w:pPr>
+      <w:r>
+        <w:rPr>
+          <w:rFonts w:ascii="Times New Roman" w:cs="Times New Roman" w:eastAsia="Times New Roman" w:hAnsi="Times New Roman"/>
+          <w:noProof/>
+          <w:sz w:val="24"/>
+          <w:szCs w:val="24"/>
+          <w:lang w:val="vi-VN"/>
+        </w:rPr>
+        <w:t xml:space="preserve">Mỗi dòng của bảng kiểm tra trên web: công thức, ý nghĩa các ký hiệu và kết quả của bè ví dụ. Mức sử dụng = tải trọng phải chịu / khả năng chịu (đã chia hệ số an toàn): ≤ 1,00 là đạt. Dòng "KHÔNG ÁP DỤNG" là phép kiểm của loại neo khác, không dùng cho phương án cọc khoan nhồi + đế vít xoắn.</w:t>
+      </w:r>
+    </w:p>
+    <w:p>
+      <w:pPr>
+        <w:pStyle w:val="ListParagraph"/>
+        <w:numPr>
+          <w:ilvl w:val="0"/>
+          <w:numId w:val="1"/>
+        </w:numPr>
+        <w:spacing w:after="60"/>
+      </w:pPr>
+      <w:r>
+        <w:rPr>
+          <w:rFonts w:ascii="Times New Roman" w:cs="Times New Roman" w:eastAsia="Times New Roman" w:hAnsi="Times New Roman"/>
+          <w:noProof/>
+          <w:sz w:val="24"/>
+          <w:szCs w:val="24"/>
+          <w:lang w:val="vi-VN"/>
+        </w:rPr>
+        <w:t xml:space="preserve">C1 — Sức giữ neo (nguyên vẹn): SF = R</w:t>
+      </w:r>
+      <w:r>
+        <w:rPr>
+          <w:rFonts w:ascii="Times New Roman" w:cs="Times New Roman" w:eastAsia="Times New Roman" w:hAnsi="Times New Roman"/>
+          <w:noProof/>
+          <w:sz w:val="24"/>
+          <w:szCs w:val="24"/>
+          <w:vertAlign w:val="subscript"/>
+          <w:lang w:val="vi-VN"/>
+        </w:rPr>
+        <w:t xml:space="preserve">total</w:t>
+      </w:r>
+      <w:r>
+        <w:rPr>
+          <w:rFonts w:ascii="Times New Roman" w:cs="Times New Roman" w:eastAsia="Times New Roman" w:hAnsi="Times New Roman"/>
+          <w:noProof/>
+          <w:sz w:val="24"/>
+          <w:szCs w:val="24"/>
+          <w:lang w:val="vi-VN"/>
+        </w:rPr>
+        <w:t xml:space="preserve"> / H</w:t>
+      </w:r>
+      <w:r>
+        <w:rPr>
+          <w:rFonts w:ascii="Times New Roman" w:cs="Times New Roman" w:eastAsia="Times New Roman" w:hAnsi="Times New Roman"/>
+          <w:noProof/>
+          <w:sz w:val="24"/>
+          <w:szCs w:val="24"/>
+          <w:vertAlign w:val="subscript"/>
+          <w:lang w:val="vi-VN"/>
+        </w:rPr>
+        <w:t xml:space="preserve">line</w:t>
+      </w:r>
+      <w:r>
+        <w:rPr>
+          <w:rFonts w:ascii="Times New Roman" w:cs="Times New Roman" w:eastAsia="Times New Roman" w:hAnsi="Times New Roman"/>
+          <w:noProof/>
+          <w:sz w:val="24"/>
+          <w:szCs w:val="24"/>
+          <w:lang w:val="vi-VN"/>
+        </w:rPr>
+        <w:t xml:space="preserve"> ≥ [SF]. R</w:t>
+      </w:r>
+      <w:r>
+        <w:rPr>
+          <w:rFonts w:ascii="Times New Roman" w:cs="Times New Roman" w:eastAsia="Times New Roman" w:hAnsi="Times New Roman"/>
+          <w:noProof/>
+          <w:sz w:val="24"/>
+          <w:szCs w:val="24"/>
+          <w:vertAlign w:val="subscript"/>
+          <w:lang w:val="vi-VN"/>
+        </w:rPr>
+        <w:t xml:space="preserve">total</w:t>
+      </w:r>
+      <w:r>
+        <w:rPr>
+          <w:rFonts w:ascii="Times New Roman" w:cs="Times New Roman" w:eastAsia="Times New Roman" w:hAnsi="Times New Roman"/>
+          <w:noProof/>
+          <w:sz w:val="24"/>
+          <w:szCs w:val="24"/>
+          <w:lang w:val="vi-VN"/>
+        </w:rPr>
+        <w:t xml:space="preserve"> là tổng sức giữ của các neo, H</w:t>
+      </w:r>
+      <w:r>
+        <w:rPr>
+          <w:rFonts w:ascii="Times New Roman" w:cs="Times New Roman" w:eastAsia="Times New Roman" w:hAnsi="Times New Roman"/>
+          <w:noProof/>
+          <w:sz w:val="24"/>
+          <w:szCs w:val="24"/>
+          <w:vertAlign w:val="subscript"/>
+          <w:lang w:val="vi-VN"/>
+        </w:rPr>
+        <w:t xml:space="preserve">line</w:t>
+      </w:r>
+      <w:r>
+        <w:rPr>
+          <w:rFonts w:ascii="Times New Roman" w:cs="Times New Roman" w:eastAsia="Times New Roman" w:hAnsi="Times New Roman"/>
+          <w:noProof/>
+          <w:sz w:val="24"/>
+          <w:szCs w:val="24"/>
+          <w:lang w:val="vi-VN"/>
+        </w:rPr>
+        <w:t xml:space="preserve"> là lực ngang trong dây; [SF] là hệ số an toàn yêu cầu. Dùng cho neo thả kéo lê trên đáy (neo cày, khối thả). Kết quả BÈ 3A: KHÔNG ÁP DỤNG — hệ này không dùng neo thả: sức giữ là của cọc bờ (BP-1, BP-2) và đế vít xoắn (SV-1…SV-6).</w:t>
+      </w:r>
+    </w:p>
+    <w:p>
+      <w:pPr>
+        <w:pStyle w:val="ListParagraph"/>
+        <w:numPr>
+          <w:ilvl w:val="0"/>
+          <w:numId w:val="1"/>
+        </w:numPr>
+        <w:spacing w:after="60"/>
+      </w:pPr>
+      <w:r>
+        <w:rPr>
+          <w:rFonts w:ascii="Times New Roman" w:cs="Times New Roman" w:eastAsia="Times New Roman" w:hAnsi="Times New Roman"/>
+          <w:noProof/>
+          <w:sz w:val="24"/>
+          <w:szCs w:val="24"/>
+          <w:lang w:val="vi-VN"/>
+        </w:rPr>
+        <w:t xml:space="preserve">C2 — Bền dây/xích neo (nguyên vẹn): SF = MBL / T</w:t>
+      </w:r>
+      <w:r>
+        <w:rPr>
+          <w:rFonts w:ascii="Times New Roman" w:cs="Times New Roman" w:eastAsia="Times New Roman" w:hAnsi="Times New Roman"/>
+          <w:noProof/>
+          <w:sz w:val="24"/>
+          <w:szCs w:val="24"/>
+          <w:vertAlign w:val="subscript"/>
+          <w:lang w:val="vi-VN"/>
+        </w:rPr>
+        <w:t xml:space="preserve">max</w:t>
+      </w:r>
+      <w:r>
+        <w:rPr>
+          <w:rFonts w:ascii="Times New Roman" w:cs="Times New Roman" w:eastAsia="Times New Roman" w:hAnsi="Times New Roman"/>
+          <w:noProof/>
+          <w:sz w:val="24"/>
+          <w:szCs w:val="24"/>
+          <w:lang w:val="vi-VN"/>
+        </w:rPr>
+        <w:t xml:space="preserve"> ≥ [SF]. MBL là lực kéo đứt nhỏ nhất của cáp (nhà sản xuất công bố), T</w:t>
+      </w:r>
+      <w:r>
+        <w:rPr>
+          <w:rFonts w:ascii="Times New Roman" w:cs="Times New Roman" w:eastAsia="Times New Roman" w:hAnsi="Times New Roman"/>
+          <w:noProof/>
+          <w:sz w:val="24"/>
+          <w:szCs w:val="24"/>
+          <w:vertAlign w:val="subscript"/>
+          <w:lang w:val="vi-VN"/>
+        </w:rPr>
+        <w:t xml:space="preserve">max</w:t>
+      </w:r>
+      <w:r>
+        <w:rPr>
+          <w:rFonts w:ascii="Times New Roman" w:cs="Times New Roman" w:eastAsia="Times New Roman" w:hAnsi="Times New Roman"/>
+          <w:noProof/>
+          <w:sz w:val="24"/>
+          <w:szCs w:val="24"/>
+          <w:lang w:val="vi-VN"/>
+        </w:rPr>
+        <w:t xml:space="preserve"> là lực lớn nhất một dây phải chịu (mô hình cân bằng, đã cộng lực căng trước); [SF] = 3 khi đủ dây. Kết quả BÈ 3A: ĐẠT: giá trị 3,16, yêu cầu 3, mức sử dụng 0,95.</w:t>
+      </w:r>
+    </w:p>
+    <w:p>
+      <w:pPr>
+        <w:pStyle w:val="ListParagraph"/>
+        <w:numPr>
+          <w:ilvl w:val="0"/>
+          <w:numId w:val="1"/>
+        </w:numPr>
+        <w:spacing w:after="60"/>
+      </w:pPr>
+      <w:r>
+        <w:rPr>
+          <w:rFonts w:ascii="Times New Roman" w:cs="Times New Roman" w:eastAsia="Times New Roman" w:hAnsi="Times New Roman"/>
+          <w:noProof/>
+          <w:sz w:val="24"/>
+          <w:szCs w:val="24"/>
+          <w:lang w:val="vi-VN"/>
+        </w:rPr>
+        <w:t xml:space="preserve">C3 — Không nhổ neo (chiều dài dây nằm đáy): L</w:t>
+      </w:r>
+      <w:r>
+        <w:rPr>
+          <w:rFonts w:ascii="Times New Roman" w:cs="Times New Roman" w:eastAsia="Times New Roman" w:hAnsi="Times New Roman"/>
+          <w:noProof/>
+          <w:sz w:val="24"/>
+          <w:szCs w:val="24"/>
+          <w:vertAlign w:val="subscript"/>
+          <w:lang w:val="vi-VN"/>
+        </w:rPr>
+        <w:t xml:space="preserve">ground</w:t>
+      </w:r>
+      <w:r>
+        <w:rPr>
+          <w:rFonts w:ascii="Times New Roman" w:cs="Times New Roman" w:eastAsia="Times New Roman" w:hAnsi="Times New Roman"/>
+          <w:noProof/>
+          <w:sz w:val="24"/>
+          <w:szCs w:val="24"/>
+          <w:lang w:val="vi-VN"/>
+        </w:rPr>
+        <w:t xml:space="preserve"> ≥ L</w:t>
+      </w:r>
+      <w:r>
+        <w:rPr>
+          <w:rFonts w:ascii="Times New Roman" w:cs="Times New Roman" w:eastAsia="Times New Roman" w:hAnsi="Times New Roman"/>
+          <w:noProof/>
+          <w:sz w:val="24"/>
+          <w:szCs w:val="24"/>
+          <w:vertAlign w:val="subscript"/>
+          <w:lang w:val="vi-VN"/>
+        </w:rPr>
+        <w:t xml:space="preserve">ground</w:t>
+      </w:r>
+      <w:r>
+        <w:rPr>
+          <w:rFonts w:ascii="Times New Roman" w:cs="Times New Roman" w:eastAsia="Times New Roman" w:hAnsi="Times New Roman"/>
+          <w:noProof/>
+          <w:sz w:val="24"/>
+          <w:szCs w:val="24"/>
+          <w:lang w:val="vi-VN"/>
+        </w:rPr>
+        <w:t xml:space="preserve">,min. L</w:t>
+      </w:r>
+      <w:r>
+        <w:rPr>
+          <w:rFonts w:ascii="Times New Roman" w:cs="Times New Roman" w:eastAsia="Times New Roman" w:hAnsi="Times New Roman"/>
+          <w:noProof/>
+          <w:sz w:val="24"/>
+          <w:szCs w:val="24"/>
+          <w:vertAlign w:val="subscript"/>
+          <w:lang w:val="vi-VN"/>
+        </w:rPr>
+        <w:t xml:space="preserve">ground</w:t>
+      </w:r>
+      <w:r>
+        <w:rPr>
+          <w:rFonts w:ascii="Times New Roman" w:cs="Times New Roman" w:eastAsia="Times New Roman" w:hAnsi="Times New Roman"/>
+          <w:noProof/>
+          <w:sz w:val="24"/>
+          <w:szCs w:val="24"/>
+          <w:lang w:val="vi-VN"/>
+        </w:rPr>
+        <w:t xml:space="preserve"> là chiều dài xích / cáp nằm trên đáy trước neo, L</w:t>
+      </w:r>
+      <w:r>
+        <w:rPr>
+          <w:rFonts w:ascii="Times New Roman" w:cs="Times New Roman" w:eastAsia="Times New Roman" w:hAnsi="Times New Roman"/>
+          <w:noProof/>
+          <w:sz w:val="24"/>
+          <w:szCs w:val="24"/>
+          <w:vertAlign w:val="subscript"/>
+          <w:lang w:val="vi-VN"/>
+        </w:rPr>
+        <w:t xml:space="preserve">ground</w:t>
+      </w:r>
+      <w:r>
+        <w:rPr>
+          <w:rFonts w:ascii="Times New Roman" w:cs="Times New Roman" w:eastAsia="Times New Roman" w:hAnsi="Times New Roman"/>
+          <w:noProof/>
+          <w:sz w:val="24"/>
+          <w:szCs w:val="24"/>
+          <w:lang w:val="vi-VN"/>
+        </w:rPr>
+        <w:t xml:space="preserve">,min là chiều dài tối thiểu để neo kéo lê không bị nhấc lên. Dùng cho neo thả. Kết quả BÈ 3A: KHÔNG ÁP DỤNG — cọc và đế chịu được lực nhổ (kiểm ở SV-1, SV-4), không cần đoạn dây nằm trên đáy.</w:t>
+      </w:r>
+    </w:p>
+    <w:p>
+      <w:pPr>
+        <w:pStyle w:val="ListParagraph"/>
+        <w:numPr>
+          <w:ilvl w:val="0"/>
+          <w:numId w:val="1"/>
+        </w:numPr>
+        <w:spacing w:after="60"/>
+      </w:pPr>
+      <w:r>
+        <w:rPr>
+          <w:rFonts w:ascii="Times New Roman" w:cs="Times New Roman" w:eastAsia="Times New Roman" w:hAnsi="Times New Roman"/>
+          <w:noProof/>
+          <w:sz w:val="24"/>
+          <w:szCs w:val="24"/>
+          <w:lang w:val="vi-VN"/>
+        </w:rPr>
+        <w:t xml:space="preserve">C4 — Tỷ lệ chiều dài dây / chiều sâu nước (Scope ratio): L</w:t>
+      </w:r>
+      <w:r>
+        <w:rPr>
+          <w:rFonts w:ascii="Times New Roman" w:cs="Times New Roman" w:eastAsia="Times New Roman" w:hAnsi="Times New Roman"/>
+          <w:noProof/>
+          <w:sz w:val="24"/>
+          <w:szCs w:val="24"/>
+          <w:vertAlign w:val="subscript"/>
+          <w:lang w:val="vi-VN"/>
+        </w:rPr>
+        <w:t xml:space="preserve">total</w:t>
+      </w:r>
+      <w:r>
+        <w:rPr>
+          <w:rFonts w:ascii="Times New Roman" w:cs="Times New Roman" w:eastAsia="Times New Roman" w:hAnsi="Times New Roman"/>
+          <w:noProof/>
+          <w:sz w:val="24"/>
+          <w:szCs w:val="24"/>
+          <w:lang w:val="vi-VN"/>
+        </w:rPr>
+        <w:t xml:space="preserve"> / d ≥ [scope]. L</w:t>
+      </w:r>
+      <w:r>
+        <w:rPr>
+          <w:rFonts w:ascii="Times New Roman" w:cs="Times New Roman" w:eastAsia="Times New Roman" w:hAnsi="Times New Roman"/>
+          <w:noProof/>
+          <w:sz w:val="24"/>
+          <w:szCs w:val="24"/>
+          <w:vertAlign w:val="subscript"/>
+          <w:lang w:val="vi-VN"/>
+        </w:rPr>
+        <w:t xml:space="preserve">total</w:t>
+      </w:r>
+      <w:r>
+        <w:rPr>
+          <w:rFonts w:ascii="Times New Roman" w:cs="Times New Roman" w:eastAsia="Times New Roman" w:hAnsi="Times New Roman"/>
+          <w:noProof/>
+          <w:sz w:val="24"/>
+          <w:szCs w:val="24"/>
+          <w:lang w:val="vi-VN"/>
+        </w:rPr>
+        <w:t xml:space="preserve"> là chiều dài dây, d là chiều sâu nước; tỷ lệ [scope] (thường ≥ 5) bảo đảm dây xích đủ thoải cho neo thả. Kết quả BÈ 3A: KHÔNG ÁP DỤNG — dây căng thẳng tới cọc / đế, chiều dài dây do mặt bằng quyết định.</w:t>
+      </w:r>
+    </w:p>
+    <w:p>
+      <w:pPr>
+        <w:pStyle w:val="ListParagraph"/>
+        <w:numPr>
+          <w:ilvl w:val="0"/>
+          <w:numId w:val="1"/>
+        </w:numPr>
+        <w:spacing w:after="60"/>
+      </w:pPr>
+      <w:r>
+        <w:rPr>
+          <w:rFonts w:ascii="Times New Roman" w:cs="Times New Roman" w:eastAsia="Times New Roman" w:hAnsi="Times New Roman"/>
+          <w:noProof/>
+          <w:sz w:val="24"/>
+          <w:szCs w:val="24"/>
+          <w:lang w:val="vi-VN"/>
+        </w:rPr>
+        <w:t xml:space="preserve">C5 — Sức giữ neo (khi đứt 1 dây): SF = R</w:t>
+      </w:r>
+      <w:r>
+        <w:rPr>
+          <w:rFonts w:ascii="Times New Roman" w:cs="Times New Roman" w:eastAsia="Times New Roman" w:hAnsi="Times New Roman"/>
+          <w:noProof/>
+          <w:sz w:val="24"/>
+          <w:szCs w:val="24"/>
+          <w:vertAlign w:val="subscript"/>
+          <w:lang w:val="vi-VN"/>
+        </w:rPr>
+        <w:t xml:space="preserve">total</w:t>
+      </w:r>
+      <w:r>
+        <w:rPr>
+          <w:rFonts w:ascii="Times New Roman" w:cs="Times New Roman" w:eastAsia="Times New Roman" w:hAnsi="Times New Roman"/>
+          <w:noProof/>
+          <w:sz w:val="24"/>
+          <w:szCs w:val="24"/>
+          <w:lang w:val="vi-VN"/>
+        </w:rPr>
+        <w:t xml:space="preserve"> / H</w:t>
+      </w:r>
+      <w:r>
+        <w:rPr>
+          <w:rFonts w:ascii="Times New Roman" w:cs="Times New Roman" w:eastAsia="Times New Roman" w:hAnsi="Times New Roman"/>
+          <w:noProof/>
+          <w:sz w:val="24"/>
+          <w:szCs w:val="24"/>
+          <w:vertAlign w:val="subscript"/>
+          <w:lang w:val="vi-VN"/>
+        </w:rPr>
+        <w:t xml:space="preserve">line</w:t>
+      </w:r>
+      <w:r>
+        <w:rPr>
+          <w:rFonts w:ascii="Times New Roman" w:cs="Times New Roman" w:eastAsia="Times New Roman" w:hAnsi="Times New Roman"/>
+          <w:noProof/>
+          <w:sz w:val="24"/>
+          <w:szCs w:val="24"/>
+          <w:lang w:val="vi-VN"/>
+        </w:rPr>
+        <w:t xml:space="preserve">,dam ≥ [SF]. Như C1 nhưng với lực ngang H</w:t>
+      </w:r>
+      <w:r>
+        <w:rPr>
+          <w:rFonts w:ascii="Times New Roman" w:cs="Times New Roman" w:eastAsia="Times New Roman" w:hAnsi="Times New Roman"/>
+          <w:noProof/>
+          <w:sz w:val="24"/>
+          <w:szCs w:val="24"/>
+          <w:vertAlign w:val="subscript"/>
+          <w:lang w:val="vi-VN"/>
+        </w:rPr>
+        <w:t xml:space="preserve">line</w:t>
+      </w:r>
+      <w:r>
+        <w:rPr>
+          <w:rFonts w:ascii="Times New Roman" w:cs="Times New Roman" w:eastAsia="Times New Roman" w:hAnsi="Times New Roman"/>
+          <w:noProof/>
+          <w:sz w:val="24"/>
+          <w:szCs w:val="24"/>
+          <w:lang w:val="vi-VN"/>
+        </w:rPr>
+        <w:t xml:space="preserve">,dam khi đứt một dây. Kết quả BÈ 3A: KHÔNG ÁP DỤNG — hệ này không dùng neo thả: sức giữ là của cọc bờ (BP-1, BP-2) và đế vít xoắn (SV-1…SV-6).</w:t>
+      </w:r>
+    </w:p>
+    <w:p>
+      <w:pPr>
+        <w:pStyle w:val="ListParagraph"/>
+        <w:numPr>
+          <w:ilvl w:val="0"/>
+          <w:numId w:val="1"/>
+        </w:numPr>
+        <w:spacing w:after="60"/>
+      </w:pPr>
+      <w:r>
+        <w:rPr>
+          <w:rFonts w:ascii="Times New Roman" w:cs="Times New Roman" w:eastAsia="Times New Roman" w:hAnsi="Times New Roman"/>
+          <w:noProof/>
+          <w:sz w:val="24"/>
+          <w:szCs w:val="24"/>
+          <w:lang w:val="vi-VN"/>
+        </w:rPr>
+        <w:t xml:space="preserve">C6 — Bền dây/xích neo (khi đứt 1 dây): SF = MBL / T</w:t>
+      </w:r>
+      <w:r>
+        <w:rPr>
+          <w:rFonts w:ascii="Times New Roman" w:cs="Times New Roman" w:eastAsia="Times New Roman" w:hAnsi="Times New Roman"/>
+          <w:noProof/>
+          <w:sz w:val="24"/>
+          <w:szCs w:val="24"/>
+          <w:vertAlign w:val="subscript"/>
+          <w:lang w:val="vi-VN"/>
+        </w:rPr>
+        <w:t xml:space="preserve">max</w:t>
+      </w:r>
+      <w:r>
+        <w:rPr>
+          <w:rFonts w:ascii="Times New Roman" w:cs="Times New Roman" w:eastAsia="Times New Roman" w:hAnsi="Times New Roman"/>
+          <w:noProof/>
+          <w:sz w:val="24"/>
+          <w:szCs w:val="24"/>
+          <w:lang w:val="vi-VN"/>
+        </w:rPr>
+        <w:t xml:space="preserve">,dam ≥ [SF]. Như C2 nhưng T</w:t>
+      </w:r>
+      <w:r>
+        <w:rPr>
+          <w:rFonts w:ascii="Times New Roman" w:cs="Times New Roman" w:eastAsia="Times New Roman" w:hAnsi="Times New Roman"/>
+          <w:noProof/>
+          <w:sz w:val="24"/>
+          <w:szCs w:val="24"/>
+          <w:vertAlign w:val="subscript"/>
+          <w:lang w:val="vi-VN"/>
+        </w:rPr>
+        <w:t xml:space="preserve">max</w:t>
+      </w:r>
+      <w:r>
+        <w:rPr>
+          <w:rFonts w:ascii="Times New Roman" w:cs="Times New Roman" w:eastAsia="Times New Roman" w:hAnsi="Times New Roman"/>
+          <w:noProof/>
+          <w:sz w:val="24"/>
+          <w:szCs w:val="24"/>
+          <w:lang w:val="vi-VN"/>
+        </w:rPr>
+        <w:t xml:space="preserve">,dam là lực lớn nhất trong các dây còn lại khi dây chịu lực lớn nhất bị đứt (tính lại ở mọi mực nước); [SF] = 2. Kết quả BÈ 3A: ĐẠT: giá trị 3,12, yêu cầu 2, mức sử dụng 0,64.</w:t>
+      </w:r>
+    </w:p>
+    <w:p>
+      <w:pPr>
+        <w:pStyle w:val="ListParagraph"/>
+        <w:numPr>
+          <w:ilvl w:val="0"/>
+          <w:numId w:val="1"/>
+        </w:numPr>
+        <w:spacing w:after="60"/>
+      </w:pPr>
+      <w:r>
+        <w:rPr>
+          <w:rFonts w:ascii="Times New Roman" w:cs="Times New Roman" w:eastAsia="Times New Roman" w:hAnsi="Times New Roman"/>
+          <w:noProof/>
+          <w:sz w:val="24"/>
+          <w:szCs w:val="24"/>
+          <w:lang w:val="vi-VN"/>
+        </w:rPr>
+        <w:t xml:space="preserve">C7 — Độ thiếu chiều dài dây neo: X</w:t>
+      </w:r>
+      <w:r>
+        <w:rPr>
+          <w:rFonts w:ascii="Times New Roman" w:cs="Times New Roman" w:eastAsia="Times New Roman" w:hAnsi="Times New Roman"/>
+          <w:noProof/>
+          <w:sz w:val="24"/>
+          <w:szCs w:val="24"/>
+          <w:vertAlign w:val="subscript"/>
+          <w:lang w:val="vi-VN"/>
+        </w:rPr>
+        <w:t xml:space="preserve">deficit</w:t>
+      </w:r>
+      <w:r>
+        <w:rPr>
+          <w:rFonts w:ascii="Times New Roman" w:cs="Times New Roman" w:eastAsia="Times New Roman" w:hAnsi="Times New Roman"/>
+          <w:noProof/>
+          <w:sz w:val="24"/>
+          <w:szCs w:val="24"/>
+          <w:lang w:val="vi-VN"/>
+        </w:rPr>
+        <w:t xml:space="preserve"> ≤ [maxOffset]. X</w:t>
+      </w:r>
+      <w:r>
+        <w:rPr>
+          <w:rFonts w:ascii="Times New Roman" w:cs="Times New Roman" w:eastAsia="Times New Roman" w:hAnsi="Times New Roman"/>
+          <w:noProof/>
+          <w:sz w:val="24"/>
+          <w:szCs w:val="24"/>
+          <w:vertAlign w:val="subscript"/>
+          <w:lang w:val="vi-VN"/>
+        </w:rPr>
+        <w:t xml:space="preserve">deficit</w:t>
+      </w:r>
+      <w:r>
+        <w:rPr>
+          <w:rFonts w:ascii="Times New Roman" w:cs="Times New Roman" w:eastAsia="Times New Roman" w:hAnsi="Times New Roman"/>
+          <w:noProof/>
+          <w:sz w:val="24"/>
+          <w:szCs w:val="24"/>
+          <w:lang w:val="vi-VN"/>
+        </w:rPr>
+        <w:t xml:space="preserve"> là phần dây còn thiếu so với chiều dài cần của dây xích chùng (đường dây xích) ở độ trôi cho phép [maxOffset]. Kết quả BÈ 3A: KHÔNG ÁP DỤNG — không có đoạn dây xích dự trữ; cáp cắt theo bảng chiều dài cắt cáp (mục 7).</w:t>
+      </w:r>
+    </w:p>
+    <w:p>
+      <w:pPr>
+        <w:pStyle w:val="ListParagraph"/>
+        <w:numPr>
+          <w:ilvl w:val="0"/>
+          <w:numId w:val="1"/>
+        </w:numPr>
+        <w:spacing w:after="60"/>
+      </w:pPr>
+      <w:r>
+        <w:rPr>
+          <w:rFonts w:ascii="Times New Roman" w:cs="Times New Roman" w:eastAsia="Times New Roman" w:hAnsi="Times New Roman"/>
+          <w:noProof/>
+          <w:sz w:val="24"/>
+          <w:szCs w:val="24"/>
+          <w:lang w:val="vi-VN"/>
+        </w:rPr>
+        <w:t xml:space="preserve">C8 — Khoảng hở an toàn đáy bè – đáy hồ: Clearance = h</w:t>
+      </w:r>
+      <w:r>
+        <w:rPr>
+          <w:rFonts w:ascii="Times New Roman" w:cs="Times New Roman" w:eastAsia="Times New Roman" w:hAnsi="Times New Roman"/>
+          <w:noProof/>
+          <w:sz w:val="24"/>
+          <w:szCs w:val="24"/>
+          <w:vertAlign w:val="subscript"/>
+          <w:lang w:val="vi-VN"/>
+        </w:rPr>
+        <w:t xml:space="preserve">nước</w:t>
+      </w:r>
+      <w:r>
+        <w:rPr>
+          <w:rFonts w:ascii="Times New Roman" w:cs="Times New Roman" w:eastAsia="Times New Roman" w:hAnsi="Times New Roman"/>
+          <w:noProof/>
+          <w:sz w:val="24"/>
+          <w:szCs w:val="24"/>
+          <w:lang w:val="vi-VN"/>
+        </w:rPr>
+        <w:t xml:space="preserve"> − mớn nước bè ≥ [min]. h</w:t>
+      </w:r>
+      <w:r>
+        <w:rPr>
+          <w:rFonts w:ascii="Times New Roman" w:cs="Times New Roman" w:eastAsia="Times New Roman" w:hAnsi="Times New Roman"/>
+          <w:noProof/>
+          <w:sz w:val="24"/>
+          <w:szCs w:val="24"/>
+          <w:vertAlign w:val="subscript"/>
+          <w:lang w:val="vi-VN"/>
+        </w:rPr>
+        <w:t xml:space="preserve">nước</w:t>
+      </w:r>
+      <w:r>
+        <w:rPr>
+          <w:rFonts w:ascii="Times New Roman" w:cs="Times New Roman" w:eastAsia="Times New Roman" w:hAnsi="Times New Roman"/>
+          <w:noProof/>
+          <w:sz w:val="24"/>
+          <w:szCs w:val="24"/>
+          <w:lang w:val="vi-VN"/>
+        </w:rPr>
+        <w:t xml:space="preserve"> là chiều sâu nước dưới bè ở độ sâu thiết kế, mớn nước là phần bè chìm dưới nước; [min] là khoảng hở tối thiểu để đáy bè không chạm đáy hồ. Kết quả BÈ 3A: ĐẠT: giá trị 6,00 m, yêu cầu ≥ 1,5 m, mức sử dụng 0,25. Khoảng hở khi hồ xuống MNC: xem mục 4.</w:t>
+      </w:r>
+    </w:p>
+    <w:p>
+      <w:pPr>
+        <w:pStyle w:val="ListParagraph"/>
+        <w:numPr>
+          <w:ilvl w:val="0"/>
+          <w:numId w:val="1"/>
+        </w:numPr>
+        <w:spacing w:after="60"/>
+      </w:pPr>
+      <w:r>
+        <w:rPr>
+          <w:rFonts w:ascii="Times New Roman" w:cs="Times New Roman" w:eastAsia="Times New Roman" w:hAnsi="Times New Roman"/>
+          <w:noProof/>
+          <w:sz w:val="24"/>
+          <w:szCs w:val="24"/>
+          <w:lang w:val="vi-VN"/>
+        </w:rPr>
+        <w:t xml:space="preserve">C9 — Khoảng cách trung bình giữa các dây neo: P</w:t>
+      </w:r>
+      <w:r>
+        <w:rPr>
+          <w:rFonts w:ascii="Times New Roman" w:cs="Times New Roman" w:eastAsia="Times New Roman" w:hAnsi="Times New Roman"/>
+          <w:noProof/>
+          <w:sz w:val="24"/>
+          <w:szCs w:val="24"/>
+          <w:vertAlign w:val="subscript"/>
+          <w:lang w:val="vi-VN"/>
+        </w:rPr>
+        <w:t xml:space="preserve">bè</w:t>
+      </w:r>
+      <w:r>
+        <w:rPr>
+          <w:rFonts w:ascii="Times New Roman" w:cs="Times New Roman" w:eastAsia="Times New Roman" w:hAnsi="Times New Roman"/>
+          <w:noProof/>
+          <w:sz w:val="24"/>
+          <w:szCs w:val="24"/>
+          <w:lang w:val="vi-VN"/>
+        </w:rPr>
+        <w:t xml:space="preserve"> / N</w:t>
+      </w:r>
+      <w:r>
+        <w:rPr>
+          <w:rFonts w:ascii="Times New Roman" w:cs="Times New Roman" w:eastAsia="Times New Roman" w:hAnsi="Times New Roman"/>
+          <w:noProof/>
+          <w:sz w:val="24"/>
+          <w:szCs w:val="24"/>
+          <w:vertAlign w:val="subscript"/>
+          <w:lang w:val="vi-VN"/>
+        </w:rPr>
+        <w:t xml:space="preserve">dây</w:t>
+      </w:r>
+      <w:r>
+        <w:rPr>
+          <w:rFonts w:ascii="Times New Roman" w:cs="Times New Roman" w:eastAsia="Times New Roman" w:hAnsi="Times New Roman"/>
+          <w:noProof/>
+          <w:sz w:val="24"/>
+          <w:szCs w:val="24"/>
+          <w:lang w:val="vi-VN"/>
+        </w:rPr>
+        <w:t xml:space="preserve"> ≤ [maxSpacing]. P</w:t>
+      </w:r>
+      <w:r>
+        <w:rPr>
+          <w:rFonts w:ascii="Times New Roman" w:cs="Times New Roman" w:eastAsia="Times New Roman" w:hAnsi="Times New Roman"/>
+          <w:noProof/>
+          <w:sz w:val="24"/>
+          <w:szCs w:val="24"/>
+          <w:vertAlign w:val="subscript"/>
+          <w:lang w:val="vi-VN"/>
+        </w:rPr>
+        <w:t xml:space="preserve">bè</w:t>
+      </w:r>
+      <w:r>
+        <w:rPr>
+          <w:rFonts w:ascii="Times New Roman" w:cs="Times New Roman" w:eastAsia="Times New Roman" w:hAnsi="Times New Roman"/>
+          <w:noProof/>
+          <w:sz w:val="24"/>
+          <w:szCs w:val="24"/>
+          <w:lang w:val="vi-VN"/>
+        </w:rPr>
+        <w:t xml:space="preserve"> là chu vi đa giác bè đo trên mặt bằng, N</w:t>
+      </w:r>
+      <w:r>
+        <w:rPr>
+          <w:rFonts w:ascii="Times New Roman" w:cs="Times New Roman" w:eastAsia="Times New Roman" w:hAnsi="Times New Roman"/>
+          <w:noProof/>
+          <w:sz w:val="24"/>
+          <w:szCs w:val="24"/>
+          <w:vertAlign w:val="subscript"/>
+          <w:lang w:val="vi-VN"/>
+        </w:rPr>
+        <w:t xml:space="preserve">dây</w:t>
+      </w:r>
+      <w:r>
+        <w:rPr>
+          <w:rFonts w:ascii="Times New Roman" w:cs="Times New Roman" w:eastAsia="Times New Roman" w:hAnsi="Times New Roman"/>
+          <w:noProof/>
+          <w:sz w:val="24"/>
+          <w:szCs w:val="24"/>
+          <w:lang w:val="vi-VN"/>
+        </w:rPr>
+        <w:t xml:space="preserve"> là số dây neo của bè; [maxSpacing] = 15 m là yêu cầu bắt buộc để lực phân bố đều quanh bè. Kết quả BÈ 3A: ĐẠT: giá trị 12,5 m, yêu cầu ≤ 15 m, mức sử dụng 0,83.</w:t>
+      </w:r>
+    </w:p>
+    <w:p>
+      <w:pPr>
+        <w:pStyle w:val="ListParagraph"/>
+        <w:numPr>
+          <w:ilvl w:val="0"/>
+          <w:numId w:val="1"/>
+        </w:numPr>
+        <w:spacing w:after="60"/>
+      </w:pPr>
+      <w:r>
+        <w:rPr>
+          <w:rFonts w:ascii="Times New Roman" w:cs="Times New Roman" w:eastAsia="Times New Roman" w:hAnsi="Times New Roman"/>
+          <w:noProof/>
+          <w:sz w:val="24"/>
+          <w:szCs w:val="24"/>
+          <w:lang w:val="vi-VN"/>
+        </w:rPr>
+        <w:t xml:space="preserve">C12 — Độ trôi ngang của bè (cân bằng tĩnh, mọi mực nước): u</w:t>
+      </w:r>
+      <w:r>
+        <w:rPr>
+          <w:rFonts w:ascii="Times New Roman" w:cs="Times New Roman" w:eastAsia="Times New Roman" w:hAnsi="Times New Roman"/>
+          <w:noProof/>
+          <w:sz w:val="24"/>
+          <w:szCs w:val="24"/>
+          <w:vertAlign w:val="subscript"/>
+          <w:lang w:val="vi-VN"/>
+        </w:rPr>
+        <w:t xml:space="preserve">max</w:t>
+      </w:r>
+      <w:r>
+        <w:rPr>
+          <w:rFonts w:ascii="Times New Roman" w:cs="Times New Roman" w:eastAsia="Times New Roman" w:hAnsi="Times New Roman"/>
+          <w:noProof/>
+          <w:sz w:val="24"/>
+          <w:szCs w:val="24"/>
+          <w:lang w:val="vi-VN"/>
+        </w:rPr>
+        <w:t xml:space="preserve"> ≤ khe hở nhỏ nhất tới bè bên cạnh / 2. u</w:t>
+      </w:r>
+      <w:r>
+        <w:rPr>
+          <w:rFonts w:ascii="Times New Roman" w:cs="Times New Roman" w:eastAsia="Times New Roman" w:hAnsi="Times New Roman"/>
+          <w:noProof/>
+          <w:sz w:val="24"/>
+          <w:szCs w:val="24"/>
+          <w:vertAlign w:val="subscript"/>
+          <w:lang w:val="vi-VN"/>
+        </w:rPr>
+        <w:t xml:space="preserve">max</w:t>
+      </w:r>
+      <w:r>
+        <w:rPr>
+          <w:rFonts w:ascii="Times New Roman" w:cs="Times New Roman" w:eastAsia="Times New Roman" w:hAnsi="Times New Roman"/>
+          <w:noProof/>
+          <w:sz w:val="24"/>
+          <w:szCs w:val="24"/>
+          <w:lang w:val="vi-VN"/>
+        </w:rPr>
+        <w:t xml:space="preserve"> là độ trôi ngang lớn nhất của bè trong mô hình cân bằng (mọi hướng, mọi mực nước); hai bè cạnh nhau có thể cùng trôi về phía nhau nên mỗi bè chỉ được trôi nửa khe hở. Kết quả BÈ 3A: ĐẠT: giá trị 0,55 m, yêu cầu ≤ 6,86 m, mức sử dụng 0,08.</w:t>
+      </w:r>
+    </w:p>
+    <w:p>
+      <w:pPr>
+        <w:pStyle w:val="ListParagraph"/>
+        <w:numPr>
+          <w:ilvl w:val="0"/>
+          <w:numId w:val="1"/>
+        </w:numPr>
+        <w:spacing w:after="60"/>
+      </w:pPr>
+      <w:r>
+        <w:rPr>
+          <w:rFonts w:ascii="Times New Roman" w:cs="Times New Roman" w:eastAsia="Times New Roman" w:hAnsi="Times New Roman"/>
+          <w:noProof/>
+          <w:sz w:val="24"/>
+          <w:szCs w:val="24"/>
+          <w:lang w:val="vi-VN"/>
+        </w:rPr>
+        <w:t xml:space="preserve">C10 — Sức chịu tải cho phép của cọc BỜ (P</w:t>
+      </w:r>
+      <w:r>
+        <w:rPr>
+          <w:rFonts w:ascii="Times New Roman" w:cs="Times New Roman" w:eastAsia="Times New Roman" w:hAnsi="Times New Roman"/>
+          <w:noProof/>
+          <w:sz w:val="24"/>
+          <w:szCs w:val="24"/>
+          <w:vertAlign w:val="subscript"/>
+          <w:lang w:val="vi-VN"/>
+        </w:rPr>
+        <w:t xml:space="preserve">max</w:t>
+      </w:r>
+      <w:r>
+        <w:rPr>
+          <w:rFonts w:ascii="Times New Roman" w:cs="Times New Roman" w:eastAsia="Times New Roman" w:hAnsi="Times New Roman"/>
+          <w:noProof/>
+          <w:sz w:val="24"/>
+          <w:szCs w:val="24"/>
+          <w:lang w:val="vi-VN"/>
+        </w:rPr>
+        <w:t xml:space="preserve">): P</w:t>
+      </w:r>
+      <w:r>
+        <w:rPr>
+          <w:rFonts w:ascii="Times New Roman" w:cs="Times New Roman" w:eastAsia="Times New Roman" w:hAnsi="Times New Roman"/>
+          <w:noProof/>
+          <w:sz w:val="24"/>
+          <w:szCs w:val="24"/>
+          <w:vertAlign w:val="subscript"/>
+          <w:lang w:val="vi-VN"/>
+        </w:rPr>
+        <w:t xml:space="preserve">req</w:t>
+      </w:r>
+      <w:r>
+        <w:rPr>
+          <w:rFonts w:ascii="Times New Roman" w:cs="Times New Roman" w:eastAsia="Times New Roman" w:hAnsi="Times New Roman"/>
+          <w:noProof/>
+          <w:sz w:val="24"/>
+          <w:szCs w:val="24"/>
+          <w:lang w:val="vi-VN"/>
+        </w:rPr>
+        <w:t xml:space="preserve"> = T</w:t>
+      </w:r>
+      <w:r>
+        <w:rPr>
+          <w:rFonts w:ascii="Times New Roman" w:cs="Times New Roman" w:eastAsia="Times New Roman" w:hAnsi="Times New Roman"/>
+          <w:noProof/>
+          <w:sz w:val="24"/>
+          <w:szCs w:val="24"/>
+          <w:vertAlign w:val="subscript"/>
+          <w:lang w:val="vi-VN"/>
+        </w:rPr>
+        <w:t xml:space="preserve">dây</w:t>
+      </w:r>
+      <w:r>
+        <w:rPr>
+          <w:rFonts w:ascii="Times New Roman" w:cs="Times New Roman" w:eastAsia="Times New Roman" w:hAnsi="Times New Roman"/>
+          <w:noProof/>
+          <w:sz w:val="24"/>
+          <w:szCs w:val="24"/>
+          <w:lang w:val="vi-VN"/>
+        </w:rPr>
+        <w:t xml:space="preserve"> × SF ≤ P</w:t>
+      </w:r>
+      <w:r>
+        <w:rPr>
+          <w:rFonts w:ascii="Times New Roman" w:cs="Times New Roman" w:eastAsia="Times New Roman" w:hAnsi="Times New Roman"/>
+          <w:noProof/>
+          <w:sz w:val="24"/>
+          <w:szCs w:val="24"/>
+          <w:vertAlign w:val="subscript"/>
+          <w:lang w:val="vi-VN"/>
+        </w:rPr>
+        <w:t xml:space="preserve">max</w:t>
+      </w:r>
+      <w:r>
+        <w:rPr>
+          <w:rFonts w:ascii="Times New Roman" w:cs="Times New Roman" w:eastAsia="Times New Roman" w:hAnsi="Times New Roman"/>
+          <w:noProof/>
+          <w:sz w:val="24"/>
+          <w:szCs w:val="24"/>
+          <w:lang w:val="vi-VN"/>
+        </w:rPr>
+        <w:t xml:space="preserve">. P</w:t>
+      </w:r>
+      <w:r>
+        <w:rPr>
+          <w:rFonts w:ascii="Times New Roman" w:cs="Times New Roman" w:eastAsia="Times New Roman" w:hAnsi="Times New Roman"/>
+          <w:noProof/>
+          <w:sz w:val="24"/>
+          <w:szCs w:val="24"/>
+          <w:vertAlign w:val="subscript"/>
+          <w:lang w:val="vi-VN"/>
+        </w:rPr>
+        <w:t xml:space="preserve">max</w:t>
+      </w:r>
+      <w:r>
+        <w:rPr>
+          <w:rFonts w:ascii="Times New Roman" w:cs="Times New Roman" w:eastAsia="Times New Roman" w:hAnsi="Times New Roman"/>
+          <w:noProof/>
+          <w:sz w:val="24"/>
+          <w:szCs w:val="24"/>
+          <w:lang w:val="vi-VN"/>
+        </w:rPr>
+        <w:t xml:space="preserve"> là sức chịu tải cho phép của cọc bờ theo catalogue hoặc thí nghiệm thử tải; chỉ kiểm khi có nhập P</w:t>
+      </w:r>
+      <w:r>
+        <w:rPr>
+          <w:rFonts w:ascii="Times New Roman" w:cs="Times New Roman" w:eastAsia="Times New Roman" w:hAnsi="Times New Roman"/>
+          <w:noProof/>
+          <w:sz w:val="24"/>
+          <w:szCs w:val="24"/>
+          <w:vertAlign w:val="subscript"/>
+          <w:lang w:val="vi-VN"/>
+        </w:rPr>
+        <w:t xml:space="preserve">max</w:t>
+      </w:r>
+      <w:r>
+        <w:rPr>
+          <w:rFonts w:ascii="Times New Roman" w:cs="Times New Roman" w:eastAsia="Times New Roman" w:hAnsi="Times New Roman"/>
+          <w:noProof/>
+          <w:sz w:val="24"/>
+          <w:szCs w:val="24"/>
+          <w:lang w:val="vi-VN"/>
+        </w:rPr>
+        <w:t xml:space="preserve">. Kết quả BÈ 3A: KHÔNG ÁP DỤNG — chưa có catalogue hoặc thí nghiệm thử tải nên chưa có P</w:t>
+      </w:r>
+      <w:r>
+        <w:rPr>
+          <w:rFonts w:ascii="Times New Roman" w:cs="Times New Roman" w:eastAsia="Times New Roman" w:hAnsi="Times New Roman"/>
+          <w:noProof/>
+          <w:sz w:val="24"/>
+          <w:szCs w:val="24"/>
+          <w:vertAlign w:val="subscript"/>
+          <w:lang w:val="vi-VN"/>
+        </w:rPr>
+        <w:t xml:space="preserve">max</w:t>
+      </w:r>
+      <w:r>
+        <w:rPr>
+          <w:rFonts w:ascii="Times New Roman" w:cs="Times New Roman" w:eastAsia="Times New Roman" w:hAnsi="Times New Roman"/>
+          <w:noProof/>
+          <w:sz w:val="24"/>
+          <w:szCs w:val="24"/>
+          <w:lang w:val="vi-VN"/>
+        </w:rPr>
+        <w:t xml:space="preserve">; sức chịu cọc bờ đã kiểm bằng tính toán ở BP-1, BP-2.</w:t>
+      </w:r>
+    </w:p>
+    <w:p>
+      <w:pPr>
+        <w:pStyle w:val="ListParagraph"/>
+        <w:numPr>
+          <w:ilvl w:val="0"/>
+          <w:numId w:val="1"/>
+        </w:numPr>
+        <w:spacing w:after="60"/>
+      </w:pPr>
+      <w:r>
+        <w:rPr>
+          <w:rFonts w:ascii="Times New Roman" w:cs="Times New Roman" w:eastAsia="Times New Roman" w:hAnsi="Times New Roman"/>
+          <w:noProof/>
+          <w:sz w:val="24"/>
+          <w:szCs w:val="24"/>
+          <w:lang w:val="vi-VN"/>
+        </w:rPr>
+        <w:t xml:space="preserve">C11 — Sức chịu tải cho phép của cọc LÒNG HỒ (P</w:t>
+      </w:r>
+      <w:r>
+        <w:rPr>
+          <w:rFonts w:ascii="Times New Roman" w:cs="Times New Roman" w:eastAsia="Times New Roman" w:hAnsi="Times New Roman"/>
+          <w:noProof/>
+          <w:sz w:val="24"/>
+          <w:szCs w:val="24"/>
+          <w:vertAlign w:val="subscript"/>
+          <w:lang w:val="vi-VN"/>
+        </w:rPr>
+        <w:t xml:space="preserve">max</w:t>
+      </w:r>
+      <w:r>
+        <w:rPr>
+          <w:rFonts w:ascii="Times New Roman" w:cs="Times New Roman" w:eastAsia="Times New Roman" w:hAnsi="Times New Roman"/>
+          <w:noProof/>
+          <w:sz w:val="24"/>
+          <w:szCs w:val="24"/>
+          <w:lang w:val="vi-VN"/>
+        </w:rPr>
+        <w:t xml:space="preserve">): P</w:t>
+      </w:r>
+      <w:r>
+        <w:rPr>
+          <w:rFonts w:ascii="Times New Roman" w:cs="Times New Roman" w:eastAsia="Times New Roman" w:hAnsi="Times New Roman"/>
+          <w:noProof/>
+          <w:sz w:val="24"/>
+          <w:szCs w:val="24"/>
+          <w:vertAlign w:val="subscript"/>
+          <w:lang w:val="vi-VN"/>
+        </w:rPr>
+        <w:t xml:space="preserve">req</w:t>
+      </w:r>
+      <w:r>
+        <w:rPr>
+          <w:rFonts w:ascii="Times New Roman" w:cs="Times New Roman" w:eastAsia="Times New Roman" w:hAnsi="Times New Roman"/>
+          <w:noProof/>
+          <w:sz w:val="24"/>
+          <w:szCs w:val="24"/>
+          <w:lang w:val="vi-VN"/>
+        </w:rPr>
+        <w:t xml:space="preserve"> = T</w:t>
+      </w:r>
+      <w:r>
+        <w:rPr>
+          <w:rFonts w:ascii="Times New Roman" w:cs="Times New Roman" w:eastAsia="Times New Roman" w:hAnsi="Times New Roman"/>
+          <w:noProof/>
+          <w:sz w:val="24"/>
+          <w:szCs w:val="24"/>
+          <w:vertAlign w:val="subscript"/>
+          <w:lang w:val="vi-VN"/>
+        </w:rPr>
+        <w:t xml:space="preserve">dây</w:t>
+      </w:r>
+      <w:r>
+        <w:rPr>
+          <w:rFonts w:ascii="Times New Roman" w:cs="Times New Roman" w:eastAsia="Times New Roman" w:hAnsi="Times New Roman"/>
+          <w:noProof/>
+          <w:sz w:val="24"/>
+          <w:szCs w:val="24"/>
+          <w:lang w:val="vi-VN"/>
+        </w:rPr>
+        <w:t xml:space="preserve"> × SF ≤ P</w:t>
+      </w:r>
+      <w:r>
+        <w:rPr>
+          <w:rFonts w:ascii="Times New Roman" w:cs="Times New Roman" w:eastAsia="Times New Roman" w:hAnsi="Times New Roman"/>
+          <w:noProof/>
+          <w:sz w:val="24"/>
+          <w:szCs w:val="24"/>
+          <w:vertAlign w:val="subscript"/>
+          <w:lang w:val="vi-VN"/>
+        </w:rPr>
+        <w:t xml:space="preserve">max</w:t>
+      </w:r>
+      <w:r>
+        <w:rPr>
+          <w:rFonts w:ascii="Times New Roman" w:cs="Times New Roman" w:eastAsia="Times New Roman" w:hAnsi="Times New Roman"/>
+          <w:noProof/>
+          <w:sz w:val="24"/>
+          <w:szCs w:val="24"/>
+          <w:lang w:val="vi-VN"/>
+        </w:rPr>
+        <w:t xml:space="preserve">. Như C10 cho cọc đóng dưới đáy hồ (phương án PA1). Kết quả BÈ 3A: KHÔNG ÁP DỤNG — neo đáy hồ là đế BTCT + vít xoắn (SV-1…SV-6), không phải cọc đóng.</w:t>
+      </w:r>
+    </w:p>
+    <w:p>
+      <w:pPr>
+        <w:pStyle w:val="ListParagraph"/>
+        <w:numPr>
+          <w:ilvl w:val="0"/>
+          <w:numId w:val="1"/>
+        </w:numPr>
+        <w:spacing w:after="60"/>
+      </w:pPr>
+      <w:r>
+        <w:rPr>
+          <w:rFonts w:ascii="Times New Roman" w:cs="Times New Roman" w:eastAsia="Times New Roman" w:hAnsi="Times New Roman"/>
+          <w:noProof/>
+          <w:sz w:val="24"/>
+          <w:szCs w:val="24"/>
+          <w:lang w:val="vi-VN"/>
+        </w:rPr>
+        <w:t xml:space="preserve">BP-1 — Sức chịu ngang cọc neo BỜ (Broms): H</w:t>
+      </w:r>
+      <w:r>
+        <w:rPr>
+          <w:rFonts w:ascii="Times New Roman" w:cs="Times New Roman" w:eastAsia="Times New Roman" w:hAnsi="Times New Roman"/>
+          <w:noProof/>
+          <w:sz w:val="24"/>
+          <w:szCs w:val="24"/>
+          <w:vertAlign w:val="subscript"/>
+          <w:lang w:val="vi-VN"/>
+        </w:rPr>
+        <w:t xml:space="preserve">applied</w:t>
+      </w:r>
+      <w:r>
+        <w:rPr>
+          <w:rFonts w:ascii="Times New Roman" w:cs="Times New Roman" w:eastAsia="Times New Roman" w:hAnsi="Times New Roman"/>
+          <w:noProof/>
+          <w:sz w:val="24"/>
+          <w:szCs w:val="24"/>
+          <w:lang w:val="vi-VN"/>
+        </w:rPr>
+        <w:t xml:space="preserve"> / H</w:t>
+      </w:r>
+      <w:r>
+        <w:rPr>
+          <w:rFonts w:ascii="Times New Roman" w:cs="Times New Roman" w:eastAsia="Times New Roman" w:hAnsi="Times New Roman"/>
+          <w:noProof/>
+          <w:sz w:val="24"/>
+          <w:szCs w:val="24"/>
+          <w:vertAlign w:val="subscript"/>
+          <w:lang w:val="vi-VN"/>
+        </w:rPr>
+        <w:t xml:space="preserve">allow</w:t>
+      </w:r>
+      <w:r>
+        <w:rPr>
+          <w:rFonts w:ascii="Times New Roman" w:cs="Times New Roman" w:eastAsia="Times New Roman" w:hAnsi="Times New Roman"/>
+          <w:noProof/>
+          <w:sz w:val="24"/>
+          <w:szCs w:val="24"/>
+          <w:lang w:val="vi-VN"/>
+        </w:rPr>
+        <w:t xml:space="preserve"> ≤ 1,0. H</w:t>
+      </w:r>
+      <w:r>
+        <w:rPr>
+          <w:rFonts w:ascii="Times New Roman" w:cs="Times New Roman" w:eastAsia="Times New Roman" w:hAnsi="Times New Roman"/>
+          <w:noProof/>
+          <w:sz w:val="24"/>
+          <w:szCs w:val="24"/>
+          <w:vertAlign w:val="subscript"/>
+          <w:lang w:val="vi-VN"/>
+        </w:rPr>
+        <w:t xml:space="preserve">applied</w:t>
+      </w:r>
+      <w:r>
+        <w:rPr>
+          <w:rFonts w:ascii="Times New Roman" w:cs="Times New Roman" w:eastAsia="Times New Roman" w:hAnsi="Times New Roman"/>
+          <w:noProof/>
+          <w:sz w:val="24"/>
+          <w:szCs w:val="24"/>
+          <w:lang w:val="vi-VN"/>
+        </w:rPr>
+        <w:t xml:space="preserve"> là lực ngang vào một cọc (T, hoặc T / (2 × 0,9) ở điểm cọc đôi), H</w:t>
+      </w:r>
+      <w:r>
+        <w:rPr>
+          <w:rFonts w:ascii="Times New Roman" w:cs="Times New Roman" w:eastAsia="Times New Roman" w:hAnsi="Times New Roman"/>
+          <w:noProof/>
+          <w:sz w:val="24"/>
+          <w:szCs w:val="24"/>
+          <w:vertAlign w:val="subscript"/>
+          <w:lang w:val="vi-VN"/>
+        </w:rPr>
+        <w:t xml:space="preserve">allow</w:t>
+      </w:r>
+      <w:r>
+        <w:rPr>
+          <w:rFonts w:ascii="Times New Roman" w:cs="Times New Roman" w:eastAsia="Times New Roman" w:hAnsi="Times New Roman"/>
+          <w:noProof/>
+          <w:sz w:val="24"/>
+          <w:szCs w:val="24"/>
+          <w:lang w:val="vi-VN"/>
+        </w:rPr>
+        <w:t xml:space="preserve"> = H</w:t>
+      </w:r>
+      <w:r>
+        <w:rPr>
+          <w:rFonts w:ascii="Times New Roman" w:cs="Times New Roman" w:eastAsia="Times New Roman" w:hAnsi="Times New Roman"/>
+          <w:noProof/>
+          <w:sz w:val="24"/>
+          <w:szCs w:val="24"/>
+          <w:vertAlign w:val="subscript"/>
+          <w:lang w:val="vi-VN"/>
+        </w:rPr>
+        <w:t xml:space="preserve">u</w:t>
+      </w:r>
+      <w:r>
+        <w:rPr>
+          <w:rFonts w:ascii="Times New Roman" w:cs="Times New Roman" w:eastAsia="Times New Roman" w:hAnsi="Times New Roman"/>
+          <w:noProof/>
+          <w:sz w:val="24"/>
+          <w:szCs w:val="24"/>
+          <w:lang w:val="vi-VN"/>
+        </w:rPr>
+        <w:t xml:space="preserve"> / 2,5 với H</w:t>
+      </w:r>
+      <w:r>
+        <w:rPr>
+          <w:rFonts w:ascii="Times New Roman" w:cs="Times New Roman" w:eastAsia="Times New Roman" w:hAnsi="Times New Roman"/>
+          <w:noProof/>
+          <w:sz w:val="24"/>
+          <w:szCs w:val="24"/>
+          <w:vertAlign w:val="subscript"/>
+          <w:lang w:val="vi-VN"/>
+        </w:rPr>
+        <w:t xml:space="preserve">u</w:t>
+      </w:r>
+      <w:r>
+        <w:rPr>
+          <w:rFonts w:ascii="Times New Roman" w:cs="Times New Roman" w:eastAsia="Times New Roman" w:hAnsi="Times New Roman"/>
+          <w:noProof/>
+          <w:sz w:val="24"/>
+          <w:szCs w:val="24"/>
+          <w:lang w:val="vi-VN"/>
+        </w:rPr>
+        <w:t xml:space="preserve"> là sức chịu ngang giới hạn theo Broms (mục 5). Kết quả BÈ 3A: ĐẠT: giá trị 0,720, yêu cầu ≤ 1,0, mức sử dụng 0,72.</w:t>
+      </w:r>
+    </w:p>
+    <w:p>
+      <w:pPr>
+        <w:pStyle w:val="ListParagraph"/>
+        <w:numPr>
+          <w:ilvl w:val="0"/>
+          <w:numId w:val="1"/>
+        </w:numPr>
+        <w:spacing w:after="60"/>
+      </w:pPr>
+      <w:r>
+        <w:rPr>
+          <w:rFonts w:ascii="Times New Roman" w:cs="Times New Roman" w:eastAsia="Times New Roman" w:hAnsi="Times New Roman"/>
+          <w:noProof/>
+          <w:sz w:val="24"/>
+          <w:szCs w:val="24"/>
+          <w:lang w:val="vi-VN"/>
+        </w:rPr>
+        <w:t xml:space="preserve">BP-2 — Uốn tiết diện cọc BỜ (TCVN 5574:2018): γ·M</w:t>
+      </w:r>
+      <w:r>
+        <w:rPr>
+          <w:rFonts w:ascii="Times New Roman" w:cs="Times New Roman" w:eastAsia="Times New Roman" w:hAnsi="Times New Roman"/>
+          <w:noProof/>
+          <w:sz w:val="24"/>
+          <w:szCs w:val="24"/>
+          <w:vertAlign w:val="subscript"/>
+          <w:lang w:val="vi-VN"/>
+        </w:rPr>
+        <w:t xml:space="preserve">max</w:t>
+      </w:r>
+      <w:r>
+        <w:rPr>
+          <w:rFonts w:ascii="Times New Roman" w:cs="Times New Roman" w:eastAsia="Times New Roman" w:hAnsi="Times New Roman"/>
+          <w:noProof/>
+          <w:sz w:val="24"/>
+          <w:szCs w:val="24"/>
+          <w:lang w:val="vi-VN"/>
+        </w:rPr>
+        <w:t xml:space="preserve"> / M</w:t>
+      </w:r>
+      <w:r>
+        <w:rPr>
+          <w:rFonts w:ascii="Times New Roman" w:cs="Times New Roman" w:eastAsia="Times New Roman" w:hAnsi="Times New Roman"/>
+          <w:noProof/>
+          <w:sz w:val="24"/>
+          <w:szCs w:val="24"/>
+          <w:vertAlign w:val="subscript"/>
+          <w:lang w:val="vi-VN"/>
+        </w:rPr>
+        <w:t xml:space="preserve">rd</w:t>
+      </w:r>
+      <w:r>
+        <w:rPr>
+          <w:rFonts w:ascii="Times New Roman" w:cs="Times New Roman" w:eastAsia="Times New Roman" w:hAnsi="Times New Roman"/>
+          <w:noProof/>
+          <w:sz w:val="24"/>
+          <w:szCs w:val="24"/>
+          <w:lang w:val="vi-VN"/>
+        </w:rPr>
+        <w:t xml:space="preserve"> ≤ 1,0. M</w:t>
+      </w:r>
+      <w:r>
+        <w:rPr>
+          <w:rFonts w:ascii="Times New Roman" w:cs="Times New Roman" w:eastAsia="Times New Roman" w:hAnsi="Times New Roman"/>
+          <w:noProof/>
+          <w:sz w:val="24"/>
+          <w:szCs w:val="24"/>
+          <w:vertAlign w:val="subscript"/>
+          <w:lang w:val="vi-VN"/>
+        </w:rPr>
+        <w:t xml:space="preserve">max</w:t>
+      </w:r>
+      <w:r>
+        <w:rPr>
+          <w:rFonts w:ascii="Times New Roman" w:cs="Times New Roman" w:eastAsia="Times New Roman" w:hAnsi="Times New Roman"/>
+          <w:noProof/>
+          <w:sz w:val="24"/>
+          <w:szCs w:val="24"/>
+          <w:lang w:val="vi-VN"/>
+        </w:rPr>
+        <w:t xml:space="preserve"> là mô-men lớn nhất trong thân cọc, γ = 1,2 là hệ số tải trọng, M</w:t>
+      </w:r>
+      <w:r>
+        <w:rPr>
+          <w:rFonts w:ascii="Times New Roman" w:cs="Times New Roman" w:eastAsia="Times New Roman" w:hAnsi="Times New Roman"/>
+          <w:noProof/>
+          <w:sz w:val="24"/>
+          <w:szCs w:val="24"/>
+          <w:vertAlign w:val="subscript"/>
+          <w:lang w:val="vi-VN"/>
+        </w:rPr>
+        <w:t xml:space="preserve">rd</w:t>
+      </w:r>
+      <w:r>
+        <w:rPr>
+          <w:rFonts w:ascii="Times New Roman" w:cs="Times New Roman" w:eastAsia="Times New Roman" w:hAnsi="Times New Roman"/>
+          <w:noProof/>
+          <w:sz w:val="24"/>
+          <w:szCs w:val="24"/>
+          <w:lang w:val="vi-VN"/>
+        </w:rPr>
+        <w:t xml:space="preserve"> là khả năng chịu uốn của lồng thép theo TCVN 5574:2018 (mục 5). Kết quả BÈ 3A: ĐẠT: giá trị 0,924, yêu cầu ≤ 1,0, mức sử dụng 0,92.</w:t>
+      </w:r>
+    </w:p>
+    <w:p>
+      <w:pPr>
+        <w:pStyle w:val="ListParagraph"/>
+        <w:numPr>
+          <w:ilvl w:val="0"/>
+          <w:numId w:val="1"/>
+        </w:numPr>
+        <w:spacing w:after="60"/>
+      </w:pPr>
+      <w:r>
+        <w:rPr>
+          <w:rFonts w:ascii="Times New Roman" w:cs="Times New Roman" w:eastAsia="Times New Roman" w:hAnsi="Times New Roman"/>
+          <w:noProof/>
+          <w:sz w:val="24"/>
+          <w:szCs w:val="24"/>
+          <w:lang w:val="vi-VN"/>
+        </w:rPr>
+        <w:t xml:space="preserve">BP-3 — Sức chịu ngang cọc LÒNG HỒ (Cách 1): Th / H</w:t>
+      </w:r>
+      <w:r>
+        <w:rPr>
+          <w:rFonts w:ascii="Times New Roman" w:cs="Times New Roman" w:eastAsia="Times New Roman" w:hAnsi="Times New Roman"/>
+          <w:noProof/>
+          <w:sz w:val="24"/>
+          <w:szCs w:val="24"/>
+          <w:vertAlign w:val="subscript"/>
+          <w:lang w:val="vi-VN"/>
+        </w:rPr>
+        <w:t xml:space="preserve">allow</w:t>
+      </w:r>
+      <w:r>
+        <w:rPr>
+          <w:rFonts w:ascii="Times New Roman" w:cs="Times New Roman" w:eastAsia="Times New Roman" w:hAnsi="Times New Roman"/>
+          <w:noProof/>
+          <w:sz w:val="24"/>
+          <w:szCs w:val="24"/>
+          <w:lang w:val="vi-VN"/>
+        </w:rPr>
+        <w:t xml:space="preserve"> ≤ 1,0. Sức chịu ngang của cọc đóng dưới đáy hồ (phương án PA1): T</w:t>
+      </w:r>
+      <w:r>
+        <w:rPr>
+          <w:rFonts w:ascii="Times New Roman" w:cs="Times New Roman" w:eastAsia="Times New Roman" w:hAnsi="Times New Roman"/>
+          <w:noProof/>
+          <w:sz w:val="24"/>
+          <w:szCs w:val="24"/>
+          <w:vertAlign w:val="subscript"/>
+          <w:lang w:val="vi-VN"/>
+        </w:rPr>
+        <w:t xml:space="preserve">h</w:t>
+      </w:r>
+      <w:r>
+        <w:rPr>
+          <w:rFonts w:ascii="Times New Roman" w:cs="Times New Roman" w:eastAsia="Times New Roman" w:hAnsi="Times New Roman"/>
+          <w:noProof/>
+          <w:sz w:val="24"/>
+          <w:szCs w:val="24"/>
+          <w:lang w:val="vi-VN"/>
+        </w:rPr>
+        <w:t xml:space="preserve"> lực ngang, H</w:t>
+      </w:r>
+      <w:r>
+        <w:rPr>
+          <w:rFonts w:ascii="Times New Roman" w:cs="Times New Roman" w:eastAsia="Times New Roman" w:hAnsi="Times New Roman"/>
+          <w:noProof/>
+          <w:sz w:val="24"/>
+          <w:szCs w:val="24"/>
+          <w:vertAlign w:val="subscript"/>
+          <w:lang w:val="vi-VN"/>
+        </w:rPr>
+        <w:t xml:space="preserve">allow</w:t>
+      </w:r>
+      <w:r>
+        <w:rPr>
+          <w:rFonts w:ascii="Times New Roman" w:cs="Times New Roman" w:eastAsia="Times New Roman" w:hAnsi="Times New Roman"/>
+          <w:noProof/>
+          <w:sz w:val="24"/>
+          <w:szCs w:val="24"/>
+          <w:lang w:val="vi-VN"/>
+        </w:rPr>
+        <w:t xml:space="preserve"> sức chịu cho phép. Kết quả BÈ 3A: KHÔNG ÁP DỤNG — neo đáy hồ là đế BTCT + vít xoắn (SV-1…SV-6), không phải cọc đóng.</w:t>
+      </w:r>
+    </w:p>
+    <w:p>
+      <w:pPr>
+        <w:pStyle w:val="ListParagraph"/>
+        <w:numPr>
+          <w:ilvl w:val="0"/>
+          <w:numId w:val="1"/>
+        </w:numPr>
+        <w:spacing w:after="60"/>
+      </w:pPr>
+      <w:r>
+        <w:rPr>
+          <w:rFonts w:ascii="Times New Roman" w:cs="Times New Roman" w:eastAsia="Times New Roman" w:hAnsi="Times New Roman"/>
+          <w:noProof/>
+          <w:sz w:val="24"/>
+          <w:szCs w:val="24"/>
+          <w:lang w:val="vi-VN"/>
+        </w:rPr>
+        <w:t xml:space="preserve">BP-4 — Sức chịu NHỔ cọc LÒNG HỒ (ma sát thân): Tv / Q</w:t>
+      </w:r>
+      <w:r>
+        <w:rPr>
+          <w:rFonts w:ascii="Times New Roman" w:cs="Times New Roman" w:eastAsia="Times New Roman" w:hAnsi="Times New Roman"/>
+          <w:noProof/>
+          <w:sz w:val="24"/>
+          <w:szCs w:val="24"/>
+          <w:vertAlign w:val="subscript"/>
+          <w:lang w:val="vi-VN"/>
+        </w:rPr>
+        <w:t xml:space="preserve">uplift</w:t>
+      </w:r>
+      <w:r>
+        <w:rPr>
+          <w:rFonts w:ascii="Times New Roman" w:cs="Times New Roman" w:eastAsia="Times New Roman" w:hAnsi="Times New Roman"/>
+          <w:noProof/>
+          <w:sz w:val="24"/>
+          <w:szCs w:val="24"/>
+          <w:lang w:val="vi-VN"/>
+        </w:rPr>
+        <w:t xml:space="preserve">,all ≤ 1,0. Sức chịu nhổ của cọc đóng dưới đáy hồ (PA1): T</w:t>
+      </w:r>
+      <w:r>
+        <w:rPr>
+          <w:rFonts w:ascii="Times New Roman" w:cs="Times New Roman" w:eastAsia="Times New Roman" w:hAnsi="Times New Roman"/>
+          <w:noProof/>
+          <w:sz w:val="24"/>
+          <w:szCs w:val="24"/>
+          <w:vertAlign w:val="subscript"/>
+          <w:lang w:val="vi-VN"/>
+        </w:rPr>
+        <w:t xml:space="preserve">v</w:t>
+      </w:r>
+      <w:r>
+        <w:rPr>
+          <w:rFonts w:ascii="Times New Roman" w:cs="Times New Roman" w:eastAsia="Times New Roman" w:hAnsi="Times New Roman"/>
+          <w:noProof/>
+          <w:sz w:val="24"/>
+          <w:szCs w:val="24"/>
+          <w:lang w:val="vi-VN"/>
+        </w:rPr>
+        <w:t xml:space="preserve"> lực nhổ, Q</w:t>
+      </w:r>
+      <w:r>
+        <w:rPr>
+          <w:rFonts w:ascii="Times New Roman" w:cs="Times New Roman" w:eastAsia="Times New Roman" w:hAnsi="Times New Roman"/>
+          <w:noProof/>
+          <w:sz w:val="24"/>
+          <w:szCs w:val="24"/>
+          <w:vertAlign w:val="subscript"/>
+          <w:lang w:val="vi-VN"/>
+        </w:rPr>
+        <w:t xml:space="preserve">uplift</w:t>
+      </w:r>
+      <w:r>
+        <w:rPr>
+          <w:rFonts w:ascii="Times New Roman" w:cs="Times New Roman" w:eastAsia="Times New Roman" w:hAnsi="Times New Roman"/>
+          <w:noProof/>
+          <w:sz w:val="24"/>
+          <w:szCs w:val="24"/>
+          <w:lang w:val="vi-VN"/>
+        </w:rPr>
+        <w:t xml:space="preserve">,all sức chịu nhổ cho phép do ma sát thân cọc. Kết quả BÈ 3A: KHÔNG ÁP DỤNG — neo đáy hồ là đế BTCT + vít xoắn (SV-1…SV-6), không phải cọc đóng.</w:t>
+      </w:r>
+    </w:p>
+    <w:p>
+      <w:pPr>
+        <w:pStyle w:val="ListParagraph"/>
+        <w:numPr>
+          <w:ilvl w:val="0"/>
+          <w:numId w:val="1"/>
+        </w:numPr>
+        <w:spacing w:after="60"/>
+      </w:pPr>
+      <w:r>
+        <w:rPr>
+          <w:rFonts w:ascii="Times New Roman" w:cs="Times New Roman" w:eastAsia="Times New Roman" w:hAnsi="Times New Roman"/>
+          <w:noProof/>
+          <w:sz w:val="24"/>
+          <w:szCs w:val="24"/>
+          <w:lang w:val="vi-VN"/>
+        </w:rPr>
+        <w:t xml:space="preserve">BP-5 — Ứng suất uốn tiết diện cọc LÒNG HỒ: M</w:t>
+      </w:r>
+      <w:r>
+        <w:rPr>
+          <w:rFonts w:ascii="Times New Roman" w:cs="Times New Roman" w:eastAsia="Times New Roman" w:hAnsi="Times New Roman"/>
+          <w:noProof/>
+          <w:sz w:val="24"/>
+          <w:szCs w:val="24"/>
+          <w:vertAlign w:val="subscript"/>
+          <w:lang w:val="vi-VN"/>
+        </w:rPr>
+        <w:t xml:space="preserve">max</w:t>
+      </w:r>
+      <w:r>
+        <w:rPr>
+          <w:rFonts w:ascii="Times New Roman" w:cs="Times New Roman" w:eastAsia="Times New Roman" w:hAnsi="Times New Roman"/>
+          <w:noProof/>
+          <w:sz w:val="24"/>
+          <w:szCs w:val="24"/>
+          <w:lang w:val="vi-VN"/>
+        </w:rPr>
+        <w:t xml:space="preserve"> / M</w:t>
+      </w:r>
+      <w:r>
+        <w:rPr>
+          <w:rFonts w:ascii="Times New Roman" w:cs="Times New Roman" w:eastAsia="Times New Roman" w:hAnsi="Times New Roman"/>
+          <w:noProof/>
+          <w:sz w:val="24"/>
+          <w:szCs w:val="24"/>
+          <w:vertAlign w:val="subscript"/>
+          <w:lang w:val="vi-VN"/>
+        </w:rPr>
+        <w:t xml:space="preserve">rd</w:t>
+      </w:r>
+      <w:r>
+        <w:rPr>
+          <w:rFonts w:ascii="Times New Roman" w:cs="Times New Roman" w:eastAsia="Times New Roman" w:hAnsi="Times New Roman"/>
+          <w:noProof/>
+          <w:sz w:val="24"/>
+          <w:szCs w:val="24"/>
+          <w:lang w:val="vi-VN"/>
+        </w:rPr>
+        <w:t xml:space="preserve"> ≤ 1,0. Uốn thân cọc đóng dưới đáy hồ (PA1). Kết quả BÈ 3A: KHÔNG ÁP DỤNG — neo đáy hồ là đế BTCT + vít xoắn (SV-1…SV-6), không phải cọc đóng.</w:t>
+      </w:r>
+    </w:p>
+    <w:p>
+      <w:pPr>
+        <w:pStyle w:val="ListParagraph"/>
+        <w:numPr>
+          <w:ilvl w:val="0"/>
+          <w:numId w:val="1"/>
+        </w:numPr>
+        <w:spacing w:after="60"/>
+      </w:pPr>
+      <w:r>
+        <w:rPr>
+          <w:rFonts w:ascii="Times New Roman" w:cs="Times New Roman" w:eastAsia="Times New Roman" w:hAnsi="Times New Roman"/>
+          <w:noProof/>
+          <w:sz w:val="24"/>
+          <w:szCs w:val="24"/>
+          <w:lang w:val="vi-VN"/>
+        </w:rPr>
+        <w:t xml:space="preserve">SV-1 — Đế vít xoắn — chống NHỔ: Tv / (0,9·W' + n·Q</w:t>
+      </w:r>
+      <w:r>
+        <w:rPr>
+          <w:rFonts w:ascii="Times New Roman" w:cs="Times New Roman" w:eastAsia="Times New Roman" w:hAnsi="Times New Roman"/>
+          <w:noProof/>
+          <w:sz w:val="24"/>
+          <w:szCs w:val="24"/>
+          <w:vertAlign w:val="subscript"/>
+          <w:lang w:val="vi-VN"/>
+        </w:rPr>
+        <w:t xml:space="preserve">a</w:t>
+      </w:r>
+      <w:r>
+        <w:rPr>
+          <w:rFonts w:ascii="Times New Roman" w:cs="Times New Roman" w:eastAsia="Times New Roman" w:hAnsi="Times New Roman"/>
+          <w:noProof/>
+          <w:sz w:val="24"/>
+          <w:szCs w:val="24"/>
+          <w:lang w:val="vi-VN"/>
+        </w:rPr>
+        <w:t xml:space="preserve">) ≤ 1,0. T</w:t>
+      </w:r>
+      <w:r>
+        <w:rPr>
+          <w:rFonts w:ascii="Times New Roman" w:cs="Times New Roman" w:eastAsia="Times New Roman" w:hAnsi="Times New Roman"/>
+          <w:noProof/>
+          <w:sz w:val="24"/>
+          <w:szCs w:val="24"/>
+          <w:vertAlign w:val="subscript"/>
+          <w:lang w:val="vi-VN"/>
+        </w:rPr>
+        <w:t xml:space="preserve">v</w:t>
+      </w:r>
+      <w:r>
+        <w:rPr>
+          <w:rFonts w:ascii="Times New Roman" w:cs="Times New Roman" w:eastAsia="Times New Roman" w:hAnsi="Times New Roman"/>
+          <w:noProof/>
+          <w:sz w:val="24"/>
+          <w:szCs w:val="24"/>
+          <w:lang w:val="vi-VN"/>
+        </w:rPr>
+        <w:t xml:space="preserve"> là lực nhổ, W' là trọng lượng đế trong nước (đã trừ lực đẩy nổi, chỉ lấy 0,9), n vít × Q</w:t>
+      </w:r>
+      <w:r>
+        <w:rPr>
+          <w:rFonts w:ascii="Times New Roman" w:cs="Times New Roman" w:eastAsia="Times New Roman" w:hAnsi="Times New Roman"/>
+          <w:noProof/>
+          <w:sz w:val="24"/>
+          <w:szCs w:val="24"/>
+          <w:vertAlign w:val="subscript"/>
+          <w:lang w:val="vi-VN"/>
+        </w:rPr>
+        <w:t xml:space="preserve">a</w:t>
+      </w:r>
+      <w:r>
+        <w:rPr>
+          <w:rFonts w:ascii="Times New Roman" w:cs="Times New Roman" w:eastAsia="Times New Roman" w:hAnsi="Times New Roman"/>
+          <w:noProof/>
+          <w:sz w:val="24"/>
+          <w:szCs w:val="24"/>
+          <w:lang w:val="vi-VN"/>
+        </w:rPr>
+        <w:t xml:space="preserve"> là sức chịu nhổ cho phép của các vít (mục 6). Kết quả BÈ 3A: ĐẠT: giá trị 0,669, yêu cầu ≤ 1,0, mức sử dụng 0,67.</w:t>
+      </w:r>
+    </w:p>
+    <w:p>
+      <w:pPr>
+        <w:pStyle w:val="ListParagraph"/>
+        <w:numPr>
+          <w:ilvl w:val="0"/>
+          <w:numId w:val="1"/>
+        </w:numPr>
+        <w:spacing w:after="60"/>
+      </w:pPr>
+      <w:r>
+        <w:rPr>
+          <w:rFonts w:ascii="Times New Roman" w:cs="Times New Roman" w:eastAsia="Times New Roman" w:hAnsi="Times New Roman"/>
+          <w:noProof/>
+          <w:sz w:val="24"/>
+          <w:szCs w:val="24"/>
+          <w:lang w:val="vi-VN"/>
+        </w:rPr>
+        <w:t xml:space="preserve">SV-2 — Đế vít xoắn — chống TRƯỢT: 1,5·Th / (α·c</w:t>
+      </w:r>
+      <w:r>
+        <w:rPr>
+          <w:rFonts w:ascii="Times New Roman" w:cs="Times New Roman" w:eastAsia="Times New Roman" w:hAnsi="Times New Roman"/>
+          <w:noProof/>
+          <w:sz w:val="24"/>
+          <w:szCs w:val="24"/>
+          <w:vertAlign w:val="subscript"/>
+          <w:lang w:val="vi-VN"/>
+        </w:rPr>
+        <w:t xml:space="preserve">u</w:t>
+      </w:r>
+      <w:r>
+        <w:rPr>
+          <w:rFonts w:ascii="Times New Roman" w:cs="Times New Roman" w:eastAsia="Times New Roman" w:hAnsi="Times New Roman"/>
+          <w:noProof/>
+          <w:sz w:val="24"/>
+          <w:szCs w:val="24"/>
+          <w:lang w:val="vi-VN"/>
+        </w:rPr>
+        <w:t xml:space="preserve">·B² + R</w:t>
+      </w:r>
+      <w:r>
+        <w:rPr>
+          <w:rFonts w:ascii="Times New Roman" w:cs="Times New Roman" w:eastAsia="Times New Roman" w:hAnsi="Times New Roman"/>
+          <w:noProof/>
+          <w:sz w:val="24"/>
+          <w:szCs w:val="24"/>
+          <w:vertAlign w:val="subscript"/>
+          <w:lang w:val="vi-VN"/>
+        </w:rPr>
+        <w:t xml:space="preserve">gờ</w:t>
+      </w:r>
+      <w:r>
+        <w:rPr>
+          <w:rFonts w:ascii="Times New Roman" w:cs="Times New Roman" w:eastAsia="Times New Roman" w:hAnsi="Times New Roman"/>
+          <w:noProof/>
+          <w:sz w:val="24"/>
+          <w:szCs w:val="24"/>
+          <w:lang w:val="vi-VN"/>
+        </w:rPr>
+        <w:t xml:space="preserve"> + n·H</w:t>
+      </w:r>
+      <w:r>
+        <w:rPr>
+          <w:rFonts w:ascii="Times New Roman" w:cs="Times New Roman" w:eastAsia="Times New Roman" w:hAnsi="Times New Roman"/>
+          <w:noProof/>
+          <w:sz w:val="24"/>
+          <w:szCs w:val="24"/>
+          <w:vertAlign w:val="subscript"/>
+          <w:lang w:val="vi-VN"/>
+        </w:rPr>
+        <w:t xml:space="preserve">u</w:t>
+      </w:r>
+      <w:r>
+        <w:rPr>
+          <w:rFonts w:ascii="Times New Roman" w:cs="Times New Roman" w:eastAsia="Times New Roman" w:hAnsi="Times New Roman"/>
+          <w:noProof/>
+          <w:sz w:val="24"/>
+          <w:szCs w:val="24"/>
+          <w:lang w:val="vi-VN"/>
+        </w:rPr>
+        <w:t xml:space="preserve">) ≤ 1,0. T</w:t>
+      </w:r>
+      <w:r>
+        <w:rPr>
+          <w:rFonts w:ascii="Times New Roman" w:cs="Times New Roman" w:eastAsia="Times New Roman" w:hAnsi="Times New Roman"/>
+          <w:noProof/>
+          <w:sz w:val="24"/>
+          <w:szCs w:val="24"/>
+          <w:vertAlign w:val="subscript"/>
+          <w:lang w:val="vi-VN"/>
+        </w:rPr>
+        <w:t xml:space="preserve">h</w:t>
+      </w:r>
+      <w:r>
+        <w:rPr>
+          <w:rFonts w:ascii="Times New Roman" w:cs="Times New Roman" w:eastAsia="Times New Roman" w:hAnsi="Times New Roman"/>
+          <w:noProof/>
+          <w:sz w:val="24"/>
+          <w:szCs w:val="24"/>
+          <w:lang w:val="vi-VN"/>
+        </w:rPr>
+        <w:t xml:space="preserve"> là lực ngang nhân hệ số 1,5; chống trượt gồm bám dính đáy α·c</w:t>
+      </w:r>
+      <w:r>
+        <w:rPr>
+          <w:rFonts w:ascii="Times New Roman" w:cs="Times New Roman" w:eastAsia="Times New Roman" w:hAnsi="Times New Roman"/>
+          <w:noProof/>
+          <w:sz w:val="24"/>
+          <w:szCs w:val="24"/>
+          <w:vertAlign w:val="subscript"/>
+          <w:lang w:val="vi-VN"/>
+        </w:rPr>
+        <w:t xml:space="preserve">u</w:t>
+      </w:r>
+      <w:r>
+        <w:rPr>
+          <w:rFonts w:ascii="Times New Roman" w:cs="Times New Roman" w:eastAsia="Times New Roman" w:hAnsi="Times New Roman"/>
+          <w:noProof/>
+          <w:sz w:val="24"/>
+          <w:szCs w:val="24"/>
+          <w:lang w:val="vi-VN"/>
+        </w:rPr>
+        <w:t xml:space="preserve">·B² (bằng 0 khi đế bị nhấc), gờ đế R</w:t>
+      </w:r>
+      <w:r>
+        <w:rPr>
+          <w:rFonts w:ascii="Times New Roman" w:cs="Times New Roman" w:eastAsia="Times New Roman" w:hAnsi="Times New Roman"/>
+          <w:noProof/>
+          <w:sz w:val="24"/>
+          <w:szCs w:val="24"/>
+          <w:vertAlign w:val="subscript"/>
+          <w:lang w:val="vi-VN"/>
+        </w:rPr>
+        <w:t xml:space="preserve">gờ</w:t>
+      </w:r>
+      <w:r>
+        <w:rPr>
+          <w:rFonts w:ascii="Times New Roman" w:cs="Times New Roman" w:eastAsia="Times New Roman" w:hAnsi="Times New Roman"/>
+          <w:noProof/>
+          <w:sz w:val="24"/>
+          <w:szCs w:val="24"/>
+          <w:lang w:val="vi-VN"/>
+        </w:rPr>
+        <w:t xml:space="preserve"> và sức chịu ngang của n vít H</w:t>
+      </w:r>
+      <w:r>
+        <w:rPr>
+          <w:rFonts w:ascii="Times New Roman" w:cs="Times New Roman" w:eastAsia="Times New Roman" w:hAnsi="Times New Roman"/>
+          <w:noProof/>
+          <w:sz w:val="24"/>
+          <w:szCs w:val="24"/>
+          <w:vertAlign w:val="subscript"/>
+          <w:lang w:val="vi-VN"/>
+        </w:rPr>
+        <w:t xml:space="preserve">u</w:t>
+      </w:r>
+      <w:r>
+        <w:rPr>
+          <w:rFonts w:ascii="Times New Roman" w:cs="Times New Roman" w:eastAsia="Times New Roman" w:hAnsi="Times New Roman"/>
+          <w:noProof/>
+          <w:sz w:val="24"/>
+          <w:szCs w:val="24"/>
+          <w:lang w:val="vi-VN"/>
+        </w:rPr>
+        <w:t xml:space="preserve"> (mục 6). Kết quả BÈ 3A: ĐẠT: giá trị 0,771, yêu cầu ≤ 1,0, mức sử dụng 0,77.</w:t>
+      </w:r>
+    </w:p>
+    <w:p>
+      <w:pPr>
+        <w:pStyle w:val="ListParagraph"/>
+        <w:numPr>
+          <w:ilvl w:val="0"/>
+          <w:numId w:val="1"/>
+        </w:numPr>
+        <w:spacing w:after="60"/>
+      </w:pPr>
+      <w:r>
+        <w:rPr>
+          <w:rFonts w:ascii="Times New Roman" w:cs="Times New Roman" w:eastAsia="Times New Roman" w:hAnsi="Times New Roman"/>
+          <w:noProof/>
+          <w:sz w:val="24"/>
+          <w:szCs w:val="24"/>
+          <w:lang w:val="vi-VN"/>
+        </w:rPr>
+        <w:t xml:space="preserve">SV-3 — Đế vít xoắn — chống LẬT: 1,5·M</w:t>
+      </w:r>
+      <w:r>
+        <w:rPr>
+          <w:rFonts w:ascii="Times New Roman" w:cs="Times New Roman" w:eastAsia="Times New Roman" w:hAnsi="Times New Roman"/>
+          <w:noProof/>
+          <w:sz w:val="24"/>
+          <w:szCs w:val="24"/>
+          <w:vertAlign w:val="subscript"/>
+          <w:lang w:val="vi-VN"/>
+        </w:rPr>
+        <w:t xml:space="preserve">o</w:t>
+      </w:r>
+      <w:r>
+        <w:rPr>
+          <w:rFonts w:ascii="Times New Roman" w:cs="Times New Roman" w:eastAsia="Times New Roman" w:hAnsi="Times New Roman"/>
+          <w:noProof/>
+          <w:sz w:val="24"/>
+          <w:szCs w:val="24"/>
+          <w:lang w:val="vi-VN"/>
+        </w:rPr>
+        <w:t xml:space="preserve"> / M</w:t>
+      </w:r>
+      <w:r>
+        <w:rPr>
+          <w:rFonts w:ascii="Times New Roman" w:cs="Times New Roman" w:eastAsia="Times New Roman" w:hAnsi="Times New Roman"/>
+          <w:noProof/>
+          <w:sz w:val="24"/>
+          <w:szCs w:val="24"/>
+          <w:vertAlign w:val="subscript"/>
+          <w:lang w:val="vi-VN"/>
+        </w:rPr>
+        <w:t xml:space="preserve">r</w:t>
+      </w:r>
+      <w:r>
+        <w:rPr>
+          <w:rFonts w:ascii="Times New Roman" w:cs="Times New Roman" w:eastAsia="Times New Roman" w:hAnsi="Times New Roman"/>
+          <w:noProof/>
+          <w:sz w:val="24"/>
+          <w:szCs w:val="24"/>
+          <w:lang w:val="vi-VN"/>
+        </w:rPr>
+        <w:t xml:space="preserve"> ≤ 1,0. M</w:t>
+      </w:r>
+      <w:r>
+        <w:rPr>
+          <w:rFonts w:ascii="Times New Roman" w:cs="Times New Roman" w:eastAsia="Times New Roman" w:hAnsi="Times New Roman"/>
+          <w:noProof/>
+          <w:sz w:val="24"/>
+          <w:szCs w:val="24"/>
+          <w:vertAlign w:val="subscript"/>
+          <w:lang w:val="vi-VN"/>
+        </w:rPr>
+        <w:t xml:space="preserve">o</w:t>
+      </w:r>
+      <w:r>
+        <w:rPr>
+          <w:rFonts w:ascii="Times New Roman" w:cs="Times New Roman" w:eastAsia="Times New Roman" w:hAnsi="Times New Roman"/>
+          <w:noProof/>
+          <w:sz w:val="24"/>
+          <w:szCs w:val="24"/>
+          <w:lang w:val="vi-VN"/>
+        </w:rPr>
+        <w:t xml:space="preserve"> là mô-men lật quanh mép đáy phía xa dây (nhân 1,5), M</w:t>
+      </w:r>
+      <w:r>
+        <w:rPr>
+          <w:rFonts w:ascii="Times New Roman" w:cs="Times New Roman" w:eastAsia="Times New Roman" w:hAnsi="Times New Roman"/>
+          <w:noProof/>
+          <w:sz w:val="24"/>
+          <w:szCs w:val="24"/>
+          <w:vertAlign w:val="subscript"/>
+          <w:lang w:val="vi-VN"/>
+        </w:rPr>
+        <w:t xml:space="preserve">r</w:t>
+      </w:r>
+      <w:r>
+        <w:rPr>
+          <w:rFonts w:ascii="Times New Roman" w:cs="Times New Roman" w:eastAsia="Times New Roman" w:hAnsi="Times New Roman"/>
+          <w:noProof/>
+          <w:sz w:val="24"/>
+          <w:szCs w:val="24"/>
+          <w:lang w:val="vi-VN"/>
+        </w:rPr>
+        <w:t xml:space="preserve"> là mô-men giữ do trọng lượng đế và các vít (mục 6). Kết quả BÈ 3A: ĐẠT: giá trị 0,998, yêu cầu ≤ 1,0, mức sử dụng 1,00.</w:t>
+      </w:r>
+    </w:p>
+    <w:p>
+      <w:pPr>
+        <w:pStyle w:val="ListParagraph"/>
+        <w:numPr>
+          <w:ilvl w:val="0"/>
+          <w:numId w:val="1"/>
+        </w:numPr>
+        <w:spacing w:after="60"/>
+      </w:pPr>
+      <w:r>
+        <w:rPr>
+          <w:rFonts w:ascii="Times New Roman" w:cs="Times New Roman" w:eastAsia="Times New Roman" w:hAnsi="Times New Roman"/>
+          <w:noProof/>
+          <w:sz w:val="24"/>
+          <w:szCs w:val="24"/>
+          <w:lang w:val="vi-VN"/>
+        </w:rPr>
+        <w:t xml:space="preserve">SV-4 — Đế vít xoắn — lực nhổ một vít: N</w:t>
+      </w:r>
+      <w:r>
+        <w:rPr>
+          <w:rFonts w:ascii="Times New Roman" w:cs="Times New Roman" w:eastAsia="Times New Roman" w:hAnsi="Times New Roman"/>
+          <w:noProof/>
+          <w:sz w:val="24"/>
+          <w:szCs w:val="24"/>
+          <w:vertAlign w:val="subscript"/>
+          <w:lang w:val="vi-VN"/>
+        </w:rPr>
+        <w:t xml:space="preserve">1</w:t>
+      </w:r>
+      <w:r>
+        <w:rPr>
+          <w:rFonts w:ascii="Times New Roman" w:cs="Times New Roman" w:eastAsia="Times New Roman" w:hAnsi="Times New Roman"/>
+          <w:noProof/>
+          <w:sz w:val="24"/>
+          <w:szCs w:val="24"/>
+          <w:lang w:val="vi-VN"/>
+        </w:rPr>
+        <w:t xml:space="preserve"> / Q</w:t>
+      </w:r>
+      <w:r>
+        <w:rPr>
+          <w:rFonts w:ascii="Times New Roman" w:cs="Times New Roman" w:eastAsia="Times New Roman" w:hAnsi="Times New Roman"/>
+          <w:noProof/>
+          <w:sz w:val="24"/>
+          <w:szCs w:val="24"/>
+          <w:vertAlign w:val="subscript"/>
+          <w:lang w:val="vi-VN"/>
+        </w:rPr>
+        <w:t xml:space="preserve">a</w:t>
+      </w:r>
+      <w:r>
+        <w:rPr>
+          <w:rFonts w:ascii="Times New Roman" w:cs="Times New Roman" w:eastAsia="Times New Roman" w:hAnsi="Times New Roman"/>
+          <w:noProof/>
+          <w:sz w:val="24"/>
+          <w:szCs w:val="24"/>
+          <w:lang w:val="vi-VN"/>
+        </w:rPr>
+        <w:t xml:space="preserve"> ≤ 1,0. N</w:t>
+      </w:r>
+      <w:r>
+        <w:rPr>
+          <w:rFonts w:ascii="Times New Roman" w:cs="Times New Roman" w:eastAsia="Times New Roman" w:hAnsi="Times New Roman"/>
+          <w:noProof/>
+          <w:sz w:val="24"/>
+          <w:szCs w:val="24"/>
+          <w:vertAlign w:val="subscript"/>
+          <w:lang w:val="vi-VN"/>
+        </w:rPr>
+        <w:t xml:space="preserve">1</w:t>
+      </w:r>
+      <w:r>
+        <w:rPr>
+          <w:rFonts w:ascii="Times New Roman" w:cs="Times New Roman" w:eastAsia="Times New Roman" w:hAnsi="Times New Roman"/>
+          <w:noProof/>
+          <w:sz w:val="24"/>
+          <w:szCs w:val="24"/>
+          <w:lang w:val="vi-VN"/>
+        </w:rPr>
+        <w:t xml:space="preserve"> là lực nhổ lên vít chịu nặng nhất sau khi trừ phần trọng lượng đế gánh, Q</w:t>
+      </w:r>
+      <w:r>
+        <w:rPr>
+          <w:rFonts w:ascii="Times New Roman" w:cs="Times New Roman" w:eastAsia="Times New Roman" w:hAnsi="Times New Roman"/>
+          <w:noProof/>
+          <w:sz w:val="24"/>
+          <w:szCs w:val="24"/>
+          <w:vertAlign w:val="subscript"/>
+          <w:lang w:val="vi-VN"/>
+        </w:rPr>
+        <w:t xml:space="preserve">a</w:t>
+      </w:r>
+      <w:r>
+        <w:rPr>
+          <w:rFonts w:ascii="Times New Roman" w:cs="Times New Roman" w:eastAsia="Times New Roman" w:hAnsi="Times New Roman"/>
+          <w:noProof/>
+          <w:sz w:val="24"/>
+          <w:szCs w:val="24"/>
+          <w:lang w:val="vi-VN"/>
+        </w:rPr>
+        <w:t xml:space="preserve"> là sức chịu nhổ cho phép của một vít (mục 6). Kết quả BÈ 3A: ĐẠT: giá trị 0,445, yêu cầu ≤ 1,0, mức sử dụng 0,44.</w:t>
+      </w:r>
+    </w:p>
+    <w:p>
+      <w:pPr>
+        <w:pStyle w:val="ListParagraph"/>
+        <w:numPr>
+          <w:ilvl w:val="0"/>
+          <w:numId w:val="1"/>
+        </w:numPr>
+        <w:spacing w:after="60"/>
+      </w:pPr>
+      <w:r>
+        <w:rPr>
+          <w:rFonts w:ascii="Times New Roman" w:cs="Times New Roman" w:eastAsia="Times New Roman" w:hAnsi="Times New Roman"/>
+          <w:noProof/>
+          <w:sz w:val="24"/>
+          <w:szCs w:val="24"/>
+          <w:lang w:val="vi-VN"/>
+        </w:rPr>
+        <w:t xml:space="preserve">SV-5 — Đế vít xoắn — áp lực lên nền bùn: W'/B² ≤ 5,14·c</w:t>
+      </w:r>
+      <w:r>
+        <w:rPr>
+          <w:rFonts w:ascii="Times New Roman" w:cs="Times New Roman" w:eastAsia="Times New Roman" w:hAnsi="Times New Roman"/>
+          <w:noProof/>
+          <w:sz w:val="24"/>
+          <w:szCs w:val="24"/>
+          <w:vertAlign w:val="subscript"/>
+          <w:lang w:val="vi-VN"/>
+        </w:rPr>
+        <w:t xml:space="preserve">u</w:t>
+      </w:r>
+      <w:r>
+        <w:rPr>
+          <w:rFonts w:ascii="Times New Roman" w:cs="Times New Roman" w:eastAsia="Times New Roman" w:hAnsi="Times New Roman"/>
+          <w:noProof/>
+          <w:sz w:val="24"/>
+          <w:szCs w:val="24"/>
+          <w:lang w:val="vi-VN"/>
+        </w:rPr>
+        <w:t xml:space="preserve"> / 2,5. W'/B² là áp lực đế lên nền bùn, 5,14·c</w:t>
+      </w:r>
+      <w:r>
+        <w:rPr>
+          <w:rFonts w:ascii="Times New Roman" w:cs="Times New Roman" w:eastAsia="Times New Roman" w:hAnsi="Times New Roman"/>
+          <w:noProof/>
+          <w:sz w:val="24"/>
+          <w:szCs w:val="24"/>
+          <w:vertAlign w:val="subscript"/>
+          <w:lang w:val="vi-VN"/>
+        </w:rPr>
+        <w:t xml:space="preserve">u</w:t>
+      </w:r>
+      <w:r>
+        <w:rPr>
+          <w:rFonts w:ascii="Times New Roman" w:cs="Times New Roman" w:eastAsia="Times New Roman" w:hAnsi="Times New Roman"/>
+          <w:noProof/>
+          <w:sz w:val="24"/>
+          <w:szCs w:val="24"/>
+          <w:lang w:val="vi-VN"/>
+        </w:rPr>
+        <w:t xml:space="preserve"> là sức chịu tải giới hạn của nền sét mềm, chia hệ số an toàn (mục 6). Kết quả BÈ 3A: ĐẠT: giá trị 6,0, yêu cầu ≤ 41,1 kPa, mức sử dụng 0,15.</w:t>
+      </w:r>
+    </w:p>
+    <w:p>
+      <w:pPr>
+        <w:pStyle w:val="ListParagraph"/>
+        <w:numPr>
+          <w:ilvl w:val="0"/>
+          <w:numId w:val="1"/>
+        </w:numPr>
+        <w:spacing w:after="60"/>
+      </w:pPr>
+      <w:r>
+        <w:rPr>
+          <w:rFonts w:ascii="Times New Roman" w:cs="Times New Roman" w:eastAsia="Times New Roman" w:hAnsi="Times New Roman"/>
+          <w:noProof/>
+          <w:sz w:val="24"/>
+          <w:szCs w:val="24"/>
+          <w:lang w:val="vi-VN"/>
+        </w:rPr>
+        <w:t xml:space="preserve">SV-6 — Đế vít xoắn — cốt thép bản đế: max(A</w:t>
+      </w:r>
+      <w:r>
+        <w:rPr>
+          <w:rFonts w:ascii="Times New Roman" w:cs="Times New Roman" w:eastAsia="Times New Roman" w:hAnsi="Times New Roman"/>
+          <w:noProof/>
+          <w:sz w:val="24"/>
+          <w:szCs w:val="24"/>
+          <w:vertAlign w:val="subscript"/>
+          <w:lang w:val="vi-VN"/>
+        </w:rPr>
+        <w:t xml:space="preserve">s</w:t>
+      </w:r>
+      <w:r>
+        <w:rPr>
+          <w:rFonts w:ascii="Times New Roman" w:cs="Times New Roman" w:eastAsia="Times New Roman" w:hAnsi="Times New Roman"/>
+          <w:noProof/>
+          <w:sz w:val="24"/>
+          <w:szCs w:val="24"/>
+          <w:lang w:val="vi-VN"/>
+        </w:rPr>
+        <w:t xml:space="preserve"> yc ; 0,1%) / A</w:t>
+      </w:r>
+      <w:r>
+        <w:rPr>
+          <w:rFonts w:ascii="Times New Roman" w:cs="Times New Roman" w:eastAsia="Times New Roman" w:hAnsi="Times New Roman"/>
+          <w:noProof/>
+          <w:sz w:val="24"/>
+          <w:szCs w:val="24"/>
+          <w:vertAlign w:val="subscript"/>
+          <w:lang w:val="vi-VN"/>
+        </w:rPr>
+        <w:t xml:space="preserve">s</w:t>
+      </w:r>
+      <w:r>
+        <w:rPr>
+          <w:rFonts w:ascii="Times New Roman" w:cs="Times New Roman" w:eastAsia="Times New Roman" w:hAnsi="Times New Roman"/>
+          <w:noProof/>
+          <w:sz w:val="24"/>
+          <w:szCs w:val="24"/>
+          <w:lang w:val="vi-VN"/>
+        </w:rPr>
+        <w:t xml:space="preserve"> bố trí ≤ 1,0. A</w:t>
+      </w:r>
+      <w:r>
+        <w:rPr>
+          <w:rFonts w:ascii="Times New Roman" w:cs="Times New Roman" w:eastAsia="Times New Roman" w:hAnsi="Times New Roman"/>
+          <w:noProof/>
+          <w:sz w:val="24"/>
+          <w:szCs w:val="24"/>
+          <w:vertAlign w:val="subscript"/>
+          <w:lang w:val="vi-VN"/>
+        </w:rPr>
+        <w:t xml:space="preserve">s</w:t>
+      </w:r>
+      <w:r>
+        <w:rPr>
+          <w:rFonts w:ascii="Times New Roman" w:cs="Times New Roman" w:eastAsia="Times New Roman" w:hAnsi="Times New Roman"/>
+          <w:noProof/>
+          <w:sz w:val="24"/>
+          <w:szCs w:val="24"/>
+          <w:lang w:val="vi-VN"/>
+        </w:rPr>
+        <w:t xml:space="preserve"> yc là thép bản đế cần theo mô-men uốn, 0,1% là hàm lượng tối thiểu, A</w:t>
+      </w:r>
+      <w:r>
+        <w:rPr>
+          <w:rFonts w:ascii="Times New Roman" w:cs="Times New Roman" w:eastAsia="Times New Roman" w:hAnsi="Times New Roman"/>
+          <w:noProof/>
+          <w:sz w:val="24"/>
+          <w:szCs w:val="24"/>
+          <w:vertAlign w:val="subscript"/>
+          <w:lang w:val="vi-VN"/>
+        </w:rPr>
+        <w:t xml:space="preserve">s</w:t>
+      </w:r>
+      <w:r>
+        <w:rPr>
+          <w:rFonts w:ascii="Times New Roman" w:cs="Times New Roman" w:eastAsia="Times New Roman" w:hAnsi="Times New Roman"/>
+          <w:noProof/>
+          <w:sz w:val="24"/>
+          <w:szCs w:val="24"/>
+          <w:lang w:val="vi-VN"/>
+        </w:rPr>
+        <w:t xml:space="preserve"> bố trí là lưới thép đặt trong bản (mục 6). Kết quả BÈ 3A: ĐẠT: giá trị 0,619, yêu cầu ≤ 1,0, mức sử dụng 0,62.</w:t>
       </w:r>
     </w:p>
     <w:p>

</xml_diff>